<commit_message>
Data Lake dependency: two options with option 1 recommended; tracker rebuilt around the two-week plan
</commit_message>
<xml_diff>
--- a/assets/mft-mvp-plan.docx
+++ b/assets/mft-mvp-plan.docx
@@ -4018,7 +4018,7 @@
                 <w:sz w:val="16"/>
                 <w:szCs w:val="16"/>
               </w:rPr>
-              <w:t xml:space="preserve">ADR to Data Lake migration position</w:t>
+              <w:t xml:space="preserve">ADR to Data Lake migration, agree option 1</w:t>
             </w:r>
           </w:p>
         </w:tc>
@@ -4111,7 +4111,7 @@
                 <w:sz w:val="16"/>
                 <w:szCs w:val="16"/>
               </w:rPr>
-              <w:t xml:space="preserve">See section 5</w:t>
+              <w:t xml:space="preserve">See section 5. Option 1 lets the build start on time and treats the re-point as a configuration change</w:t>
             </w:r>
           </w:p>
         </w:tc>
@@ -4771,7 +4771,7 @@
           <w:sz w:val="19"/>
           <w:szCs w:val="19"/>
         </w:rPr>
-        <w:t xml:space="preserve">The ADR legacy warehouse is being migrated to the Data Lake, and both of this MVP's touchpoints sit inside that scope: the NPS file landing area on leg A and the MWS file output area on leg B. Three things need an answer before configuration starts on day 5.</w:t>
+        <w:t xml:space="preserve">The ADR legacy warehouse is being migrated to the Data Lake, and both of this MVP's touchpoints sit inside that scope: the NPS file landing area on leg A and the MWS file output area on leg B. There are two ways to handle it.</w:t>
       </w:r>
     </w:p>
     <w:tbl>
@@ -4787,8 +4787,9 @@
         </w:tblBorders>
       </w:tblPr>
       <w:tblGrid>
-        <w:gridCol w:w="4122"/>
-        <w:gridCol w:w="6184"/>
+        <w:gridCol w:w="1855"/>
+        <w:gridCol w:w="4225"/>
+        <w:gridCol w:w="4226"/>
       </w:tblGrid>
       <w:tr>
         <w:trPr>
@@ -4796,7 +4797,7 @@
         </w:trPr>
         <w:tc>
           <w:tcPr>
-            <w:tcW w:type="dxa" w:w="4122"/>
+            <w:tcW w:type="dxa" w:w="1855"/>
             <w:tcBorders>
               <w:top w:val="single" w:color="B1B4B6" w:sz="4"/>
               <w:left w:val="single" w:color="B1B4B6" w:sz="4"/>
@@ -4822,13 +4823,13 @@
                 <w:sz w:val="16"/>
                 <w:szCs w:val="16"/>
               </w:rPr>
-              <w:t xml:space="preserve">Question</w:t>
-            </w:r>
-          </w:p>
-        </w:tc>
-        <w:tc>
-          <w:tcPr>
-            <w:tcW w:type="dxa" w:w="6184"/>
+              <w:t xml:space="preserve"/>
+            </w:r>
+          </w:p>
+        </w:tc>
+        <w:tc>
+          <w:tcPr>
+            <w:tcW w:type="dxa" w:w="4225"/>
             <w:tcBorders>
               <w:top w:val="single" w:color="B1B4B6" w:sz="4"/>
               <w:left w:val="single" w:color="B1B4B6" w:sz="4"/>
@@ -4854,7 +4855,39 @@
                 <w:sz w:val="16"/>
                 <w:szCs w:val="16"/>
               </w:rPr>
-              <w:t xml:space="preserve">Why it changes what we build</w:t>
+              <w:t xml:space="preserve">Option 1, recommended</w:t>
+            </w:r>
+          </w:p>
+        </w:tc>
+        <w:tc>
+          <w:tcPr>
+            <w:tcW w:type="dxa" w:w="4226"/>
+            <w:tcBorders>
+              <w:top w:val="single" w:color="B1B4B6" w:sz="4"/>
+              <w:left w:val="single" w:color="B1B4B6" w:sz="4"/>
+              <w:bottom w:val="single" w:color="B1B4B6" w:sz="4"/>
+              <w:right w:val="single" w:color="B1B4B6" w:sz="4"/>
+            </w:tcBorders>
+            <w:shd w:fill="F3F2F1" w:color="auto" w:val="clear"/>
+            <w:tcMar>
+              <w:top w:type="dxa" w:w="40"/>
+              <w:left w:type="dxa" w:w="80"/>
+              <w:bottom w:type="dxa" w:w="40"/>
+              <w:right w:type="dxa" w:w="80"/>
+            </w:tcMar>
+          </w:tcPr>
+          <w:p>
+            <w:pPr>
+              <w:spacing w:after="0" w:line="240"/>
+            </w:pPr>
+            <w:r>
+              <w:rPr>
+                <w:b/>
+                <w:bCs/>
+                <w:sz w:val="16"/>
+                <w:szCs w:val="16"/>
+              </w:rPr>
+              <w:t xml:space="preserve">Option 2</w:t>
             </w:r>
           </w:p>
         </w:tc>
@@ -4862,63 +4895,94 @@
       <w:tr>
         <w:tc>
           <w:tcPr>
-            <w:tcW w:type="dxa" w:w="4122"/>
-            <w:tcBorders>
-              <w:top w:val="single" w:color="B1B4B6" w:sz="4"/>
-              <w:left w:val="single" w:color="B1B4B6" w:sz="4"/>
-              <w:bottom w:val="single" w:color="B1B4B6" w:sz="4"/>
-              <w:right w:val="single" w:color="B1B4B6" w:sz="4"/>
-            </w:tcBorders>
-            <w:tcMar>
-              <w:top w:type="dxa" w:w="40"/>
-              <w:left w:type="dxa" w:w="80"/>
-              <w:bottom w:type="dxa" w:w="40"/>
-              <w:right w:type="dxa" w:w="80"/>
-            </w:tcMar>
-          </w:tcPr>
-          <w:p>
-            <w:pPr>
-              <w:spacing w:after="0" w:line="240"/>
-            </w:pPr>
-            <w:r>
-              <w:rPr>
-                <w:b w:val="false"/>
-                <w:bCs w:val="false"/>
-                <w:sz w:val="16"/>
-                <w:szCs w:val="16"/>
-              </w:rPr>
-              <w:t xml:space="preserve">Are the NPS landing area and the MWS output area in scope of the migration, and when do they move?</w:t>
-            </w:r>
-          </w:p>
-        </w:tc>
-        <w:tc>
-          <w:tcPr>
-            <w:tcW w:type="dxa" w:w="6184"/>
-            <w:tcBorders>
-              <w:top w:val="single" w:color="B1B4B6" w:sz="4"/>
-              <w:left w:val="single" w:color="B1B4B6" w:sz="4"/>
-              <w:bottom w:val="single" w:color="B1B4B6" w:sz="4"/>
-              <w:right w:val="single" w:color="B1B4B6" w:sz="4"/>
-            </w:tcBorders>
-            <w:tcMar>
-              <w:top w:type="dxa" w:w="40"/>
-              <w:left w:type="dxa" w:w="80"/>
-              <w:bottom w:type="dxa" w:w="40"/>
-              <w:right w:type="dxa" w:w="80"/>
-            </w:tcMar>
-          </w:tcPr>
-          <w:p>
-            <w:pPr>
-              <w:spacing w:after="0" w:line="240"/>
-            </w:pPr>
-            <w:r>
-              <w:rPr>
-                <w:b w:val="false"/>
-                <w:bCs w:val="false"/>
-                <w:sz w:val="16"/>
-                <w:szCs w:val="16"/>
-              </w:rPr>
-              <w:t xml:space="preserve">If they move during or shortly after the MVP, we configure against an endpoint with a known end date. That is acceptable, but it must be a decision rather than a surprise</w:t>
+            <w:tcW w:type="dxa" w:w="1855"/>
+            <w:tcBorders>
+              <w:top w:val="single" w:color="B1B4B6" w:sz="4"/>
+              <w:left w:val="single" w:color="B1B4B6" w:sz="4"/>
+              <w:bottom w:val="single" w:color="B1B4B6" w:sz="4"/>
+              <w:right w:val="single" w:color="B1B4B6" w:sz="4"/>
+            </w:tcBorders>
+            <w:tcMar>
+              <w:top w:type="dxa" w:w="40"/>
+              <w:left w:type="dxa" w:w="80"/>
+              <w:bottom w:type="dxa" w:w="40"/>
+              <w:right w:type="dxa" w:w="80"/>
+            </w:tcMar>
+          </w:tcPr>
+          <w:p>
+            <w:pPr>
+              <w:spacing w:after="0" w:line="240"/>
+            </w:pPr>
+            <w:r>
+              <w:rPr>
+                <w:b w:val="false"/>
+                <w:bCs w:val="false"/>
+                <w:sz w:val="16"/>
+                <w:szCs w:val="16"/>
+              </w:rPr>
+              <w:t xml:space="preserve">What we do</w:t>
+            </w:r>
+          </w:p>
+        </w:tc>
+        <w:tc>
+          <w:tcPr>
+            <w:tcW w:type="dxa" w:w="4225"/>
+            <w:tcBorders>
+              <w:top w:val="single" w:color="B1B4B6" w:sz="4"/>
+              <w:left w:val="single" w:color="B1B4B6" w:sz="4"/>
+              <w:bottom w:val="single" w:color="B1B4B6" w:sz="4"/>
+              <w:right w:val="single" w:color="B1B4B6" w:sz="4"/>
+            </w:tcBorders>
+            <w:tcMar>
+              <w:top w:type="dxa" w:w="40"/>
+              <w:left w:type="dxa" w:w="80"/>
+              <w:bottom w:type="dxa" w:w="40"/>
+              <w:right w:type="dxa" w:w="80"/>
+            </w:tcMar>
+          </w:tcPr>
+          <w:p>
+            <w:pPr>
+              <w:spacing w:after="0" w:line="240"/>
+            </w:pPr>
+            <w:r>
+              <w:rPr>
+                <w:b w:val="false"/>
+                <w:bCs w:val="false"/>
+                <w:sz w:val="16"/>
+                <w:szCs w:val="16"/>
+              </w:rPr>
+              <w:t xml:space="preserve">Migrate the integration now. Move the transfer off legacy IAF onto Boomi, pointing at the existing ADR database and file areas. Re-point to the Data Lake as a configuration change when the warehouse migrates.</w:t>
+            </w:r>
+          </w:p>
+        </w:tc>
+        <w:tc>
+          <w:tcPr>
+            <w:tcW w:type="dxa" w:w="4226"/>
+            <w:tcBorders>
+              <w:top w:val="single" w:color="B1B4B6" w:sz="4"/>
+              <w:left w:val="single" w:color="B1B4B6" w:sz="4"/>
+              <w:bottom w:val="single" w:color="B1B4B6" w:sz="4"/>
+              <w:right w:val="single" w:color="B1B4B6" w:sz="4"/>
+            </w:tcBorders>
+            <w:tcMar>
+              <w:top w:type="dxa" w:w="40"/>
+              <w:left w:type="dxa" w:w="80"/>
+              <w:bottom w:type="dxa" w:w="40"/>
+              <w:right w:type="dxa" w:w="80"/>
+            </w:tcMar>
+          </w:tcPr>
+          <w:p>
+            <w:pPr>
+              <w:spacing w:after="0" w:line="240"/>
+            </w:pPr>
+            <w:r>
+              <w:rPr>
+                <w:b w:val="false"/>
+                <w:bCs w:val="false"/>
+                <w:sz w:val="16"/>
+                <w:szCs w:val="16"/>
+              </w:rPr>
+              <w:t xml:space="preserve">Wait for the warehouse migration to complete, then build once directly against the Data Lake endpoints.</w:t>
             </w:r>
           </w:p>
         </w:tc>
@@ -4926,63 +4990,94 @@
       <w:tr>
         <w:tc>
           <w:tcPr>
-            <w:tcW w:type="dxa" w:w="4122"/>
-            <w:tcBorders>
-              <w:top w:val="single" w:color="B1B4B6" w:sz="4"/>
-              <w:left w:val="single" w:color="B1B4B6" w:sz="4"/>
-              <w:bottom w:val="single" w:color="B1B4B6" w:sz="4"/>
-              <w:right w:val="single" w:color="B1B4B6" w:sz="4"/>
-            </w:tcBorders>
-            <w:tcMar>
-              <w:top w:type="dxa" w:w="40"/>
-              <w:left w:type="dxa" w:w="80"/>
-              <w:bottom w:type="dxa" w:w="40"/>
-              <w:right w:type="dxa" w:w="80"/>
-            </w:tcMar>
-          </w:tcPr>
-          <w:p>
-            <w:pPr>
-              <w:spacing w:after="0" w:line="240"/>
-            </w:pPr>
-            <w:r>
-              <w:rPr>
-                <w:b w:val="false"/>
-                <w:bCs w:val="false"/>
-                <w:sz w:val="16"/>
-                <w:szCs w:val="16"/>
-              </w:rPr>
-              <w:t xml:space="preserve">Should leg A land into the Data Lake target rather than the current landing area?</w:t>
-            </w:r>
-          </w:p>
-        </w:tc>
-        <w:tc>
-          <w:tcPr>
-            <w:tcW w:type="dxa" w:w="6184"/>
-            <w:tcBorders>
-              <w:top w:val="single" w:color="B1B4B6" w:sz="4"/>
-              <w:left w:val="single" w:color="B1B4B6" w:sz="4"/>
-              <w:bottom w:val="single" w:color="B1B4B6" w:sz="4"/>
-              <w:right w:val="single" w:color="B1B4B6" w:sz="4"/>
-            </w:tcBorders>
-            <w:tcMar>
-              <w:top w:type="dxa" w:w="40"/>
-              <w:left w:type="dxa" w:w="80"/>
-              <w:bottom w:type="dxa" w:w="40"/>
-              <w:right w:type="dxa" w:w="80"/>
-            </w:tcMar>
-          </w:tcPr>
-          <w:p>
-            <w:pPr>
-              <w:spacing w:after="0" w:line="240"/>
-            </w:pPr>
-            <w:r>
-              <w:rPr>
-                <w:b w:val="false"/>
-                <w:bCs w:val="false"/>
-                <w:sz w:val="16"/>
-                <w:szCs w:val="16"/>
-              </w:rPr>
-              <w:t xml:space="preserve">If the Data Lake landing zone already exists, building straight to it avoids a rebuild. If it does not, build to the current area and re-point later</w:t>
+            <w:tcW w:type="dxa" w:w="1855"/>
+            <w:tcBorders>
+              <w:top w:val="single" w:color="B1B4B6" w:sz="4"/>
+              <w:left w:val="single" w:color="B1B4B6" w:sz="4"/>
+              <w:bottom w:val="single" w:color="B1B4B6" w:sz="4"/>
+              <w:right w:val="single" w:color="B1B4B6" w:sz="4"/>
+            </w:tcBorders>
+            <w:tcMar>
+              <w:top w:type="dxa" w:w="40"/>
+              <w:left w:type="dxa" w:w="80"/>
+              <w:bottom w:type="dxa" w:w="40"/>
+              <w:right w:type="dxa" w:w="80"/>
+            </w:tcMar>
+          </w:tcPr>
+          <w:p>
+            <w:pPr>
+              <w:spacing w:after="0" w:line="240"/>
+            </w:pPr>
+            <w:r>
+              <w:rPr>
+                <w:b w:val="false"/>
+                <w:bCs w:val="false"/>
+                <w:sz w:val="16"/>
+                <w:szCs w:val="16"/>
+              </w:rPr>
+              <w:t xml:space="preserve">Start date</w:t>
+            </w:r>
+          </w:p>
+        </w:tc>
+        <w:tc>
+          <w:tcPr>
+            <w:tcW w:type="dxa" w:w="4225"/>
+            <w:tcBorders>
+              <w:top w:val="single" w:color="B1B4B6" w:sz="4"/>
+              <w:left w:val="single" w:color="B1B4B6" w:sz="4"/>
+              <w:bottom w:val="single" w:color="B1B4B6" w:sz="4"/>
+              <w:right w:val="single" w:color="B1B4B6" w:sz="4"/>
+            </w:tcBorders>
+            <w:tcMar>
+              <w:top w:type="dxa" w:w="40"/>
+              <w:left w:type="dxa" w:w="80"/>
+              <w:bottom w:type="dxa" w:w="40"/>
+              <w:right w:type="dxa" w:w="80"/>
+            </w:tcMar>
+          </w:tcPr>
+          <w:p>
+            <w:pPr>
+              <w:spacing w:after="0" w:line="240"/>
+            </w:pPr>
+            <w:r>
+              <w:rPr>
+                <w:b w:val="false"/>
+                <w:bCs w:val="false"/>
+                <w:sz w:val="16"/>
+                <w:szCs w:val="16"/>
+              </w:rPr>
+              <w:t xml:space="preserve">28 September. Nothing is gated on the Data Lake programme.</w:t>
+            </w:r>
+          </w:p>
+        </w:tc>
+        <w:tc>
+          <w:tcPr>
+            <w:tcW w:type="dxa" w:w="4226"/>
+            <w:tcBorders>
+              <w:top w:val="single" w:color="B1B4B6" w:sz="4"/>
+              <w:left w:val="single" w:color="B1B4B6" w:sz="4"/>
+              <w:bottom w:val="single" w:color="B1B4B6" w:sz="4"/>
+              <w:right w:val="single" w:color="B1B4B6" w:sz="4"/>
+            </w:tcBorders>
+            <w:tcMar>
+              <w:top w:type="dxa" w:w="40"/>
+              <w:left w:type="dxa" w:w="80"/>
+              <w:bottom w:type="dxa" w:w="40"/>
+              <w:right w:type="dxa" w:w="80"/>
+            </w:tcMar>
+          </w:tcPr>
+          <w:p>
+            <w:pPr>
+              <w:spacing w:after="0" w:line="240"/>
+            </w:pPr>
+            <w:r>
+              <w:rPr>
+                <w:b w:val="false"/>
+                <w:bCs w:val="false"/>
+                <w:sz w:val="16"/>
+                <w:szCs w:val="16"/>
+              </w:rPr>
+              <w:t xml:space="preserve">Whenever the warehouse migration lands. Not ours to set.</w:t>
             </w:r>
           </w:p>
         </w:tc>
@@ -4990,63 +5085,969 @@
       <w:tr>
         <w:tc>
           <w:tcPr>
-            <w:tcW w:type="dxa" w:w="4122"/>
-            <w:tcBorders>
-              <w:top w:val="single" w:color="B1B4B6" w:sz="4"/>
-              <w:left w:val="single" w:color="B1B4B6" w:sz="4"/>
-              <w:bottom w:val="single" w:color="B1B4B6" w:sz="4"/>
-              <w:right w:val="single" w:color="B1B4B6" w:sz="4"/>
-            </w:tcBorders>
-            <w:tcMar>
-              <w:top w:type="dxa" w:w="40"/>
-              <w:left w:type="dxa" w:w="80"/>
-              <w:bottom w:type="dxa" w:w="40"/>
-              <w:right w:type="dxa" w:w="80"/>
-            </w:tcMar>
-          </w:tcPr>
-          <w:p>
-            <w:pPr>
-              <w:spacing w:after="0" w:line="240"/>
-            </w:pPr>
-            <w:r>
-              <w:rPr>
-                <w:b w:val="false"/>
-                <w:bCs w:val="false"/>
-                <w:sz w:val="16"/>
-                <w:szCs w:val="16"/>
-              </w:rPr>
-              <w:t xml:space="preserve">Does the Maestro job chain survive the migration, or is it replaced by Data Lake ingestion?</w:t>
-            </w:r>
-          </w:p>
-        </w:tc>
-        <w:tc>
-          <w:tcPr>
-            <w:tcW w:type="dxa" w:w="6184"/>
-            <w:tcBorders>
-              <w:top w:val="single" w:color="B1B4B6" w:sz="4"/>
-              <w:left w:val="single" w:color="B1B4B6" w:sz="4"/>
-              <w:bottom w:val="single" w:color="B1B4B6" w:sz="4"/>
-              <w:right w:val="single" w:color="B1B4B6" w:sz="4"/>
-            </w:tcBorders>
-            <w:tcMar>
-              <w:top w:type="dxa" w:w="40"/>
-              <w:left w:type="dxa" w:w="80"/>
-              <w:bottom w:type="dxa" w:w="40"/>
-              <w:right w:type="dxa" w:w="80"/>
-            </w:tcMar>
-          </w:tcPr>
-          <w:p>
-            <w:pPr>
-              <w:spacing w:after="0" w:line="240"/>
-            </w:pPr>
-            <w:r>
-              <w:rPr>
-                <w:b w:val="false"/>
-                <w:bCs w:val="false"/>
-                <w:sz w:val="16"/>
-                <w:szCs w:val="16"/>
-              </w:rPr>
-              <w:t xml:space="preserve">The MVP assumes the internal chain is untouched. If it is being replaced, leg A's handover point changes</w:t>
+            <w:tcW w:type="dxa" w:w="1855"/>
+            <w:tcBorders>
+              <w:top w:val="single" w:color="B1B4B6" w:sz="4"/>
+              <w:left w:val="single" w:color="B1B4B6" w:sz="4"/>
+              <w:bottom w:val="single" w:color="B1B4B6" w:sz="4"/>
+              <w:right w:val="single" w:color="B1B4B6" w:sz="4"/>
+            </w:tcBorders>
+            <w:tcMar>
+              <w:top w:type="dxa" w:w="40"/>
+              <w:left w:type="dxa" w:w="80"/>
+              <w:bottom w:type="dxa" w:w="40"/>
+              <w:right w:type="dxa" w:w="80"/>
+            </w:tcMar>
+          </w:tcPr>
+          <w:p>
+            <w:pPr>
+              <w:spacing w:after="0" w:line="240"/>
+            </w:pPr>
+            <w:r>
+              <w:rPr>
+                <w:b w:val="false"/>
+                <w:bCs w:val="false"/>
+                <w:sz w:val="16"/>
+                <w:szCs w:val="16"/>
+              </w:rPr>
+              <w:t xml:space="preserve">Build effort</w:t>
+            </w:r>
+          </w:p>
+        </w:tc>
+        <w:tc>
+          <w:tcPr>
+            <w:tcW w:type="dxa" w:w="4225"/>
+            <w:tcBorders>
+              <w:top w:val="single" w:color="B1B4B6" w:sz="4"/>
+              <w:left w:val="single" w:color="B1B4B6" w:sz="4"/>
+              <w:bottom w:val="single" w:color="B1B4B6" w:sz="4"/>
+              <w:right w:val="single" w:color="B1B4B6" w:sz="4"/>
+            </w:tcBorders>
+            <w:tcMar>
+              <w:top w:type="dxa" w:w="40"/>
+              <w:left w:type="dxa" w:w="80"/>
+              <w:bottom w:type="dxa" w:w="40"/>
+              <w:right w:type="dxa" w:w="80"/>
+            </w:tcMar>
+          </w:tcPr>
+          <w:p>
+            <w:pPr>
+              <w:spacing w:after="0" w:line="240"/>
+            </w:pPr>
+            <w:r>
+              <w:rPr>
+                <w:b w:val="false"/>
+                <w:bCs w:val="false"/>
+                <w:sz w:val="16"/>
+                <w:szCs w:val="16"/>
+              </w:rPr>
+              <w:t xml:space="preserve">Two days now, plus a one-row endpoint change later.</w:t>
+            </w:r>
+          </w:p>
+        </w:tc>
+        <w:tc>
+          <w:tcPr>
+            <w:tcW w:type="dxa" w:w="4226"/>
+            <w:tcBorders>
+              <w:top w:val="single" w:color="B1B4B6" w:sz="4"/>
+              <w:left w:val="single" w:color="B1B4B6" w:sz="4"/>
+              <w:bottom w:val="single" w:color="B1B4B6" w:sz="4"/>
+              <w:right w:val="single" w:color="B1B4B6" w:sz="4"/>
+            </w:tcBorders>
+            <w:tcMar>
+              <w:top w:type="dxa" w:w="40"/>
+              <w:left w:type="dxa" w:w="80"/>
+              <w:bottom w:type="dxa" w:w="40"/>
+              <w:right w:type="dxa" w:w="80"/>
+            </w:tcMar>
+          </w:tcPr>
+          <w:p>
+            <w:pPr>
+              <w:spacing w:after="0" w:line="240"/>
+            </w:pPr>
+            <w:r>
+              <w:rPr>
+                <w:b w:val="false"/>
+                <w:bCs w:val="false"/>
+                <w:sz w:val="16"/>
+                <w:szCs w:val="16"/>
+              </w:rPr>
+              <w:t xml:space="preserve">Two days, once.</w:t>
+            </w:r>
+          </w:p>
+        </w:tc>
+      </w:tr>
+      <w:tr>
+        <w:tc>
+          <w:tcPr>
+            <w:tcW w:type="dxa" w:w="1855"/>
+            <w:tcBorders>
+              <w:top w:val="single" w:color="B1B4B6" w:sz="4"/>
+              <w:left w:val="single" w:color="B1B4B6" w:sz="4"/>
+              <w:bottom w:val="single" w:color="B1B4B6" w:sz="4"/>
+              <w:right w:val="single" w:color="B1B4B6" w:sz="4"/>
+            </w:tcBorders>
+            <w:tcMar>
+              <w:top w:type="dxa" w:w="40"/>
+              <w:left w:type="dxa" w:w="80"/>
+              <w:bottom w:type="dxa" w:w="40"/>
+              <w:right w:type="dxa" w:w="80"/>
+            </w:tcMar>
+          </w:tcPr>
+          <w:p>
+            <w:pPr>
+              <w:spacing w:after="0" w:line="240"/>
+            </w:pPr>
+            <w:r>
+              <w:rPr>
+                <w:b w:val="false"/>
+                <w:bCs w:val="false"/>
+                <w:sz w:val="16"/>
+                <w:szCs w:val="16"/>
+              </w:rPr>
+              <w:t xml:space="preserve">What it proves</w:t>
+            </w:r>
+          </w:p>
+        </w:tc>
+        <w:tc>
+          <w:tcPr>
+            <w:tcW w:type="dxa" w:w="4225"/>
+            <w:tcBorders>
+              <w:top w:val="single" w:color="B1B4B6" w:sz="4"/>
+              <w:left w:val="single" w:color="B1B4B6" w:sz="4"/>
+              <w:bottom w:val="single" w:color="B1B4B6" w:sz="4"/>
+              <w:right w:val="single" w:color="B1B4B6" w:sz="4"/>
+            </w:tcBorders>
+            <w:tcMar>
+              <w:top w:type="dxa" w:w="40"/>
+              <w:left w:type="dxa" w:w="80"/>
+              <w:bottom w:type="dxa" w:w="40"/>
+              <w:right w:type="dxa" w:w="80"/>
+            </w:tcMar>
+          </w:tcPr>
+          <w:p>
+            <w:pPr>
+              <w:spacing w:after="0" w:line="240"/>
+            </w:pPr>
+            <w:r>
+              <w:rPr>
+                <w:b w:val="false"/>
+                <w:bCs w:val="false"/>
+                <w:sz w:val="16"/>
+                <w:szCs w:val="16"/>
+              </w:rPr>
+              <w:t xml:space="preserve">Both the transfer and the claim that re-pointing an interface is a configuration change rather than a rebuild.</w:t>
+            </w:r>
+          </w:p>
+        </w:tc>
+        <w:tc>
+          <w:tcPr>
+            <w:tcW w:type="dxa" w:w="4226"/>
+            <w:tcBorders>
+              <w:top w:val="single" w:color="B1B4B6" w:sz="4"/>
+              <w:left w:val="single" w:color="B1B4B6" w:sz="4"/>
+              <w:bottom w:val="single" w:color="B1B4B6" w:sz="4"/>
+              <w:right w:val="single" w:color="B1B4B6" w:sz="4"/>
+            </w:tcBorders>
+            <w:tcMar>
+              <w:top w:type="dxa" w:w="40"/>
+              <w:left w:type="dxa" w:w="80"/>
+              <w:bottom w:type="dxa" w:w="40"/>
+              <w:right w:type="dxa" w:w="80"/>
+            </w:tcMar>
+          </w:tcPr>
+          <w:p>
+            <w:pPr>
+              <w:spacing w:after="0" w:line="240"/>
+            </w:pPr>
+            <w:r>
+              <w:rPr>
+                <w:b w:val="false"/>
+                <w:bCs w:val="false"/>
+                <w:sz w:val="16"/>
+                <w:szCs w:val="16"/>
+              </w:rPr>
+              <w:t xml:space="preserve">The transfer only.</w:t>
+            </w:r>
+          </w:p>
+        </w:tc>
+      </w:tr>
+      <w:tr>
+        <w:tc>
+          <w:tcPr>
+            <w:tcW w:type="dxa" w:w="1855"/>
+            <w:tcBorders>
+              <w:top w:val="single" w:color="B1B4B6" w:sz="4"/>
+              <w:left w:val="single" w:color="B1B4B6" w:sz="4"/>
+              <w:bottom w:val="single" w:color="B1B4B6" w:sz="4"/>
+              <w:right w:val="single" w:color="B1B4B6" w:sz="4"/>
+            </w:tcBorders>
+            <w:tcMar>
+              <w:top w:type="dxa" w:w="40"/>
+              <w:left w:type="dxa" w:w="80"/>
+              <w:bottom w:type="dxa" w:w="40"/>
+              <w:right w:type="dxa" w:w="80"/>
+            </w:tcMar>
+          </w:tcPr>
+          <w:p>
+            <w:pPr>
+              <w:spacing w:after="0" w:line="240"/>
+            </w:pPr>
+            <w:r>
+              <w:rPr>
+                <w:b w:val="false"/>
+                <w:bCs w:val="false"/>
+                <w:sz w:val="16"/>
+                <w:szCs w:val="16"/>
+              </w:rPr>
+              <w:t xml:space="preserve">What it costs</w:t>
+            </w:r>
+          </w:p>
+        </w:tc>
+        <w:tc>
+          <w:tcPr>
+            <w:tcW w:type="dxa" w:w="4225"/>
+            <w:tcBorders>
+              <w:top w:val="single" w:color="B1B4B6" w:sz="4"/>
+              <w:left w:val="single" w:color="B1B4B6" w:sz="4"/>
+              <w:bottom w:val="single" w:color="B1B4B6" w:sz="4"/>
+              <w:right w:val="single" w:color="B1B4B6" w:sz="4"/>
+            </w:tcBorders>
+            <w:tcMar>
+              <w:top w:type="dxa" w:w="40"/>
+              <w:left w:type="dxa" w:w="80"/>
+              <w:bottom w:type="dxa" w:w="40"/>
+              <w:right w:type="dxa" w:w="80"/>
+            </w:tcMar>
+          </w:tcPr>
+          <w:p>
+            <w:pPr>
+              <w:spacing w:after="0" w:line="240"/>
+            </w:pPr>
+            <w:r>
+              <w:rPr>
+                <w:b w:val="false"/>
+                <w:bCs w:val="false"/>
+                <w:sz w:val="16"/>
+                <w:szCs w:val="16"/>
+              </w:rPr>
+              <w:t xml:space="preserve">One config change at migration time, and a short period where the flow points at an endpoint with a known end date.</w:t>
+            </w:r>
+          </w:p>
+        </w:tc>
+        <w:tc>
+          <w:tcPr>
+            <w:tcW w:type="dxa" w:w="4226"/>
+            <w:tcBorders>
+              <w:top w:val="single" w:color="B1B4B6" w:sz="4"/>
+              <w:left w:val="single" w:color="B1B4B6" w:sz="4"/>
+              <w:bottom w:val="single" w:color="B1B4B6" w:sz="4"/>
+              <w:right w:val="single" w:color="B1B4B6" w:sz="4"/>
+            </w:tcBorders>
+            <w:tcMar>
+              <w:top w:type="dxa" w:w="40"/>
+              <w:left w:type="dxa" w:w="80"/>
+              <w:bottom w:type="dxa" w:w="40"/>
+              <w:right w:type="dxa" w:w="80"/>
+            </w:tcMar>
+          </w:tcPr>
+          <w:p>
+            <w:pPr>
+              <w:spacing w:after="0" w:line="240"/>
+            </w:pPr>
+            <w:r>
+              <w:rPr>
+                <w:b w:val="false"/>
+                <w:bCs w:val="false"/>
+                <w:sz w:val="16"/>
+                <w:szCs w:val="16"/>
+              </w:rPr>
+              <w:t xml:space="preserve">The legacy IAF transfer keeps running on the old platform for the whole duration of the warehouse migration, and the MVP evidence arrives too late to inform the wider onboarding plan.</w:t>
+            </w:r>
+          </w:p>
+        </w:tc>
+      </w:tr>
+      <w:tr>
+        <w:tc>
+          <w:tcPr>
+            <w:tcW w:type="dxa" w:w="1855"/>
+            <w:tcBorders>
+              <w:top w:val="single" w:color="B1B4B6" w:sz="4"/>
+              <w:left w:val="single" w:color="B1B4B6" w:sz="4"/>
+              <w:bottom w:val="single" w:color="B1B4B6" w:sz="4"/>
+              <w:right w:val="single" w:color="B1B4B6" w:sz="4"/>
+            </w:tcBorders>
+            <w:tcMar>
+              <w:top w:type="dxa" w:w="40"/>
+              <w:left w:type="dxa" w:w="80"/>
+              <w:bottom w:type="dxa" w:w="40"/>
+              <w:right w:type="dxa" w:w="80"/>
+            </w:tcMar>
+          </w:tcPr>
+          <w:p>
+            <w:pPr>
+              <w:spacing w:after="0" w:line="240"/>
+            </w:pPr>
+            <w:r>
+              <w:rPr>
+                <w:b w:val="false"/>
+                <w:bCs w:val="false"/>
+                <w:sz w:val="16"/>
+                <w:szCs w:val="16"/>
+              </w:rPr>
+              <w:t xml:space="preserve">Main risk</w:t>
+            </w:r>
+          </w:p>
+        </w:tc>
+        <w:tc>
+          <w:tcPr>
+            <w:tcW w:type="dxa" w:w="4225"/>
+            <w:tcBorders>
+              <w:top w:val="single" w:color="B1B4B6" w:sz="4"/>
+              <w:left w:val="single" w:color="B1B4B6" w:sz="4"/>
+              <w:bottom w:val="single" w:color="B1B4B6" w:sz="4"/>
+              <w:right w:val="single" w:color="B1B4B6" w:sz="4"/>
+            </w:tcBorders>
+            <w:tcMar>
+              <w:top w:type="dxa" w:w="40"/>
+              <w:left w:type="dxa" w:w="80"/>
+              <w:bottom w:type="dxa" w:w="40"/>
+              <w:right w:type="dxa" w:w="80"/>
+            </w:tcMar>
+          </w:tcPr>
+          <w:p>
+            <w:pPr>
+              <w:spacing w:after="0" w:line="240"/>
+            </w:pPr>
+            <w:r>
+              <w:rPr>
+                <w:b w:val="false"/>
+                <w:bCs w:val="false"/>
+                <w:sz w:val="16"/>
+                <w:szCs w:val="16"/>
+              </w:rPr>
+              <w:t xml:space="preserve">The Data Lake endpoint differs enough that the re-point is not a one-row change. If so, that is a finding worth having early rather than late.</w:t>
+            </w:r>
+          </w:p>
+        </w:tc>
+        <w:tc>
+          <w:tcPr>
+            <w:tcW w:type="dxa" w:w="4226"/>
+            <w:tcBorders>
+              <w:top w:val="single" w:color="B1B4B6" w:sz="4"/>
+              <w:left w:val="single" w:color="B1B4B6" w:sz="4"/>
+              <w:bottom w:val="single" w:color="B1B4B6" w:sz="4"/>
+              <w:right w:val="single" w:color="B1B4B6" w:sz="4"/>
+            </w:tcBorders>
+            <w:tcMar>
+              <w:top w:type="dxa" w:w="40"/>
+              <w:left w:type="dxa" w:w="80"/>
+              <w:bottom w:type="dxa" w:w="40"/>
+              <w:right w:type="dxa" w:w="80"/>
+            </w:tcMar>
+          </w:tcPr>
+          <w:p>
+            <w:pPr>
+              <w:spacing w:after="0" w:line="240"/>
+            </w:pPr>
+            <w:r>
+              <w:rPr>
+                <w:b w:val="false"/>
+                <w:bCs w:val="false"/>
+                <w:sz w:val="16"/>
+                <w:szCs w:val="16"/>
+              </w:rPr>
+              <w:t xml:space="preserve">The migration slips and the MVP slips with it.</w:t>
+            </w:r>
+          </w:p>
+        </w:tc>
+      </w:tr>
+    </w:tbl>
+    <w:p>
+      <w:pPr>
+        <w:spacing w:after="40"/>
+      </w:pPr>
+    </w:p>
+    <w:p>
+      <w:pPr>
+        <w:pStyle w:val="Heading2"/>
+        <w:spacing w:after="60" w:before="140"/>
+      </w:pPr>
+      <w:r>
+        <w:t xml:space="preserve">Recommendation: option 1</w:t>
+      </w:r>
+    </w:p>
+    <w:p>
+      <w:pPr>
+        <w:pStyle w:val="ListParagraph"/>
+        <w:numPr>
+          <w:ilvl w:val="0"/>
+          <w:numId w:val="2"/>
+        </w:numPr>
+        <w:spacing w:after="50"/>
+      </w:pPr>
+      <w:r>
+        <w:rPr>
+          <w:sz w:val="19"/>
+          <w:szCs w:val="19"/>
+        </w:rPr>
+        <w:t xml:space="preserve">It decouples the two workstreams. Neither programme waits on the other, and the two-week window survives.</w:t>
+      </w:r>
+    </w:p>
+    <w:p>
+      <w:pPr>
+        <w:pStyle w:val="ListParagraph"/>
+        <w:numPr>
+          <w:ilvl w:val="0"/>
+          <w:numId w:val="2"/>
+        </w:numPr>
+        <w:spacing w:after="50"/>
+      </w:pPr>
+      <w:r>
+        <w:rPr>
+          <w:sz w:val="19"/>
+          <w:szCs w:val="19"/>
+        </w:rPr>
+        <w:t xml:space="preserve">The re-point is the same work as any endpoint change, so doing it twice costs close to nothing if the platform behaves as designed. Proving that is the point of the MVP, not a side effect of it.</w:t>
+      </w:r>
+    </w:p>
+    <w:p>
+      <w:pPr>
+        <w:pStyle w:val="ListParagraph"/>
+        <w:numPr>
+          <w:ilvl w:val="0"/>
+          <w:numId w:val="2"/>
+        </w:numPr>
+        <w:spacing w:after="50"/>
+      </w:pPr>
+      <w:r>
+        <w:rPr>
+          <w:sz w:val="19"/>
+          <w:szCs w:val="19"/>
+        </w:rPr>
+        <w:t xml:space="preserve">Option 2 hands the MVP start date to a programme that does not control it. That is the substantive difference between the two.</w:t>
+      </w:r>
+    </w:p>
+    <w:p>
+      <w:pPr>
+        <w:pStyle w:val="ListParagraph"/>
+        <w:numPr>
+          <w:ilvl w:val="0"/>
+          <w:numId w:val="2"/>
+        </w:numPr>
+        <w:spacing w:after="50"/>
+      </w:pPr>
+      <w:r>
+        <w:rPr>
+          <w:sz w:val="19"/>
+          <w:szCs w:val="19"/>
+        </w:rPr>
+        <w:t xml:space="preserve">Option 2 only wins if the Data Lake landing zone already exists and is reachable before day 5. If that turns out to be true, build straight to it. That is still option 1, just with a different endpoint value in the configuration row.</w:t>
+      </w:r>
+    </w:p>
+    <w:p>
+      <w:pPr>
+        <w:pStyle w:val="Heading2"/>
+        <w:spacing w:after="60" w:before="140"/>
+      </w:pPr>
+      <w:r>
+        <w:t xml:space="preserve">Conditions on option 1</w:t>
+      </w:r>
+    </w:p>
+    <w:tbl>
+      <w:tblPr>
+        <w:tblW w:type="dxa" w:w="10306"/>
+        <w:tblBorders>
+          <w:top w:val="single" w:color="auto" w:sz="4"/>
+          <w:left w:val="single" w:color="auto" w:sz="4"/>
+          <w:bottom w:val="single" w:color="auto" w:sz="4"/>
+          <w:right w:val="single" w:color="auto" w:sz="4"/>
+          <w:insideH w:val="single" w:color="auto" w:sz="4"/>
+          <w:insideV w:val="single" w:color="auto" w:sz="4"/>
+        </w:tblBorders>
+      </w:tblPr>
+      <w:tblGrid>
+        <w:gridCol w:w="6390"/>
+        <w:gridCol w:w="2267"/>
+        <w:gridCol w:w="1649"/>
+      </w:tblGrid>
+      <w:tr>
+        <w:trPr>
+          <w:tblHeader/>
+        </w:trPr>
+        <w:tc>
+          <w:tcPr>
+            <w:tcW w:type="dxa" w:w="6390"/>
+            <w:tcBorders>
+              <w:top w:val="single" w:color="B1B4B6" w:sz="4"/>
+              <w:left w:val="single" w:color="B1B4B6" w:sz="4"/>
+              <w:bottom w:val="single" w:color="B1B4B6" w:sz="4"/>
+              <w:right w:val="single" w:color="B1B4B6" w:sz="4"/>
+            </w:tcBorders>
+            <w:shd w:fill="F3F2F1" w:color="auto" w:val="clear"/>
+            <w:tcMar>
+              <w:top w:type="dxa" w:w="40"/>
+              <w:left w:type="dxa" w:w="80"/>
+              <w:bottom w:type="dxa" w:w="40"/>
+              <w:right w:type="dxa" w:w="80"/>
+            </w:tcMar>
+          </w:tcPr>
+          <w:p>
+            <w:pPr>
+              <w:spacing w:after="0" w:line="240"/>
+            </w:pPr>
+            <w:r>
+              <w:rPr>
+                <w:b/>
+                <w:bCs/>
+                <w:sz w:val="16"/>
+                <w:szCs w:val="16"/>
+              </w:rPr>
+              <w:t xml:space="preserve">Condition</w:t>
+            </w:r>
+          </w:p>
+        </w:tc>
+        <w:tc>
+          <w:tcPr>
+            <w:tcW w:type="dxa" w:w="2267"/>
+            <w:tcBorders>
+              <w:top w:val="single" w:color="B1B4B6" w:sz="4"/>
+              <w:left w:val="single" w:color="B1B4B6" w:sz="4"/>
+              <w:bottom w:val="single" w:color="B1B4B6" w:sz="4"/>
+              <w:right w:val="single" w:color="B1B4B6" w:sz="4"/>
+            </w:tcBorders>
+            <w:shd w:fill="F3F2F1" w:color="auto" w:val="clear"/>
+            <w:tcMar>
+              <w:top w:type="dxa" w:w="40"/>
+              <w:left w:type="dxa" w:w="80"/>
+              <w:bottom w:type="dxa" w:w="40"/>
+              <w:right w:type="dxa" w:w="80"/>
+            </w:tcMar>
+          </w:tcPr>
+          <w:p>
+            <w:pPr>
+              <w:spacing w:after="0" w:line="240"/>
+            </w:pPr>
+            <w:r>
+              <w:rPr>
+                <w:b/>
+                <w:bCs/>
+                <w:sz w:val="16"/>
+                <w:szCs w:val="16"/>
+              </w:rPr>
+              <w:t xml:space="preserve">Owner</w:t>
+            </w:r>
+          </w:p>
+        </w:tc>
+        <w:tc>
+          <w:tcPr>
+            <w:tcW w:type="dxa" w:w="1649"/>
+            <w:tcBorders>
+              <w:top w:val="single" w:color="B1B4B6" w:sz="4"/>
+              <w:left w:val="single" w:color="B1B4B6" w:sz="4"/>
+              <w:bottom w:val="single" w:color="B1B4B6" w:sz="4"/>
+              <w:right w:val="single" w:color="B1B4B6" w:sz="4"/>
+            </w:tcBorders>
+            <w:shd w:fill="F3F2F1" w:color="auto" w:val="clear"/>
+            <w:tcMar>
+              <w:top w:type="dxa" w:w="40"/>
+              <w:left w:type="dxa" w:w="80"/>
+              <w:bottom w:type="dxa" w:w="40"/>
+              <w:right w:type="dxa" w:w="80"/>
+            </w:tcMar>
+          </w:tcPr>
+          <w:p>
+            <w:pPr>
+              <w:spacing w:after="0" w:line="240"/>
+            </w:pPr>
+            <w:r>
+              <w:rPr>
+                <w:b/>
+                <w:bCs/>
+                <w:sz w:val="16"/>
+                <w:szCs w:val="16"/>
+              </w:rPr>
+              <w:t xml:space="preserve">Needed by</w:t>
+            </w:r>
+          </w:p>
+        </w:tc>
+      </w:tr>
+      <w:tr>
+        <w:tc>
+          <w:tcPr>
+            <w:tcW w:type="dxa" w:w="6390"/>
+            <w:tcBorders>
+              <w:top w:val="single" w:color="B1B4B6" w:sz="4"/>
+              <w:left w:val="single" w:color="B1B4B6" w:sz="4"/>
+              <w:bottom w:val="single" w:color="B1B4B6" w:sz="4"/>
+              <w:right w:val="single" w:color="B1B4B6" w:sz="4"/>
+            </w:tcBorders>
+            <w:tcMar>
+              <w:top w:type="dxa" w:w="40"/>
+              <w:left w:type="dxa" w:w="80"/>
+              <w:bottom w:type="dxa" w:w="40"/>
+              <w:right w:type="dxa" w:w="80"/>
+            </w:tcMar>
+          </w:tcPr>
+          <w:p>
+            <w:pPr>
+              <w:spacing w:after="0" w:line="240"/>
+            </w:pPr>
+            <w:r>
+              <w:rPr>
+                <w:b w:val="false"/>
+                <w:bCs w:val="false"/>
+                <w:sz w:val="16"/>
+                <w:szCs w:val="16"/>
+              </w:rPr>
+              <w:t xml:space="preserve">Confirm the NPS landing area and MWS output area are in migration scope, and the indicative move date</w:t>
+            </w:r>
+          </w:p>
+        </w:tc>
+        <w:tc>
+          <w:tcPr>
+            <w:tcW w:type="dxa" w:w="2267"/>
+            <w:tcBorders>
+              <w:top w:val="single" w:color="B1B4B6" w:sz="4"/>
+              <w:left w:val="single" w:color="B1B4B6" w:sz="4"/>
+              <w:bottom w:val="single" w:color="B1B4B6" w:sz="4"/>
+              <w:right w:val="single" w:color="B1B4B6" w:sz="4"/>
+            </w:tcBorders>
+            <w:tcMar>
+              <w:top w:type="dxa" w:w="40"/>
+              <w:left w:type="dxa" w:w="80"/>
+              <w:bottom w:type="dxa" w:w="40"/>
+              <w:right w:type="dxa" w:w="80"/>
+            </w:tcMar>
+          </w:tcPr>
+          <w:p>
+            <w:pPr>
+              <w:spacing w:after="0" w:line="240"/>
+            </w:pPr>
+            <w:r>
+              <w:rPr>
+                <w:b w:val="false"/>
+                <w:bCs w:val="false"/>
+                <w:sz w:val="16"/>
+                <w:szCs w:val="16"/>
+              </w:rPr>
+              <w:t xml:space="preserve">Data Lake programme</w:t>
+            </w:r>
+          </w:p>
+        </w:tc>
+        <w:tc>
+          <w:tcPr>
+            <w:tcW w:type="dxa" w:w="1649"/>
+            <w:tcBorders>
+              <w:top w:val="single" w:color="B1B4B6" w:sz="4"/>
+              <w:left w:val="single" w:color="B1B4B6" w:sz="4"/>
+              <w:bottom w:val="single" w:color="B1B4B6" w:sz="4"/>
+              <w:right w:val="single" w:color="B1B4B6" w:sz="4"/>
+            </w:tcBorders>
+            <w:tcMar>
+              <w:top w:type="dxa" w:w="40"/>
+              <w:left w:type="dxa" w:w="80"/>
+              <w:bottom w:type="dxa" w:w="40"/>
+              <w:right w:type="dxa" w:w="80"/>
+            </w:tcMar>
+          </w:tcPr>
+          <w:p>
+            <w:pPr>
+              <w:spacing w:after="0" w:line="240"/>
+            </w:pPr>
+            <w:r>
+              <w:rPr>
+                <w:b w:val="false"/>
+                <w:bCs w:val="false"/>
+                <w:sz w:val="16"/>
+                <w:szCs w:val="16"/>
+              </w:rPr>
+              <w:t xml:space="preserve">Day 5</w:t>
+            </w:r>
+          </w:p>
+        </w:tc>
+      </w:tr>
+      <w:tr>
+        <w:tc>
+          <w:tcPr>
+            <w:tcW w:type="dxa" w:w="6390"/>
+            <w:tcBorders>
+              <w:top w:val="single" w:color="B1B4B6" w:sz="4"/>
+              <w:left w:val="single" w:color="B1B4B6" w:sz="4"/>
+              <w:bottom w:val="single" w:color="B1B4B6" w:sz="4"/>
+              <w:right w:val="single" w:color="B1B4B6" w:sz="4"/>
+            </w:tcBorders>
+            <w:tcMar>
+              <w:top w:type="dxa" w:w="40"/>
+              <w:left w:type="dxa" w:w="80"/>
+              <w:bottom w:type="dxa" w:w="40"/>
+              <w:right w:type="dxa" w:w="80"/>
+            </w:tcMar>
+          </w:tcPr>
+          <w:p>
+            <w:pPr>
+              <w:spacing w:after="0" w:line="240"/>
+            </w:pPr>
+            <w:r>
+              <w:rPr>
+                <w:b w:val="false"/>
+                <w:bCs w:val="false"/>
+                <w:sz w:val="16"/>
+                <w:szCs w:val="16"/>
+              </w:rPr>
+              <w:t xml:space="preserve">Record the Data Lake target endpoints in the configuration row as a known future change, so the re-point is planned rather than discovered</w:t>
+            </w:r>
+          </w:p>
+        </w:tc>
+        <w:tc>
+          <w:tcPr>
+            <w:tcW w:type="dxa" w:w="2267"/>
+            <w:tcBorders>
+              <w:top w:val="single" w:color="B1B4B6" w:sz="4"/>
+              <w:left w:val="single" w:color="B1B4B6" w:sz="4"/>
+              <w:bottom w:val="single" w:color="B1B4B6" w:sz="4"/>
+              <w:right w:val="single" w:color="B1B4B6" w:sz="4"/>
+            </w:tcBorders>
+            <w:tcMar>
+              <w:top w:type="dxa" w:w="40"/>
+              <w:left w:type="dxa" w:w="80"/>
+              <w:bottom w:type="dxa" w:w="40"/>
+              <w:right w:type="dxa" w:w="80"/>
+            </w:tcMar>
+          </w:tcPr>
+          <w:p>
+            <w:pPr>
+              <w:spacing w:after="0" w:line="240"/>
+            </w:pPr>
+            <w:r>
+              <w:rPr>
+                <w:b w:val="false"/>
+                <w:bCs w:val="false"/>
+                <w:sz w:val="16"/>
+                <w:szCs w:val="16"/>
+              </w:rPr>
+              <w:t xml:space="preserve">Integration architecture</w:t>
+            </w:r>
+          </w:p>
+        </w:tc>
+        <w:tc>
+          <w:tcPr>
+            <w:tcW w:type="dxa" w:w="1649"/>
+            <w:tcBorders>
+              <w:top w:val="single" w:color="B1B4B6" w:sz="4"/>
+              <w:left w:val="single" w:color="B1B4B6" w:sz="4"/>
+              <w:bottom w:val="single" w:color="B1B4B6" w:sz="4"/>
+              <w:right w:val="single" w:color="B1B4B6" w:sz="4"/>
+            </w:tcBorders>
+            <w:tcMar>
+              <w:top w:type="dxa" w:w="40"/>
+              <w:left w:type="dxa" w:w="80"/>
+              <w:bottom w:type="dxa" w:w="40"/>
+              <w:right w:type="dxa" w:w="80"/>
+            </w:tcMar>
+          </w:tcPr>
+          <w:p>
+            <w:pPr>
+              <w:spacing w:after="0" w:line="240"/>
+            </w:pPr>
+            <w:r>
+              <w:rPr>
+                <w:b w:val="false"/>
+                <w:bCs w:val="false"/>
+                <w:sz w:val="16"/>
+                <w:szCs w:val="16"/>
+              </w:rPr>
+              <w:t xml:space="preserve">Day 6</w:t>
+            </w:r>
+          </w:p>
+        </w:tc>
+      </w:tr>
+      <w:tr>
+        <w:tc>
+          <w:tcPr>
+            <w:tcW w:type="dxa" w:w="6390"/>
+            <w:tcBorders>
+              <w:top w:val="single" w:color="B1B4B6" w:sz="4"/>
+              <w:left w:val="single" w:color="B1B4B6" w:sz="4"/>
+              <w:bottom w:val="single" w:color="B1B4B6" w:sz="4"/>
+              <w:right w:val="single" w:color="B1B4B6" w:sz="4"/>
+            </w:tcBorders>
+            <w:tcMar>
+              <w:top w:type="dxa" w:w="40"/>
+              <w:left w:type="dxa" w:w="80"/>
+              <w:bottom w:type="dxa" w:w="40"/>
+              <w:right w:type="dxa" w:w="80"/>
+            </w:tcMar>
+          </w:tcPr>
+          <w:p>
+            <w:pPr>
+              <w:spacing w:after="0" w:line="240"/>
+            </w:pPr>
+            <w:r>
+              <w:rPr>
+                <w:b w:val="false"/>
+                <w:bCs w:val="false"/>
+                <w:sz w:val="16"/>
+                <w:szCs w:val="16"/>
+              </w:rPr>
+              <w:t xml:space="preserve">Confirm whether the Maestro chain survives the migration or is replaced by Data Lake ingestion. If replaced, leg A's handover point moves</w:t>
+            </w:r>
+          </w:p>
+        </w:tc>
+        <w:tc>
+          <w:tcPr>
+            <w:tcW w:type="dxa" w:w="2267"/>
+            <w:tcBorders>
+              <w:top w:val="single" w:color="B1B4B6" w:sz="4"/>
+              <w:left w:val="single" w:color="B1B4B6" w:sz="4"/>
+              <w:bottom w:val="single" w:color="B1B4B6" w:sz="4"/>
+              <w:right w:val="single" w:color="B1B4B6" w:sz="4"/>
+            </w:tcBorders>
+            <w:tcMar>
+              <w:top w:type="dxa" w:w="40"/>
+              <w:left w:type="dxa" w:w="80"/>
+              <w:bottom w:type="dxa" w:w="40"/>
+              <w:right w:type="dxa" w:w="80"/>
+            </w:tcMar>
+          </w:tcPr>
+          <w:p>
+            <w:pPr>
+              <w:spacing w:after="0" w:line="240"/>
+            </w:pPr>
+            <w:r>
+              <w:rPr>
+                <w:b w:val="false"/>
+                <w:bCs w:val="false"/>
+                <w:sz w:val="16"/>
+                <w:szCs w:val="16"/>
+              </w:rPr>
+              <w:t xml:space="preserve">Data Lake programme</w:t>
+            </w:r>
+          </w:p>
+        </w:tc>
+        <w:tc>
+          <w:tcPr>
+            <w:tcW w:type="dxa" w:w="1649"/>
+            <w:tcBorders>
+              <w:top w:val="single" w:color="B1B4B6" w:sz="4"/>
+              <w:left w:val="single" w:color="B1B4B6" w:sz="4"/>
+              <w:bottom w:val="single" w:color="B1B4B6" w:sz="4"/>
+              <w:right w:val="single" w:color="B1B4B6" w:sz="4"/>
+            </w:tcBorders>
+            <w:tcMar>
+              <w:top w:type="dxa" w:w="40"/>
+              <w:left w:type="dxa" w:w="80"/>
+              <w:bottom w:type="dxa" w:w="40"/>
+              <w:right w:type="dxa" w:w="80"/>
+            </w:tcMar>
+          </w:tcPr>
+          <w:p>
+            <w:pPr>
+              <w:spacing w:after="0" w:line="240"/>
+            </w:pPr>
+            <w:r>
+              <w:rPr>
+                <w:b w:val="false"/>
+                <w:bCs w:val="false"/>
+                <w:sz w:val="16"/>
+                <w:szCs w:val="16"/>
+              </w:rPr>
+              <w:t xml:space="preserve">Day 5</w:t>
+            </w:r>
+          </w:p>
+        </w:tc>
+      </w:tr>
+      <w:tr>
+        <w:tc>
+          <w:tcPr>
+            <w:tcW w:type="dxa" w:w="6390"/>
+            <w:tcBorders>
+              <w:top w:val="single" w:color="B1B4B6" w:sz="4"/>
+              <w:left w:val="single" w:color="B1B4B6" w:sz="4"/>
+              <w:bottom w:val="single" w:color="B1B4B6" w:sz="4"/>
+              <w:right w:val="single" w:color="B1B4B6" w:sz="4"/>
+            </w:tcBorders>
+            <w:tcMar>
+              <w:top w:type="dxa" w:w="40"/>
+              <w:left w:type="dxa" w:w="80"/>
+              <w:bottom w:type="dxa" w:w="40"/>
+              <w:right w:type="dxa" w:w="80"/>
+            </w:tcMar>
+          </w:tcPr>
+          <w:p>
+            <w:pPr>
+              <w:spacing w:after="0" w:line="240"/>
+            </w:pPr>
+            <w:r>
+              <w:rPr>
+                <w:b w:val="false"/>
+                <w:bCs w:val="false"/>
+                <w:sz w:val="16"/>
+                <w:szCs w:val="16"/>
+              </w:rPr>
+              <w:t xml:space="preserve">Measure and record the re-point when it happens, as evidence for or against the one-row claim</w:t>
+            </w:r>
+          </w:p>
+        </w:tc>
+        <w:tc>
+          <w:tcPr>
+            <w:tcW w:type="dxa" w:w="2267"/>
+            <w:tcBorders>
+              <w:top w:val="single" w:color="B1B4B6" w:sz="4"/>
+              <w:left w:val="single" w:color="B1B4B6" w:sz="4"/>
+              <w:bottom w:val="single" w:color="B1B4B6" w:sz="4"/>
+              <w:right w:val="single" w:color="B1B4B6" w:sz="4"/>
+            </w:tcBorders>
+            <w:tcMar>
+              <w:top w:type="dxa" w:w="40"/>
+              <w:left w:type="dxa" w:w="80"/>
+              <w:bottom w:type="dxa" w:w="40"/>
+              <w:right w:type="dxa" w:w="80"/>
+            </w:tcMar>
+          </w:tcPr>
+          <w:p>
+            <w:pPr>
+              <w:spacing w:after="0" w:line="240"/>
+            </w:pPr>
+            <w:r>
+              <w:rPr>
+                <w:b w:val="false"/>
+                <w:bCs w:val="false"/>
+                <w:sz w:val="16"/>
+                <w:szCs w:val="16"/>
+              </w:rPr>
+              <w:t xml:space="preserve">Integration architecture</w:t>
+            </w:r>
+          </w:p>
+        </w:tc>
+        <w:tc>
+          <w:tcPr>
+            <w:tcW w:type="dxa" w:w="1649"/>
+            <w:tcBorders>
+              <w:top w:val="single" w:color="B1B4B6" w:sz="4"/>
+              <w:left w:val="single" w:color="B1B4B6" w:sz="4"/>
+              <w:bottom w:val="single" w:color="B1B4B6" w:sz="4"/>
+              <w:right w:val="single" w:color="B1B4B6" w:sz="4"/>
+            </w:tcBorders>
+            <w:tcMar>
+              <w:top w:type="dxa" w:w="40"/>
+              <w:left w:type="dxa" w:w="80"/>
+              <w:bottom w:type="dxa" w:w="40"/>
+              <w:right w:type="dxa" w:w="80"/>
+            </w:tcMar>
+          </w:tcPr>
+          <w:p>
+            <w:pPr>
+              <w:spacing w:after="0" w:line="240"/>
+            </w:pPr>
+            <w:r>
+              <w:rPr>
+                <w:b w:val="false"/>
+                <w:bCs w:val="false"/>
+                <w:sz w:val="16"/>
+                <w:szCs w:val="16"/>
+              </w:rPr>
+              <w:t xml:space="preserve">At migration</w:t>
             </w:r>
           </w:p>
         </w:tc>
@@ -5073,7 +6074,7 @@
           <w:sz w:val="19"/>
           <w:szCs w:val="19"/>
         </w:rPr>
-        <w:t xml:space="preserve">This dependency is an argument for the MVP rather than against it. Under config over construction, re-pointing a transfer at a migrated endpoint is editing one row, not rebuilding an interface. If the platform behaves as designed, the Data Lake migration makes it more useful, not less. That is worth proving here.</w:t>
+        <w:t xml:space="preserve">The dependency is an argument for the MVP rather than against it. If re-pointing a migrated endpoint really is one row, the Data Lake migration makes the platform more useful, not less. If it is not one row, we need to know that now, while it costs two days rather than an estate.</w:t>
       </w:r>
     </w:p>
     <w:p>
@@ -6182,7 +7183,7 @@
                 <w:sz w:val="16"/>
                 <w:szCs w:val="16"/>
               </w:rPr>
-              <w:t xml:space="preserve">Build to the current endpoints and record the re-point as a one-row change. Do not pause the build waiting for the migration plan</w:t>
+              <w:t xml:space="preserve">Proceed on option 1. Build to the current endpoints and record the re-point as a planned one-row change. Do not pause the build waiting for the migration plan</w:t>
             </w:r>
           </w:p>
         </w:tc>
@@ -6522,6 +7523,12 @@
       <w:startOverride w:val="1"/>
     </w:lvlOverride>
   </w:num>
+  <w:num w:numId="2">
+    <w:abstractNumId w:val="2"/>
+    <w:lvlOverride w:ilvl="0">
+      <w:startOverride w:val="1"/>
+    </w:lvlOverride>
+  </w:num>
 </w:numbering>
 </file>
 

</xml_diff>

<commit_message>
Add executive view: section 0 in the plan, page and tracker
</commit_message>
<xml_diff>
--- a/assets/mft-mvp-plan.docx
+++ b/assets/mft-mvp-plan.docx
@@ -72,6 +72,778 @@
           <w:szCs w:val="16"/>
         </w:rPr>
         <w:t xml:space="preserve">v0.3   |   Draft for approval   |   8 September 2026   |   Integration Architecture   |   Integration Catalogue Programme</w:t>
+      </w:r>
+    </w:p>
+    <w:p>
+      <w:pPr>
+        <w:pStyle w:val="Heading1"/>
+        <w:keepNext/>
+        <w:spacing w:after="60" w:before="120"/>
+      </w:pPr>
+      <w:r>
+        <w:t xml:space="preserve">0. Executive view</w:t>
+      </w:r>
+    </w:p>
+    <w:p>
+      <w:pPr>
+        <w:spacing w:after="100"/>
+      </w:pPr>
+      <w:r>
+        <w:rPr>
+          <w:sz w:val="19"/>
+          <w:szCs w:val="19"/>
+        </w:rPr>
+        <w:t xml:space="preserve">Ten working days to answer one question: can Boomi MFT carry a real file transfer across both trust boundaries as configuration rather than as new code? Two of those days are build. The rest is discovery, proving and handover.</w:t>
+      </w:r>
+    </w:p>
+    <w:tbl>
+      <w:tblPr>
+        <w:tblW w:type="dxa" w:w="10306"/>
+        <w:tblBorders>
+          <w:top w:val="single" w:color="auto" w:sz="4"/>
+          <w:left w:val="single" w:color="auto" w:sz="4"/>
+          <w:bottom w:val="single" w:color="auto" w:sz="4"/>
+          <w:right w:val="single" w:color="auto" w:sz="4"/>
+          <w:insideH w:val="single" w:color="auto" w:sz="4"/>
+          <w:insideV w:val="single" w:color="auto" w:sz="4"/>
+        </w:tblBorders>
+      </w:tblPr>
+      <w:tblGrid>
+        <w:gridCol w:w="2473"/>
+        <w:gridCol w:w="7833"/>
+      </w:tblGrid>
+      <w:tr>
+        <w:trPr>
+          <w:tblHeader/>
+        </w:trPr>
+        <w:tc>
+          <w:tcPr>
+            <w:tcW w:type="dxa" w:w="2473"/>
+            <w:tcBorders>
+              <w:top w:val="single" w:color="B1B4B6" w:sz="4"/>
+              <w:left w:val="single" w:color="B1B4B6" w:sz="4"/>
+              <w:bottom w:val="single" w:color="B1B4B6" w:sz="4"/>
+              <w:right w:val="single" w:color="B1B4B6" w:sz="4"/>
+            </w:tcBorders>
+            <w:shd w:fill="F3F2F1" w:color="auto" w:val="clear"/>
+            <w:tcMar>
+              <w:top w:type="dxa" w:w="40"/>
+              <w:left w:type="dxa" w:w="80"/>
+              <w:bottom w:type="dxa" w:w="40"/>
+              <w:right w:type="dxa" w:w="80"/>
+            </w:tcMar>
+          </w:tcPr>
+          <w:p>
+            <w:pPr>
+              <w:spacing w:after="0" w:line="240"/>
+            </w:pPr>
+            <w:r>
+              <w:rPr>
+                <w:b/>
+                <w:bCs/>
+                <w:sz w:val="16"/>
+                <w:szCs w:val="16"/>
+              </w:rPr>
+              <w:t xml:space="preserve">Question</w:t>
+            </w:r>
+          </w:p>
+        </w:tc>
+        <w:tc>
+          <w:tcPr>
+            <w:tcW w:type="dxa" w:w="7833"/>
+            <w:tcBorders>
+              <w:top w:val="single" w:color="B1B4B6" w:sz="4"/>
+              <w:left w:val="single" w:color="B1B4B6" w:sz="4"/>
+              <w:bottom w:val="single" w:color="B1B4B6" w:sz="4"/>
+              <w:right w:val="single" w:color="B1B4B6" w:sz="4"/>
+            </w:tcBorders>
+            <w:shd w:fill="F3F2F1" w:color="auto" w:val="clear"/>
+            <w:tcMar>
+              <w:top w:type="dxa" w:w="40"/>
+              <w:left w:type="dxa" w:w="80"/>
+              <w:bottom w:type="dxa" w:w="40"/>
+              <w:right w:type="dxa" w:w="80"/>
+            </w:tcMar>
+          </w:tcPr>
+          <w:p>
+            <w:pPr>
+              <w:spacing w:after="0" w:line="240"/>
+            </w:pPr>
+            <w:r>
+              <w:rPr>
+                <w:b/>
+                <w:bCs/>
+                <w:sz w:val="16"/>
+                <w:szCs w:val="16"/>
+              </w:rPr>
+              <w:t xml:space="preserve">Answer</w:t>
+            </w:r>
+          </w:p>
+        </w:tc>
+      </w:tr>
+      <w:tr>
+        <w:tc>
+          <w:tcPr>
+            <w:tcW w:type="dxa" w:w="2473"/>
+            <w:tcBorders>
+              <w:top w:val="single" w:color="B1B4B6" w:sz="4"/>
+              <w:left w:val="single" w:color="B1B4B6" w:sz="4"/>
+              <w:bottom w:val="single" w:color="B1B4B6" w:sz="4"/>
+              <w:right w:val="single" w:color="B1B4B6" w:sz="4"/>
+            </w:tcBorders>
+            <w:tcMar>
+              <w:top w:type="dxa" w:w="40"/>
+              <w:left w:type="dxa" w:w="80"/>
+              <w:bottom w:type="dxa" w:w="40"/>
+              <w:right w:type="dxa" w:w="80"/>
+            </w:tcMar>
+          </w:tcPr>
+          <w:p>
+            <w:pPr>
+              <w:spacing w:after="0" w:line="240"/>
+            </w:pPr>
+            <w:r>
+              <w:rPr>
+                <w:b w:val="false"/>
+                <w:bCs w:val="false"/>
+                <w:sz w:val="16"/>
+                <w:szCs w:val="16"/>
+              </w:rPr>
+              <w:t xml:space="preserve">What we are doing</w:t>
+            </w:r>
+          </w:p>
+        </w:tc>
+        <w:tc>
+          <w:tcPr>
+            <w:tcW w:type="dxa" w:w="7833"/>
+            <w:tcBorders>
+              <w:top w:val="single" w:color="B1B4B6" w:sz="4"/>
+              <w:left w:val="single" w:color="B1B4B6" w:sz="4"/>
+              <w:bottom w:val="single" w:color="B1B4B6" w:sz="4"/>
+              <w:right w:val="single" w:color="B1B4B6" w:sz="4"/>
+            </w:tcBorders>
+            <w:tcMar>
+              <w:top w:type="dxa" w:w="40"/>
+              <w:left w:type="dxa" w:w="80"/>
+              <w:bottom w:type="dxa" w:w="40"/>
+              <w:right w:type="dxa" w:w="80"/>
+            </w:tcMar>
+          </w:tcPr>
+          <w:p>
+            <w:pPr>
+              <w:spacing w:after="0" w:line="240"/>
+            </w:pPr>
+            <w:r>
+              <w:rPr>
+                <w:b w:val="false"/>
+                <w:bCs w:val="false"/>
+                <w:sz w:val="16"/>
+                <w:szCs w:val="16"/>
+              </w:rPr>
+              <w:t xml:space="preserve">Moving one live feed off its legacy transfer mechanisms onto Boomi MFT, and evidencing the result well enough for a go or no-go decision.</w:t>
+            </w:r>
+          </w:p>
+        </w:tc>
+      </w:tr>
+      <w:tr>
+        <w:tc>
+          <w:tcPr>
+            <w:tcW w:type="dxa" w:w="2473"/>
+            <w:tcBorders>
+              <w:top w:val="single" w:color="B1B4B6" w:sz="4"/>
+              <w:left w:val="single" w:color="B1B4B6" w:sz="4"/>
+              <w:bottom w:val="single" w:color="B1B4B6" w:sz="4"/>
+              <w:right w:val="single" w:color="B1B4B6" w:sz="4"/>
+            </w:tcBorders>
+            <w:tcMar>
+              <w:top w:type="dxa" w:w="40"/>
+              <w:left w:type="dxa" w:w="80"/>
+              <w:bottom w:type="dxa" w:w="40"/>
+              <w:right w:type="dxa" w:w="80"/>
+            </w:tcMar>
+          </w:tcPr>
+          <w:p>
+            <w:pPr>
+              <w:spacing w:after="0" w:line="240"/>
+            </w:pPr>
+            <w:r>
+              <w:rPr>
+                <w:b w:val="false"/>
+                <w:bCs w:val="false"/>
+                <w:sz w:val="16"/>
+                <w:szCs w:val="16"/>
+              </w:rPr>
+              <w:t xml:space="preserve">On what</w:t>
+            </w:r>
+          </w:p>
+        </w:tc>
+        <w:tc>
+          <w:tcPr>
+            <w:tcW w:type="dxa" w:w="7833"/>
+            <w:tcBorders>
+              <w:top w:val="single" w:color="B1B4B6" w:sz="4"/>
+              <w:left w:val="single" w:color="B1B4B6" w:sz="4"/>
+              <w:bottom w:val="single" w:color="B1B4B6" w:sz="4"/>
+              <w:right w:val="single" w:color="B1B4B6" w:sz="4"/>
+            </w:tcBorders>
+            <w:tcMar>
+              <w:top w:type="dxa" w:w="40"/>
+              <w:left w:type="dxa" w:w="80"/>
+              <w:bottom w:type="dxa" w:w="40"/>
+              <w:right w:type="dxa" w:w="80"/>
+            </w:tcMar>
+          </w:tcPr>
+          <w:p>
+            <w:pPr>
+              <w:spacing w:after="0" w:line="240"/>
+            </w:pPr>
+            <w:r>
+              <w:rPr>
+                <w:b w:val="false"/>
+                <w:bCs w:val="false"/>
+                <w:sz w:val="16"/>
+                <w:szCs w:val="16"/>
+              </w:rPr>
+              <w:t xml:space="preserve">Feed ADR.040, the quarterly Migrant Workers Scan. It is the only feed identified that carries both patterns in a single business flow: NPS to ADR internal, and ADR to ONS external.</w:t>
+            </w:r>
+          </w:p>
+        </w:tc>
+      </w:tr>
+      <w:tr>
+        <w:tc>
+          <w:tcPr>
+            <w:tcW w:type="dxa" w:w="2473"/>
+            <w:tcBorders>
+              <w:top w:val="single" w:color="B1B4B6" w:sz="4"/>
+              <w:left w:val="single" w:color="B1B4B6" w:sz="4"/>
+              <w:bottom w:val="single" w:color="B1B4B6" w:sz="4"/>
+              <w:right w:val="single" w:color="B1B4B6" w:sz="4"/>
+            </w:tcBorders>
+            <w:tcMar>
+              <w:top w:type="dxa" w:w="40"/>
+              <w:left w:type="dxa" w:w="80"/>
+              <w:bottom w:type="dxa" w:w="40"/>
+              <w:right w:type="dxa" w:w="80"/>
+            </w:tcMar>
+          </w:tcPr>
+          <w:p>
+            <w:pPr>
+              <w:spacing w:after="0" w:line="240"/>
+            </w:pPr>
+            <w:r>
+              <w:rPr>
+                <w:b w:val="false"/>
+                <w:bCs w:val="false"/>
+                <w:sz w:val="16"/>
+                <w:szCs w:val="16"/>
+              </w:rPr>
+              <w:t xml:space="preserve">When</w:t>
+            </w:r>
+          </w:p>
+        </w:tc>
+        <w:tc>
+          <w:tcPr>
+            <w:tcW w:type="dxa" w:w="7833"/>
+            <w:tcBorders>
+              <w:top w:val="single" w:color="B1B4B6" w:sz="4"/>
+              <w:left w:val="single" w:color="B1B4B6" w:sz="4"/>
+              <w:bottom w:val="single" w:color="B1B4B6" w:sz="4"/>
+              <w:right w:val="single" w:color="B1B4B6" w:sz="4"/>
+            </w:tcBorders>
+            <w:tcMar>
+              <w:top w:type="dxa" w:w="40"/>
+              <w:left w:type="dxa" w:w="80"/>
+              <w:bottom w:type="dxa" w:w="40"/>
+              <w:right w:type="dxa" w:w="80"/>
+            </w:tcMar>
+          </w:tcPr>
+          <w:p>
+            <w:pPr>
+              <w:spacing w:after="0" w:line="240"/>
+            </w:pPr>
+            <w:r>
+              <w:rPr>
+                <w:b w:val="false"/>
+                <w:bCs w:val="false"/>
+                <w:sz w:val="16"/>
+                <w:szCs w:val="16"/>
+              </w:rPr>
+              <w:t xml:space="preserve">Monday 28 September to Friday 9 October 2026. Configuration is two days of that.</w:t>
+            </w:r>
+          </w:p>
+        </w:tc>
+      </w:tr>
+      <w:tr>
+        <w:tc>
+          <w:tcPr>
+            <w:tcW w:type="dxa" w:w="2473"/>
+            <w:tcBorders>
+              <w:top w:val="single" w:color="B1B4B6" w:sz="4"/>
+              <w:left w:val="single" w:color="B1B4B6" w:sz="4"/>
+              <w:bottom w:val="single" w:color="B1B4B6" w:sz="4"/>
+              <w:right w:val="single" w:color="B1B4B6" w:sz="4"/>
+            </w:tcBorders>
+            <w:tcMar>
+              <w:top w:type="dxa" w:w="40"/>
+              <w:left w:type="dxa" w:w="80"/>
+              <w:bottom w:type="dxa" w:w="40"/>
+              <w:right w:type="dxa" w:w="80"/>
+            </w:tcMar>
+          </w:tcPr>
+          <w:p>
+            <w:pPr>
+              <w:spacing w:after="0" w:line="240"/>
+            </w:pPr>
+            <w:r>
+              <w:rPr>
+                <w:b w:val="false"/>
+                <w:bCs w:val="false"/>
+                <w:sz w:val="16"/>
+                <w:szCs w:val="16"/>
+              </w:rPr>
+              <w:t xml:space="preserve">What it costs</w:t>
+            </w:r>
+          </w:p>
+        </w:tc>
+        <w:tc>
+          <w:tcPr>
+            <w:tcW w:type="dxa" w:w="7833"/>
+            <w:tcBorders>
+              <w:top w:val="single" w:color="B1B4B6" w:sz="4"/>
+              <w:left w:val="single" w:color="B1B4B6" w:sz="4"/>
+              <w:bottom w:val="single" w:color="B1B4B6" w:sz="4"/>
+              <w:right w:val="single" w:color="B1B4B6" w:sz="4"/>
+            </w:tcBorders>
+            <w:tcMar>
+              <w:top w:type="dxa" w:w="40"/>
+              <w:left w:type="dxa" w:w="80"/>
+              <w:bottom w:type="dxa" w:w="40"/>
+              <w:right w:type="dxa" w:w="80"/>
+            </w:tcMar>
+          </w:tcPr>
+          <w:p>
+            <w:pPr>
+              <w:spacing w:after="0" w:line="240"/>
+            </w:pPr>
+            <w:r>
+              <w:rPr>
+                <w:b w:val="false"/>
+                <w:bCs w:val="false"/>
+                <w:sz w:val="16"/>
+                <w:szCs w:val="16"/>
+              </w:rPr>
+              <w:t xml:space="preserve">Two days of build effort plus about a week of discovery, testing and handover around it. No new components, no new interfaces to maintain.</w:t>
+            </w:r>
+          </w:p>
+        </w:tc>
+      </w:tr>
+      <w:tr>
+        <w:tc>
+          <w:tcPr>
+            <w:tcW w:type="dxa" w:w="2473"/>
+            <w:tcBorders>
+              <w:top w:val="single" w:color="B1B4B6" w:sz="4"/>
+              <w:left w:val="single" w:color="B1B4B6" w:sz="4"/>
+              <w:bottom w:val="single" w:color="B1B4B6" w:sz="4"/>
+              <w:right w:val="single" w:color="B1B4B6" w:sz="4"/>
+            </w:tcBorders>
+            <w:tcMar>
+              <w:top w:type="dxa" w:w="40"/>
+              <w:left w:type="dxa" w:w="80"/>
+              <w:bottom w:type="dxa" w:w="40"/>
+              <w:right w:type="dxa" w:w="80"/>
+            </w:tcMar>
+          </w:tcPr>
+          <w:p>
+            <w:pPr>
+              <w:spacing w:after="0" w:line="240"/>
+            </w:pPr>
+            <w:r>
+              <w:rPr>
+                <w:b w:val="false"/>
+                <w:bCs w:val="false"/>
+                <w:sz w:val="16"/>
+                <w:szCs w:val="16"/>
+              </w:rPr>
+              <w:t xml:space="preserve">What we need before it starts</w:t>
+            </w:r>
+          </w:p>
+        </w:tc>
+        <w:tc>
+          <w:tcPr>
+            <w:tcW w:type="dxa" w:w="7833"/>
+            <w:tcBorders>
+              <w:top w:val="single" w:color="B1B4B6" w:sz="4"/>
+              <w:left w:val="single" w:color="B1B4B6" w:sz="4"/>
+              <w:bottom w:val="single" w:color="B1B4B6" w:sz="4"/>
+              <w:right w:val="single" w:color="B1B4B6" w:sz="4"/>
+            </w:tcBorders>
+            <w:tcMar>
+              <w:top w:type="dxa" w:w="40"/>
+              <w:left w:type="dxa" w:w="80"/>
+              <w:bottom w:type="dxa" w:w="40"/>
+              <w:right w:type="dxa" w:w="80"/>
+            </w:tcMar>
+          </w:tcPr>
+          <w:p>
+            <w:pPr>
+              <w:spacing w:after="0" w:line="240"/>
+            </w:pPr>
+            <w:r>
+              <w:rPr>
+                <w:b w:val="false"/>
+                <w:bCs w:val="false"/>
+                <w:sz w:val="16"/>
+                <w:szCs w:val="16"/>
+              </w:rPr>
+              <w:t xml:space="preserve">Three things, all before 28 September: the endpoint details in section 3, the firewall and allow-list changes raised, and agreement from ONS to receive from a new sending endpoint.</w:t>
+            </w:r>
+          </w:p>
+        </w:tc>
+      </w:tr>
+      <w:tr>
+        <w:tc>
+          <w:tcPr>
+            <w:tcW w:type="dxa" w:w="2473"/>
+            <w:tcBorders>
+              <w:top w:val="single" w:color="B1B4B6" w:sz="4"/>
+              <w:left w:val="single" w:color="B1B4B6" w:sz="4"/>
+              <w:bottom w:val="single" w:color="B1B4B6" w:sz="4"/>
+              <w:right w:val="single" w:color="B1B4B6" w:sz="4"/>
+            </w:tcBorders>
+            <w:tcMar>
+              <w:top w:type="dxa" w:w="40"/>
+              <w:left w:type="dxa" w:w="80"/>
+              <w:bottom w:type="dxa" w:w="40"/>
+              <w:right w:type="dxa" w:w="80"/>
+            </w:tcMar>
+          </w:tcPr>
+          <w:p>
+            <w:pPr>
+              <w:spacing w:after="0" w:line="240"/>
+            </w:pPr>
+            <w:r>
+              <w:rPr>
+                <w:b w:val="false"/>
+                <w:bCs w:val="false"/>
+                <w:sz w:val="16"/>
+                <w:szCs w:val="16"/>
+              </w:rPr>
+              <w:t xml:space="preserve">What good looks like</w:t>
+            </w:r>
+          </w:p>
+        </w:tc>
+        <w:tc>
+          <w:tcPr>
+            <w:tcW w:type="dxa" w:w="7833"/>
+            <w:tcBorders>
+              <w:top w:val="single" w:color="B1B4B6" w:sz="4"/>
+              <w:left w:val="single" w:color="B1B4B6" w:sz="4"/>
+              <w:bottom w:val="single" w:color="B1B4B6" w:sz="4"/>
+              <w:right w:val="single" w:color="B1B4B6" w:sz="4"/>
+            </w:tcBorders>
+            <w:tcMar>
+              <w:top w:type="dxa" w:w="40"/>
+              <w:left w:type="dxa" w:w="80"/>
+              <w:bottom w:type="dxa" w:w="40"/>
+              <w:right w:type="dxa" w:w="80"/>
+            </w:tcMar>
+          </w:tcPr>
+          <w:p>
+            <w:pPr>
+              <w:spacing w:after="0" w:line="240"/>
+            </w:pPr>
+            <w:r>
+              <w:rPr>
+                <w:b w:val="false"/>
+                <w:bCs w:val="false"/>
+                <w:sz w:val="16"/>
+                <w:szCs w:val="16"/>
+              </w:rPr>
+              <w:t xml:space="preserve">Both legs running as configuration rows on one generic engine, zero bespoke components, and Service Operations signing the handover.</w:t>
+            </w:r>
+          </w:p>
+        </w:tc>
+      </w:tr>
+      <w:tr>
+        <w:tc>
+          <w:tcPr>
+            <w:tcW w:type="dxa" w:w="2473"/>
+            <w:tcBorders>
+              <w:top w:val="single" w:color="B1B4B6" w:sz="4"/>
+              <w:left w:val="single" w:color="B1B4B6" w:sz="4"/>
+              <w:bottom w:val="single" w:color="B1B4B6" w:sz="4"/>
+              <w:right w:val="single" w:color="B1B4B6" w:sz="4"/>
+            </w:tcBorders>
+            <w:tcMar>
+              <w:top w:type="dxa" w:w="40"/>
+              <w:left w:type="dxa" w:w="80"/>
+              <w:bottom w:type="dxa" w:w="40"/>
+              <w:right w:type="dxa" w:w="80"/>
+            </w:tcMar>
+          </w:tcPr>
+          <w:p>
+            <w:pPr>
+              <w:spacing w:after="0" w:line="240"/>
+            </w:pPr>
+            <w:r>
+              <w:rPr>
+                <w:b w:val="false"/>
+                <w:bCs w:val="false"/>
+                <w:sz w:val="16"/>
+                <w:szCs w:val="16"/>
+              </w:rPr>
+              <w:t xml:space="preserve">Why it matters beyond this feed</w:t>
+            </w:r>
+          </w:p>
+        </w:tc>
+        <w:tc>
+          <w:tcPr>
+            <w:tcW w:type="dxa" w:w="7833"/>
+            <w:tcBorders>
+              <w:top w:val="single" w:color="B1B4B6" w:sz="4"/>
+              <w:left w:val="single" w:color="B1B4B6" w:sz="4"/>
+              <w:bottom w:val="single" w:color="B1B4B6" w:sz="4"/>
+              <w:right w:val="single" w:color="B1B4B6" w:sz="4"/>
+            </w:tcBorders>
+            <w:tcMar>
+              <w:top w:type="dxa" w:w="40"/>
+              <w:left w:type="dxa" w:w="80"/>
+              <w:bottom w:type="dxa" w:w="40"/>
+              <w:right w:type="dxa" w:w="80"/>
+            </w:tcMar>
+          </w:tcPr>
+          <w:p>
+            <w:pPr>
+              <w:spacing w:after="0" w:line="240"/>
+            </w:pPr>
+            <w:r>
+              <w:rPr>
+                <w:b w:val="false"/>
+                <w:bCs w:val="false"/>
+                <w:sz w:val="16"/>
+                <w:szCs w:val="16"/>
+              </w:rPr>
+              <w:t xml:space="preserve">If two similar transfers can both be delivered as configuration, onboarding the rest of the estate is configuration work rather than development work. That is the assumption the wider business case rests on, and it has not been tested.</w:t>
+            </w:r>
+          </w:p>
+        </w:tc>
+      </w:tr>
+      <w:tr>
+        <w:tc>
+          <w:tcPr>
+            <w:tcW w:type="dxa" w:w="2473"/>
+            <w:tcBorders>
+              <w:top w:val="single" w:color="B1B4B6" w:sz="4"/>
+              <w:left w:val="single" w:color="B1B4B6" w:sz="4"/>
+              <w:bottom w:val="single" w:color="B1B4B6" w:sz="4"/>
+              <w:right w:val="single" w:color="B1B4B6" w:sz="4"/>
+            </w:tcBorders>
+            <w:tcMar>
+              <w:top w:type="dxa" w:w="40"/>
+              <w:left w:type="dxa" w:w="80"/>
+              <w:bottom w:type="dxa" w:w="40"/>
+              <w:right w:type="dxa" w:w="80"/>
+            </w:tcMar>
+          </w:tcPr>
+          <w:p>
+            <w:pPr>
+              <w:spacing w:after="0" w:line="240"/>
+            </w:pPr>
+            <w:r>
+              <w:rPr>
+                <w:b w:val="false"/>
+                <w:bCs w:val="false"/>
+                <w:sz w:val="16"/>
+                <w:szCs w:val="16"/>
+              </w:rPr>
+              <w:t xml:space="preserve">What could stop it</w:t>
+            </w:r>
+          </w:p>
+        </w:tc>
+        <w:tc>
+          <w:tcPr>
+            <w:tcW w:type="dxa" w:w="7833"/>
+            <w:tcBorders>
+              <w:top w:val="single" w:color="B1B4B6" w:sz="4"/>
+              <w:left w:val="single" w:color="B1B4B6" w:sz="4"/>
+              <w:bottom w:val="single" w:color="B1B4B6" w:sz="4"/>
+              <w:right w:val="single" w:color="B1B4B6" w:sz="4"/>
+            </w:tcBorders>
+            <w:tcMar>
+              <w:top w:type="dxa" w:w="40"/>
+              <w:left w:type="dxa" w:w="80"/>
+              <w:bottom w:type="dxa" w:w="40"/>
+              <w:right w:type="dxa" w:w="80"/>
+            </w:tcMar>
+          </w:tcPr>
+          <w:p>
+            <w:pPr>
+              <w:spacing w:after="0" w:line="240"/>
+            </w:pPr>
+            <w:r>
+              <w:rPr>
+                <w:b w:val="false"/>
+                <w:bCs w:val="false"/>
+                <w:sz w:val="16"/>
+                <w:szCs w:val="16"/>
+              </w:rPr>
+              <w:t xml:space="preserve">Firewall lead time and the ONS agreement. Neither compresses by working harder. If ONS is not ready in time, leg A still delivers inside the window and leg B follows within days of the external path opening.</w:t>
+            </w:r>
+          </w:p>
+        </w:tc>
+      </w:tr>
+      <w:tr>
+        <w:tc>
+          <w:tcPr>
+            <w:tcW w:type="dxa" w:w="2473"/>
+            <w:tcBorders>
+              <w:top w:val="single" w:color="B1B4B6" w:sz="4"/>
+              <w:left w:val="single" w:color="B1B4B6" w:sz="4"/>
+              <w:bottom w:val="single" w:color="B1B4B6" w:sz="4"/>
+              <w:right w:val="single" w:color="B1B4B6" w:sz="4"/>
+            </w:tcBorders>
+            <w:tcMar>
+              <w:top w:type="dxa" w:w="40"/>
+              <w:left w:type="dxa" w:w="80"/>
+              <w:bottom w:type="dxa" w:w="40"/>
+              <w:right w:type="dxa" w:w="80"/>
+            </w:tcMar>
+          </w:tcPr>
+          <w:p>
+            <w:pPr>
+              <w:spacing w:after="0" w:line="240"/>
+            </w:pPr>
+            <w:r>
+              <w:rPr>
+                <w:b w:val="false"/>
+                <w:bCs w:val="false"/>
+                <w:sz w:val="16"/>
+                <w:szCs w:val="16"/>
+              </w:rPr>
+              <w:t xml:space="preserve">On the Data Lake migration</w:t>
+            </w:r>
+          </w:p>
+        </w:tc>
+        <w:tc>
+          <w:tcPr>
+            <w:tcW w:type="dxa" w:w="7833"/>
+            <w:tcBorders>
+              <w:top w:val="single" w:color="B1B4B6" w:sz="4"/>
+              <w:left w:val="single" w:color="B1B4B6" w:sz="4"/>
+              <w:bottom w:val="single" w:color="B1B4B6" w:sz="4"/>
+              <w:right w:val="single" w:color="B1B4B6" w:sz="4"/>
+            </w:tcBorders>
+            <w:tcMar>
+              <w:top w:type="dxa" w:w="40"/>
+              <w:left w:type="dxa" w:w="80"/>
+              <w:bottom w:type="dxa" w:w="40"/>
+              <w:right w:type="dxa" w:w="80"/>
+            </w:tcMar>
+          </w:tcPr>
+          <w:p>
+            <w:pPr>
+              <w:spacing w:after="0" w:line="240"/>
+            </w:pPr>
+            <w:r>
+              <w:rPr>
+                <w:b w:val="false"/>
+                <w:bCs w:val="false"/>
+                <w:sz w:val="16"/>
+                <w:szCs w:val="16"/>
+              </w:rPr>
+              <w:t xml:space="preserve">Build now against the current ADR endpoints and re-point to the Data Lake as a configuration change when the warehouse migrates. Option 1 in section 5. Waiting hands our start date to another programme.</w:t>
+            </w:r>
+          </w:p>
+        </w:tc>
+      </w:tr>
+      <w:tr>
+        <w:tc>
+          <w:tcPr>
+            <w:tcW w:type="dxa" w:w="2473"/>
+            <w:tcBorders>
+              <w:top w:val="single" w:color="B1B4B6" w:sz="4"/>
+              <w:left w:val="single" w:color="B1B4B6" w:sz="4"/>
+              <w:bottom w:val="single" w:color="B1B4B6" w:sz="4"/>
+              <w:right w:val="single" w:color="B1B4B6" w:sz="4"/>
+            </w:tcBorders>
+            <w:tcMar>
+              <w:top w:type="dxa" w:w="40"/>
+              <w:left w:type="dxa" w:w="80"/>
+              <w:bottom w:type="dxa" w:w="40"/>
+              <w:right w:type="dxa" w:w="80"/>
+            </w:tcMar>
+          </w:tcPr>
+          <w:p>
+            <w:pPr>
+              <w:spacing w:after="0" w:line="240"/>
+            </w:pPr>
+            <w:r>
+              <w:rPr>
+                <w:b w:val="false"/>
+                <w:bCs w:val="false"/>
+                <w:sz w:val="16"/>
+                <w:szCs w:val="16"/>
+              </w:rPr>
+              <w:t xml:space="preserve">Decision requested</w:t>
+            </w:r>
+          </w:p>
+        </w:tc>
+        <w:tc>
+          <w:tcPr>
+            <w:tcW w:type="dxa" w:w="7833"/>
+            <w:tcBorders>
+              <w:top w:val="single" w:color="B1B4B6" w:sz="4"/>
+              <w:left w:val="single" w:color="B1B4B6" w:sz="4"/>
+              <w:bottom w:val="single" w:color="B1B4B6" w:sz="4"/>
+              <w:right w:val="single" w:color="B1B4B6" w:sz="4"/>
+            </w:tcBorders>
+            <w:tcMar>
+              <w:top w:type="dxa" w:w="40"/>
+              <w:left w:type="dxa" w:w="80"/>
+              <w:bottom w:type="dxa" w:w="40"/>
+              <w:right w:type="dxa" w:w="80"/>
+            </w:tcMar>
+          </w:tcPr>
+          <w:p>
+            <w:pPr>
+              <w:spacing w:after="0" w:line="240"/>
+            </w:pPr>
+            <w:r>
+              <w:rPr>
+                <w:b w:val="false"/>
+                <w:bCs w:val="false"/>
+                <w:sz w:val="16"/>
+                <w:szCs w:val="16"/>
+              </w:rPr>
+              <w:t xml:space="preserve">Approve the window, name owners on the three critical dependencies, and agree option 1.</w:t>
+            </w:r>
+          </w:p>
+        </w:tc>
+      </w:tr>
+    </w:tbl>
+    <w:p>
+      <w:pPr>
+        <w:spacing w:after="40"/>
+      </w:pPr>
+    </w:p>
+    <w:p>
+      <w:pPr>
+        <w:pBdr>
+          <w:left w:val="single" w:color="1D70B8" w:sz="14"/>
+        </w:pBdr>
+        <w:shd w:fill="F0F6FB" w:color="auto" w:val="clear"/>
+        <w:spacing w:after="140" w:before="100"/>
+        <w:ind w:left="150"/>
+      </w:pPr>
+      <w:r>
+        <w:rPr>
+          <w:i/>
+          <w:iCs/>
+          <w:sz w:val="19"/>
+          <w:szCs w:val="19"/>
+        </w:rPr>
+        <w:t xml:space="preserve">The short version: two days of build, eight days of everything else, and the only real risk is connectivity lead time that has not been started yet. Start it this week and the window holds.</w:t>
       </w:r>
     </w:p>
     <w:p>

</xml_diff>

<commit_message>
Rewrite section 0 as a narrative executive summary with at-a-glance, outcomes and three dated decisions
</commit_message>
<xml_diff>
--- a/assets/mft-mvp-plan.docx
+++ b/assets/mft-mvp-plan.docx
@@ -81,7 +81,7 @@
         <w:spacing w:after="60" w:before="120"/>
       </w:pPr>
       <w:r>
-        <w:t xml:space="preserve">0. Executive view</w:t>
+        <w:t xml:space="preserve">0. Executive summary</w:t>
       </w:r>
     </w:p>
     <w:p>
@@ -93,7 +93,40 @@
           <w:sz w:val="19"/>
           <w:szCs w:val="19"/>
         </w:rPr>
-        <w:t xml:space="preserve">Ten working days to answer one question: can Boomi MFT carry a real file transfer across both trust boundaries as configuration rather than as new code? Two of those days are build. The rest is discovery, proving and handover.</w:t>
+        <w:t xml:space="preserve">One feed, two boundaries, ten working days. We move feed ADR.040, the quarterly Migrant Workers Scan, off its legacy transfer mechanisms and onto Boomi MFT. Leg A replaces UTM inside the estate. Leg B goes direct to ONS and removes a server the current path itself labels insecure. Configuration is two days; the other eight are discovery, proving and handover.</w:t>
+      </w:r>
+    </w:p>
+    <w:p>
+      <w:pPr>
+        <w:spacing w:after="100"/>
+      </w:pPr>
+      <w:r>
+        <w:rPr>
+          <w:sz w:val="19"/>
+          <w:szCs w:val="19"/>
+        </w:rPr>
+        <w:t xml:space="preserve">The reason to do this now is not the feed. The wider onboarding plan assumes that adding an interface to Boomi MFT is configuration work rather than development work, and nothing has tested that assumption. ADR.040 tests it twice, once inside the estate and once across a departmental boundary, on one dataset and one owner community, for two days of build effort. If it holds we can price the rest of the estate with confidence. If it does not, we find out now rather than after committing a programme to it.</w:t>
+      </w:r>
+    </w:p>
+    <w:p>
+      <w:pPr>
+        <w:spacing w:after="100"/>
+      </w:pPr>
+      <w:r>
+        <w:rPr>
+          <w:sz w:val="19"/>
+          <w:szCs w:val="19"/>
+        </w:rPr>
+        <w:t xml:space="preserve">The risk is not technical. Firewall changes and the agreement from ONS to receive from a new sending endpoint have lead times that do not compress, and neither has been started. Raise both this week and the window holds. If ONS is not ready in time, leg A still delivers inside the window and leg B follows within days of the external path opening.</w:t>
+      </w:r>
+    </w:p>
+    <w:p>
+      <w:pPr>
+        <w:pStyle w:val="Heading2"/>
+        <w:spacing w:after="60" w:before="140"/>
+      </w:pPr>
+      <w:r>
+        <w:t xml:space="preserve">At a glance</w:t>
       </w:r>
     </w:p>
     <w:tbl>
@@ -109,8 +142,582 @@
         </w:tblBorders>
       </w:tblPr>
       <w:tblGrid>
-        <w:gridCol w:w="2473"/>
-        <w:gridCol w:w="7833"/>
+        <w:gridCol w:w="2680"/>
+        <w:gridCol w:w="7626"/>
+      </w:tblGrid>
+      <w:tr>
+        <w:tc>
+          <w:tcPr>
+            <w:tcW w:type="dxa" w:w="2680"/>
+            <w:tcBorders>
+              <w:top w:val="single" w:color="B1B4B6" w:sz="4"/>
+              <w:left w:val="single" w:color="B1B4B6" w:sz="4"/>
+              <w:bottom w:val="single" w:color="B1B4B6" w:sz="4"/>
+              <w:right w:val="single" w:color="B1B4B6" w:sz="4"/>
+            </w:tcBorders>
+            <w:tcMar>
+              <w:top w:type="dxa" w:w="40"/>
+              <w:left w:type="dxa" w:w="80"/>
+              <w:bottom w:type="dxa" w:w="40"/>
+              <w:right w:type="dxa" w:w="80"/>
+            </w:tcMar>
+          </w:tcPr>
+          <w:p>
+            <w:pPr>
+              <w:spacing w:after="0" w:line="240"/>
+            </w:pPr>
+            <w:r>
+              <w:rPr>
+                <w:b w:val="false"/>
+                <w:bCs w:val="false"/>
+                <w:sz w:val="16"/>
+                <w:szCs w:val="16"/>
+              </w:rPr>
+              <w:t xml:space="preserve">Candidate</w:t>
+            </w:r>
+          </w:p>
+        </w:tc>
+        <w:tc>
+          <w:tcPr>
+            <w:tcW w:type="dxa" w:w="7626"/>
+            <w:tcBorders>
+              <w:top w:val="single" w:color="B1B4B6" w:sz="4"/>
+              <w:left w:val="single" w:color="B1B4B6" w:sz="4"/>
+              <w:bottom w:val="single" w:color="B1B4B6" w:sz="4"/>
+              <w:right w:val="single" w:color="B1B4B6" w:sz="4"/>
+            </w:tcBorders>
+            <w:tcMar>
+              <w:top w:type="dxa" w:w="40"/>
+              <w:left w:type="dxa" w:w="80"/>
+              <w:bottom w:type="dxa" w:w="40"/>
+              <w:right w:type="dxa" w:w="80"/>
+            </w:tcMar>
+          </w:tcPr>
+          <w:p>
+            <w:pPr>
+              <w:spacing w:after="0" w:line="240"/>
+            </w:pPr>
+            <w:r>
+              <w:rPr>
+                <w:b w:val="false"/>
+                <w:bCs w:val="false"/>
+                <w:sz w:val="16"/>
+                <w:szCs w:val="16"/>
+              </w:rPr>
+              <w:t xml:space="preserve">ADR.040 Migrant Workers Scan. Quarterly, one file per cycle, live in production today</w:t>
+            </w:r>
+          </w:p>
+        </w:tc>
+      </w:tr>
+      <w:tr>
+        <w:tc>
+          <w:tcPr>
+            <w:tcW w:type="dxa" w:w="2680"/>
+            <w:tcBorders>
+              <w:top w:val="single" w:color="B1B4B6" w:sz="4"/>
+              <w:left w:val="single" w:color="B1B4B6" w:sz="4"/>
+              <w:bottom w:val="single" w:color="B1B4B6" w:sz="4"/>
+              <w:right w:val="single" w:color="B1B4B6" w:sz="4"/>
+            </w:tcBorders>
+            <w:tcMar>
+              <w:top w:type="dxa" w:w="40"/>
+              <w:left w:type="dxa" w:w="80"/>
+              <w:bottom w:type="dxa" w:w="40"/>
+              <w:right w:type="dxa" w:w="80"/>
+            </w:tcMar>
+          </w:tcPr>
+          <w:p>
+            <w:pPr>
+              <w:spacing w:after="0" w:line="240"/>
+            </w:pPr>
+            <w:r>
+              <w:rPr>
+                <w:b w:val="false"/>
+                <w:bCs w:val="false"/>
+                <w:sz w:val="16"/>
+                <w:szCs w:val="16"/>
+              </w:rPr>
+              <w:t xml:space="preserve">Scope</w:t>
+            </w:r>
+          </w:p>
+        </w:tc>
+        <w:tc>
+          <w:tcPr>
+            <w:tcW w:type="dxa" w:w="7626"/>
+            <w:tcBorders>
+              <w:top w:val="single" w:color="B1B4B6" w:sz="4"/>
+              <w:left w:val="single" w:color="B1B4B6" w:sz="4"/>
+              <w:bottom w:val="single" w:color="B1B4B6" w:sz="4"/>
+              <w:right w:val="single" w:color="B1B4B6" w:sz="4"/>
+            </w:tcBorders>
+            <w:tcMar>
+              <w:top w:type="dxa" w:w="40"/>
+              <w:left w:type="dxa" w:w="80"/>
+              <w:bottom w:type="dxa" w:w="40"/>
+              <w:right w:type="dxa" w:w="80"/>
+            </w:tcMar>
+          </w:tcPr>
+          <w:p>
+            <w:pPr>
+              <w:spacing w:after="0" w:line="240"/>
+            </w:pPr>
+            <w:r>
+              <w:rPr>
+                <w:b w:val="false"/>
+                <w:bCs w:val="false"/>
+                <w:sz w:val="16"/>
+                <w:szCs w:val="16"/>
+              </w:rPr>
+              <w:t xml:space="preserve">Two legs. NPS to the ADR landing area, internal. ADR output area to ONS, external</w:t>
+            </w:r>
+          </w:p>
+        </w:tc>
+      </w:tr>
+      <w:tr>
+        <w:tc>
+          <w:tcPr>
+            <w:tcW w:type="dxa" w:w="2680"/>
+            <w:tcBorders>
+              <w:top w:val="single" w:color="B1B4B6" w:sz="4"/>
+              <w:left w:val="single" w:color="B1B4B6" w:sz="4"/>
+              <w:bottom w:val="single" w:color="B1B4B6" w:sz="4"/>
+              <w:right w:val="single" w:color="B1B4B6" w:sz="4"/>
+            </w:tcBorders>
+            <w:tcMar>
+              <w:top w:type="dxa" w:w="40"/>
+              <w:left w:type="dxa" w:w="80"/>
+              <w:bottom w:type="dxa" w:w="40"/>
+              <w:right w:type="dxa" w:w="80"/>
+            </w:tcMar>
+          </w:tcPr>
+          <w:p>
+            <w:pPr>
+              <w:spacing w:after="0" w:line="240"/>
+            </w:pPr>
+            <w:r>
+              <w:rPr>
+                <w:b w:val="false"/>
+                <w:bCs w:val="false"/>
+                <w:sz w:val="16"/>
+                <w:szCs w:val="16"/>
+              </w:rPr>
+              <w:t xml:space="preserve">Window</w:t>
+            </w:r>
+          </w:p>
+        </w:tc>
+        <w:tc>
+          <w:tcPr>
+            <w:tcW w:type="dxa" w:w="7626"/>
+            <w:tcBorders>
+              <w:top w:val="single" w:color="B1B4B6" w:sz="4"/>
+              <w:left w:val="single" w:color="B1B4B6" w:sz="4"/>
+              <w:bottom w:val="single" w:color="B1B4B6" w:sz="4"/>
+              <w:right w:val="single" w:color="B1B4B6" w:sz="4"/>
+            </w:tcBorders>
+            <w:tcMar>
+              <w:top w:type="dxa" w:w="40"/>
+              <w:left w:type="dxa" w:w="80"/>
+              <w:bottom w:type="dxa" w:w="40"/>
+              <w:right w:type="dxa" w:w="80"/>
+            </w:tcMar>
+          </w:tcPr>
+          <w:p>
+            <w:pPr>
+              <w:spacing w:after="0" w:line="240"/>
+            </w:pPr>
+            <w:r>
+              <w:rPr>
+                <w:b w:val="false"/>
+                <w:bCs w:val="false"/>
+                <w:sz w:val="16"/>
+                <w:szCs w:val="16"/>
+              </w:rPr>
+              <w:t xml:space="preserve">Monday 28 September to Friday 9 October 2026, ten working days</w:t>
+            </w:r>
+          </w:p>
+        </w:tc>
+      </w:tr>
+      <w:tr>
+        <w:tc>
+          <w:tcPr>
+            <w:tcW w:type="dxa" w:w="2680"/>
+            <w:tcBorders>
+              <w:top w:val="single" w:color="B1B4B6" w:sz="4"/>
+              <w:left w:val="single" w:color="B1B4B6" w:sz="4"/>
+              <w:bottom w:val="single" w:color="B1B4B6" w:sz="4"/>
+              <w:right w:val="single" w:color="B1B4B6" w:sz="4"/>
+            </w:tcBorders>
+            <w:tcMar>
+              <w:top w:type="dxa" w:w="40"/>
+              <w:left w:type="dxa" w:w="80"/>
+              <w:bottom w:type="dxa" w:w="40"/>
+              <w:right w:type="dxa" w:w="80"/>
+            </w:tcMar>
+          </w:tcPr>
+          <w:p>
+            <w:pPr>
+              <w:spacing w:after="0" w:line="240"/>
+            </w:pPr>
+            <w:r>
+              <w:rPr>
+                <w:b w:val="false"/>
+                <w:bCs w:val="false"/>
+                <w:sz w:val="16"/>
+                <w:szCs w:val="16"/>
+              </w:rPr>
+              <w:t xml:space="preserve">Build effort</w:t>
+            </w:r>
+          </w:p>
+        </w:tc>
+        <w:tc>
+          <w:tcPr>
+            <w:tcW w:type="dxa" w:w="7626"/>
+            <w:tcBorders>
+              <w:top w:val="single" w:color="B1B4B6" w:sz="4"/>
+              <w:left w:val="single" w:color="B1B4B6" w:sz="4"/>
+              <w:bottom w:val="single" w:color="B1B4B6" w:sz="4"/>
+              <w:right w:val="single" w:color="B1B4B6" w:sz="4"/>
+            </w:tcBorders>
+            <w:tcMar>
+              <w:top w:type="dxa" w:w="40"/>
+              <w:left w:type="dxa" w:w="80"/>
+              <w:bottom w:type="dxa" w:w="40"/>
+              <w:right w:type="dxa" w:w="80"/>
+            </w:tcMar>
+          </w:tcPr>
+          <w:p>
+            <w:pPr>
+              <w:spacing w:after="0" w:line="240"/>
+            </w:pPr>
+            <w:r>
+              <w:rPr>
+                <w:b w:val="false"/>
+                <w:bCs w:val="false"/>
+                <w:sz w:val="16"/>
+                <w:szCs w:val="16"/>
+              </w:rPr>
+              <w:t xml:space="preserve">Two days. Everything else is discovery, testing and handover</w:t>
+            </w:r>
+          </w:p>
+        </w:tc>
+      </w:tr>
+      <w:tr>
+        <w:tc>
+          <w:tcPr>
+            <w:tcW w:type="dxa" w:w="2680"/>
+            <w:tcBorders>
+              <w:top w:val="single" w:color="B1B4B6" w:sz="4"/>
+              <w:left w:val="single" w:color="B1B4B6" w:sz="4"/>
+              <w:bottom w:val="single" w:color="B1B4B6" w:sz="4"/>
+              <w:right w:val="single" w:color="B1B4B6" w:sz="4"/>
+            </w:tcBorders>
+            <w:tcMar>
+              <w:top w:type="dxa" w:w="40"/>
+              <w:left w:type="dxa" w:w="80"/>
+              <w:bottom w:type="dxa" w:w="40"/>
+              <w:right w:type="dxa" w:w="80"/>
+            </w:tcMar>
+          </w:tcPr>
+          <w:p>
+            <w:pPr>
+              <w:spacing w:after="0" w:line="240"/>
+            </w:pPr>
+            <w:r>
+              <w:rPr>
+                <w:b w:val="false"/>
+                <w:bCs w:val="false"/>
+                <w:sz w:val="16"/>
+                <w:szCs w:val="16"/>
+              </w:rPr>
+              <w:t xml:space="preserve">New components</w:t>
+            </w:r>
+          </w:p>
+        </w:tc>
+        <w:tc>
+          <w:tcPr>
+            <w:tcW w:type="dxa" w:w="7626"/>
+            <w:tcBorders>
+              <w:top w:val="single" w:color="B1B4B6" w:sz="4"/>
+              <w:left w:val="single" w:color="B1B4B6" w:sz="4"/>
+              <w:bottom w:val="single" w:color="B1B4B6" w:sz="4"/>
+              <w:right w:val="single" w:color="B1B4B6" w:sz="4"/>
+            </w:tcBorders>
+            <w:tcMar>
+              <w:top w:type="dxa" w:w="40"/>
+              <w:left w:type="dxa" w:w="80"/>
+              <w:bottom w:type="dxa" w:w="40"/>
+              <w:right w:type="dxa" w:w="80"/>
+            </w:tcMar>
+          </w:tcPr>
+          <w:p>
+            <w:pPr>
+              <w:spacing w:after="0" w:line="240"/>
+            </w:pPr>
+            <w:r>
+              <w:rPr>
+                <w:b w:val="false"/>
+                <w:bCs w:val="false"/>
+                <w:sz w:val="16"/>
+                <w:szCs w:val="16"/>
+              </w:rPr>
+              <w:t xml:space="preserve">None. Two configuration rows on the existing generic engine</w:t>
+            </w:r>
+          </w:p>
+        </w:tc>
+      </w:tr>
+      <w:tr>
+        <w:tc>
+          <w:tcPr>
+            <w:tcW w:type="dxa" w:w="2680"/>
+            <w:tcBorders>
+              <w:top w:val="single" w:color="B1B4B6" w:sz="4"/>
+              <w:left w:val="single" w:color="B1B4B6" w:sz="4"/>
+              <w:bottom w:val="single" w:color="B1B4B6" w:sz="4"/>
+              <w:right w:val="single" w:color="B1B4B6" w:sz="4"/>
+            </w:tcBorders>
+            <w:tcMar>
+              <w:top w:type="dxa" w:w="40"/>
+              <w:left w:type="dxa" w:w="80"/>
+              <w:bottom w:type="dxa" w:w="40"/>
+              <w:right w:type="dxa" w:w="80"/>
+            </w:tcMar>
+          </w:tcPr>
+          <w:p>
+            <w:pPr>
+              <w:spacing w:after="0" w:line="240"/>
+            </w:pPr>
+            <w:r>
+              <w:rPr>
+                <w:b w:val="false"/>
+                <w:bCs w:val="false"/>
+                <w:sz w:val="16"/>
+                <w:szCs w:val="16"/>
+              </w:rPr>
+              <w:t xml:space="preserve">Side benefit</w:t>
+            </w:r>
+          </w:p>
+        </w:tc>
+        <w:tc>
+          <w:tcPr>
+            <w:tcW w:type="dxa" w:w="7626"/>
+            <w:tcBorders>
+              <w:top w:val="single" w:color="B1B4B6" w:sz="4"/>
+              <w:left w:val="single" w:color="B1B4B6" w:sz="4"/>
+              <w:bottom w:val="single" w:color="B1B4B6" w:sz="4"/>
+              <w:right w:val="single" w:color="B1B4B6" w:sz="4"/>
+            </w:tcBorders>
+            <w:tcMar>
+              <w:top w:type="dxa" w:w="40"/>
+              <w:left w:type="dxa" w:w="80"/>
+              <w:bottom w:type="dxa" w:w="40"/>
+              <w:right w:type="dxa" w:w="80"/>
+            </w:tcMar>
+          </w:tcPr>
+          <w:p>
+            <w:pPr>
+              <w:spacing w:after="0" w:line="240"/>
+            </w:pPr>
+            <w:r>
+              <w:rPr>
+                <w:b w:val="false"/>
+                <w:bCs w:val="false"/>
+                <w:sz w:val="16"/>
+                <w:szCs w:val="16"/>
+              </w:rPr>
+              <w:t xml:space="preserve">Removes the Insecure IF server hop from the outbound path, regardless of the platform decision</w:t>
+            </w:r>
+          </w:p>
+        </w:tc>
+      </w:tr>
+      <w:tr>
+        <w:tc>
+          <w:tcPr>
+            <w:tcW w:type="dxa" w:w="2680"/>
+            <w:tcBorders>
+              <w:top w:val="single" w:color="B1B4B6" w:sz="4"/>
+              <w:left w:val="single" w:color="B1B4B6" w:sz="4"/>
+              <w:bottom w:val="single" w:color="B1B4B6" w:sz="4"/>
+              <w:right w:val="single" w:color="B1B4B6" w:sz="4"/>
+            </w:tcBorders>
+            <w:tcMar>
+              <w:top w:type="dxa" w:w="40"/>
+              <w:left w:type="dxa" w:w="80"/>
+              <w:bottom w:type="dxa" w:w="40"/>
+              <w:right w:type="dxa" w:w="80"/>
+            </w:tcMar>
+          </w:tcPr>
+          <w:p>
+            <w:pPr>
+              <w:spacing w:after="0" w:line="240"/>
+            </w:pPr>
+            <w:r>
+              <w:rPr>
+                <w:b w:val="false"/>
+                <w:bCs w:val="false"/>
+                <w:sz w:val="16"/>
+                <w:szCs w:val="16"/>
+              </w:rPr>
+              <w:t xml:space="preserve">Known dependency</w:t>
+            </w:r>
+          </w:p>
+        </w:tc>
+        <w:tc>
+          <w:tcPr>
+            <w:tcW w:type="dxa" w:w="7626"/>
+            <w:tcBorders>
+              <w:top w:val="single" w:color="B1B4B6" w:sz="4"/>
+              <w:left w:val="single" w:color="B1B4B6" w:sz="4"/>
+              <w:bottom w:val="single" w:color="B1B4B6" w:sz="4"/>
+              <w:right w:val="single" w:color="B1B4B6" w:sz="4"/>
+            </w:tcBorders>
+            <w:tcMar>
+              <w:top w:type="dxa" w:w="40"/>
+              <w:left w:type="dxa" w:w="80"/>
+              <w:bottom w:type="dxa" w:w="40"/>
+              <w:right w:type="dxa" w:w="80"/>
+            </w:tcMar>
+          </w:tcPr>
+          <w:p>
+            <w:pPr>
+              <w:spacing w:after="0" w:line="240"/>
+            </w:pPr>
+            <w:r>
+              <w:rPr>
+                <w:b w:val="false"/>
+                <w:bCs w:val="false"/>
+                <w:sz w:val="16"/>
+                <w:szCs w:val="16"/>
+              </w:rPr>
+              <w:t xml:space="preserve">ADR to Data Lake migration. Build now, re-point later. Option 1 in section 5</w:t>
+            </w:r>
+          </w:p>
+        </w:tc>
+      </w:tr>
+    </w:tbl>
+    <w:p>
+      <w:pPr>
+        <w:spacing w:after="40"/>
+      </w:pPr>
+    </w:p>
+    <w:p>
+      <w:pPr>
+        <w:pStyle w:val="Heading2"/>
+        <w:spacing w:after="60" w:before="140"/>
+      </w:pPr>
+      <w:r>
+        <w:t xml:space="preserve">What we will be able to say on 9 October</w:t>
+      </w:r>
+    </w:p>
+    <w:p>
+      <w:pPr>
+        <w:pStyle w:val="ListParagraph"/>
+        <w:numPr>
+          <w:ilvl w:val="0"/>
+          <w:numId w:val="2"/>
+        </w:numPr>
+        <w:spacing w:after="50"/>
+      </w:pPr>
+      <w:r>
+        <w:rPr>
+          <w:sz w:val="19"/>
+          <w:szCs w:val="19"/>
+        </w:rPr>
+        <w:t xml:space="preserve">Whether a file transfer can be onboarded to Boomi MFT without writing code, evidenced twice rather than argued once.</w:t>
+      </w:r>
+    </w:p>
+    <w:p>
+      <w:pPr>
+        <w:pStyle w:val="ListParagraph"/>
+        <w:numPr>
+          <w:ilvl w:val="0"/>
+          <w:numId w:val="2"/>
+        </w:numPr>
+        <w:spacing w:after="50"/>
+      </w:pPr>
+      <w:r>
+        <w:rPr>
+          <w:sz w:val="19"/>
+          <w:szCs w:val="19"/>
+        </w:rPr>
+        <w:t xml:space="preserve">What onboarding actually costs, in hours, separated from time spent waiting on other teams. That split is the number the wider plan needs and does not have.</w:t>
+      </w:r>
+    </w:p>
+    <w:p>
+      <w:pPr>
+        <w:pStyle w:val="ListParagraph"/>
+        <w:numPr>
+          <w:ilvl w:val="0"/>
+          <w:numId w:val="2"/>
+        </w:numPr>
+        <w:spacing w:after="50"/>
+      </w:pPr>
+      <w:r>
+        <w:rPr>
+          <w:sz w:val="19"/>
+          <w:szCs w:val="19"/>
+        </w:rPr>
+        <w:t xml:space="preserve">Whether the platform's controls hold for an OFFICIAL feed crossing a departmental boundary: alerting, audit, quarantine, scanning and rollback.</w:t>
+      </w:r>
+    </w:p>
+    <w:p>
+      <w:pPr>
+        <w:pStyle w:val="ListParagraph"/>
+        <w:numPr>
+          <w:ilvl w:val="0"/>
+          <w:numId w:val="2"/>
+        </w:numPr>
+        <w:spacing w:after="50"/>
+      </w:pPr>
+      <w:r>
+        <w:rPr>
+          <w:sz w:val="19"/>
+          <w:szCs w:val="19"/>
+        </w:rPr>
+        <w:t xml:space="preserve">Whether Service Operations will accept flows of this kind into support.</w:t>
+      </w:r>
+    </w:p>
+    <w:p>
+      <w:pPr>
+        <w:pStyle w:val="ListParagraph"/>
+        <w:numPr>
+          <w:ilvl w:val="0"/>
+          <w:numId w:val="2"/>
+        </w:numPr>
+        <w:spacing w:after="50"/>
+      </w:pPr>
+      <w:r>
+        <w:rPr>
+          <w:sz w:val="19"/>
+          <w:szCs w:val="19"/>
+        </w:rPr>
+        <w:t xml:space="preserve">Whether re-pointing an interface at a migrated endpoint is a one-row change, which is what the Data Lake migration will ask of every interface it touches.</w:t>
+      </w:r>
+    </w:p>
+    <w:p>
+      <w:pPr>
+        <w:pStyle w:val="Heading2"/>
+        <w:spacing w:after="60" w:before="140"/>
+      </w:pPr>
+      <w:r>
+        <w:t xml:space="preserve">The decision we are asking for</w:t>
+      </w:r>
+    </w:p>
+    <w:tbl>
+      <w:tblPr>
+        <w:tblW w:type="dxa" w:w="10306"/>
+        <w:tblBorders>
+          <w:top w:val="single" w:color="auto" w:sz="4"/>
+          <w:left w:val="single" w:color="auto" w:sz="4"/>
+          <w:bottom w:val="single" w:color="auto" w:sz="4"/>
+          <w:right w:val="single" w:color="auto" w:sz="4"/>
+          <w:insideH w:val="single" w:color="auto" w:sz="4"/>
+          <w:insideV w:val="single" w:color="auto" w:sz="4"/>
+        </w:tblBorders>
+      </w:tblPr>
+      <w:tblGrid>
+        <w:gridCol w:w="5977"/>
+        <w:gridCol w:w="2680"/>
+        <w:gridCol w:w="1649"/>
       </w:tblGrid>
       <w:tr>
         <w:trPr>
@@ -118,7 +725,7 @@
         </w:trPr>
         <w:tc>
           <w:tcPr>
-            <w:tcW w:type="dxa" w:w="2473"/>
+            <w:tcW w:type="dxa" w:w="5977"/>
             <w:tcBorders>
               <w:top w:val="single" w:color="B1B4B6" w:sz="4"/>
               <w:left w:val="single" w:color="B1B4B6" w:sz="4"/>
@@ -144,13 +751,13 @@
                 <w:sz w:val="16"/>
                 <w:szCs w:val="16"/>
               </w:rPr>
-              <w:t xml:space="preserve">Question</w:t>
-            </w:r>
-          </w:p>
-        </w:tc>
-        <w:tc>
-          <w:tcPr>
-            <w:tcW w:type="dxa" w:w="7833"/>
+              <w:t xml:space="preserve">Decision</w:t>
+            </w:r>
+          </w:p>
+        </w:tc>
+        <w:tc>
+          <w:tcPr>
+            <w:tcW w:type="dxa" w:w="2680"/>
             <w:tcBorders>
               <w:top w:val="single" w:color="B1B4B6" w:sz="4"/>
               <w:left w:val="single" w:color="B1B4B6" w:sz="4"/>
@@ -176,7 +783,39 @@
                 <w:sz w:val="16"/>
                 <w:szCs w:val="16"/>
               </w:rPr>
-              <w:t xml:space="preserve">Answer</w:t>
+              <w:t xml:space="preserve">Owner</w:t>
+            </w:r>
+          </w:p>
+        </w:tc>
+        <w:tc>
+          <w:tcPr>
+            <w:tcW w:type="dxa" w:w="1649"/>
+            <w:tcBorders>
+              <w:top w:val="single" w:color="B1B4B6" w:sz="4"/>
+              <w:left w:val="single" w:color="B1B4B6" w:sz="4"/>
+              <w:bottom w:val="single" w:color="B1B4B6" w:sz="4"/>
+              <w:right w:val="single" w:color="B1B4B6" w:sz="4"/>
+            </w:tcBorders>
+            <w:shd w:fill="F3F2F1" w:color="auto" w:val="clear"/>
+            <w:tcMar>
+              <w:top w:type="dxa" w:w="40"/>
+              <w:left w:type="dxa" w:w="80"/>
+              <w:bottom w:type="dxa" w:w="40"/>
+              <w:right w:type="dxa" w:w="80"/>
+            </w:tcMar>
+          </w:tcPr>
+          <w:p>
+            <w:pPr>
+              <w:spacing w:after="0" w:line="240"/>
+            </w:pPr>
+            <w:r>
+              <w:rPr>
+                <w:b/>
+                <w:bCs/>
+                <w:sz w:val="16"/>
+                <w:szCs w:val="16"/>
+              </w:rPr>
+              <w:t xml:space="preserve">By</w:t>
             </w:r>
           </w:p>
         </w:tc>
@@ -184,63 +823,94 @@
       <w:tr>
         <w:tc>
           <w:tcPr>
-            <w:tcW w:type="dxa" w:w="2473"/>
-            <w:tcBorders>
-              <w:top w:val="single" w:color="B1B4B6" w:sz="4"/>
-              <w:left w:val="single" w:color="B1B4B6" w:sz="4"/>
-              <w:bottom w:val="single" w:color="B1B4B6" w:sz="4"/>
-              <w:right w:val="single" w:color="B1B4B6" w:sz="4"/>
-            </w:tcBorders>
-            <w:tcMar>
-              <w:top w:type="dxa" w:w="40"/>
-              <w:left w:type="dxa" w:w="80"/>
-              <w:bottom w:type="dxa" w:w="40"/>
-              <w:right w:type="dxa" w:w="80"/>
-            </w:tcMar>
-          </w:tcPr>
-          <w:p>
-            <w:pPr>
-              <w:spacing w:after="0" w:line="240"/>
-            </w:pPr>
-            <w:r>
-              <w:rPr>
-                <w:b w:val="false"/>
-                <w:bCs w:val="false"/>
-                <w:sz w:val="16"/>
-                <w:szCs w:val="16"/>
-              </w:rPr>
-              <w:t xml:space="preserve">What we are doing</w:t>
-            </w:r>
-          </w:p>
-        </w:tc>
-        <w:tc>
-          <w:tcPr>
-            <w:tcW w:type="dxa" w:w="7833"/>
-            <w:tcBorders>
-              <w:top w:val="single" w:color="B1B4B6" w:sz="4"/>
-              <w:left w:val="single" w:color="B1B4B6" w:sz="4"/>
-              <w:bottom w:val="single" w:color="B1B4B6" w:sz="4"/>
-              <w:right w:val="single" w:color="B1B4B6" w:sz="4"/>
-            </w:tcBorders>
-            <w:tcMar>
-              <w:top w:type="dxa" w:w="40"/>
-              <w:left w:type="dxa" w:w="80"/>
-              <w:bottom w:type="dxa" w:w="40"/>
-              <w:right w:type="dxa" w:w="80"/>
-            </w:tcMar>
-          </w:tcPr>
-          <w:p>
-            <w:pPr>
-              <w:spacing w:after="0" w:line="240"/>
-            </w:pPr>
-            <w:r>
-              <w:rPr>
-                <w:b w:val="false"/>
-                <w:bCs w:val="false"/>
-                <w:sz w:val="16"/>
-                <w:szCs w:val="16"/>
-              </w:rPr>
-              <w:t xml:space="preserve">Moving one live feed off its legacy transfer mechanisms onto Boomi MFT, and evidencing the result well enough for a go or no-go decision.</w:t>
+            <w:tcW w:type="dxa" w:w="5977"/>
+            <w:tcBorders>
+              <w:top w:val="single" w:color="B1B4B6" w:sz="4"/>
+              <w:left w:val="single" w:color="B1B4B6" w:sz="4"/>
+              <w:bottom w:val="single" w:color="B1B4B6" w:sz="4"/>
+              <w:right w:val="single" w:color="B1B4B6" w:sz="4"/>
+            </w:tcBorders>
+            <w:tcMar>
+              <w:top w:type="dxa" w:w="40"/>
+              <w:left w:type="dxa" w:w="80"/>
+              <w:bottom w:type="dxa" w:w="40"/>
+              <w:right w:type="dxa" w:w="80"/>
+            </w:tcMar>
+          </w:tcPr>
+          <w:p>
+            <w:pPr>
+              <w:spacing w:after="0" w:line="240"/>
+            </w:pPr>
+            <w:r>
+              <w:rPr>
+                <w:b w:val="false"/>
+                <w:bCs w:val="false"/>
+                <w:sz w:val="16"/>
+                <w:szCs w:val="16"/>
+              </w:rPr>
+              <w:t xml:space="preserve">Name owners for the three critical dependencies: endpoint details, firewall and allow-list changes, and the ONS agreement</w:t>
+            </w:r>
+          </w:p>
+        </w:tc>
+        <w:tc>
+          <w:tcPr>
+            <w:tcW w:type="dxa" w:w="2680"/>
+            <w:tcBorders>
+              <w:top w:val="single" w:color="B1B4B6" w:sz="4"/>
+              <w:left w:val="single" w:color="B1B4B6" w:sz="4"/>
+              <w:bottom w:val="single" w:color="B1B4B6" w:sz="4"/>
+              <w:right w:val="single" w:color="B1B4B6" w:sz="4"/>
+            </w:tcBorders>
+            <w:tcMar>
+              <w:top w:type="dxa" w:w="40"/>
+              <w:left w:type="dxa" w:w="80"/>
+              <w:bottom w:type="dxa" w:w="40"/>
+              <w:right w:type="dxa" w:w="80"/>
+            </w:tcMar>
+          </w:tcPr>
+          <w:p>
+            <w:pPr>
+              <w:spacing w:after="0" w:line="240"/>
+            </w:pPr>
+            <w:r>
+              <w:rPr>
+                <w:b w:val="false"/>
+                <w:bCs w:val="false"/>
+                <w:sz w:val="16"/>
+                <w:szCs w:val="16"/>
+              </w:rPr>
+              <w:t xml:space="preserve">Delivery lead</w:t>
+            </w:r>
+          </w:p>
+        </w:tc>
+        <w:tc>
+          <w:tcPr>
+            <w:tcW w:type="dxa" w:w="1649"/>
+            <w:tcBorders>
+              <w:top w:val="single" w:color="B1B4B6" w:sz="4"/>
+              <w:left w:val="single" w:color="B1B4B6" w:sz="4"/>
+              <w:bottom w:val="single" w:color="B1B4B6" w:sz="4"/>
+              <w:right w:val="single" w:color="B1B4B6" w:sz="4"/>
+            </w:tcBorders>
+            <w:tcMar>
+              <w:top w:type="dxa" w:w="40"/>
+              <w:left w:type="dxa" w:w="80"/>
+              <w:bottom w:type="dxa" w:w="40"/>
+              <w:right w:type="dxa" w:w="80"/>
+            </w:tcMar>
+          </w:tcPr>
+          <w:p>
+            <w:pPr>
+              <w:spacing w:after="0" w:line="240"/>
+            </w:pPr>
+            <w:r>
+              <w:rPr>
+                <w:b w:val="false"/>
+                <w:bCs w:val="false"/>
+                <w:sz w:val="16"/>
+                <w:szCs w:val="16"/>
+              </w:rPr>
+              <w:t xml:space="preserve">Tue 15 Sep 2026</w:t>
             </w:r>
           </w:p>
         </w:tc>
@@ -248,63 +918,94 @@
       <w:tr>
         <w:tc>
           <w:tcPr>
-            <w:tcW w:type="dxa" w:w="2473"/>
-            <w:tcBorders>
-              <w:top w:val="single" w:color="B1B4B6" w:sz="4"/>
-              <w:left w:val="single" w:color="B1B4B6" w:sz="4"/>
-              <w:bottom w:val="single" w:color="B1B4B6" w:sz="4"/>
-              <w:right w:val="single" w:color="B1B4B6" w:sz="4"/>
-            </w:tcBorders>
-            <w:tcMar>
-              <w:top w:type="dxa" w:w="40"/>
-              <w:left w:type="dxa" w:w="80"/>
-              <w:bottom w:type="dxa" w:w="40"/>
-              <w:right w:type="dxa" w:w="80"/>
-            </w:tcMar>
-          </w:tcPr>
-          <w:p>
-            <w:pPr>
-              <w:spacing w:after="0" w:line="240"/>
-            </w:pPr>
-            <w:r>
-              <w:rPr>
-                <w:b w:val="false"/>
-                <w:bCs w:val="false"/>
-                <w:sz w:val="16"/>
-                <w:szCs w:val="16"/>
-              </w:rPr>
-              <w:t xml:space="preserve">On what</w:t>
-            </w:r>
-          </w:p>
-        </w:tc>
-        <w:tc>
-          <w:tcPr>
-            <w:tcW w:type="dxa" w:w="7833"/>
-            <w:tcBorders>
-              <w:top w:val="single" w:color="B1B4B6" w:sz="4"/>
-              <w:left w:val="single" w:color="B1B4B6" w:sz="4"/>
-              <w:bottom w:val="single" w:color="B1B4B6" w:sz="4"/>
-              <w:right w:val="single" w:color="B1B4B6" w:sz="4"/>
-            </w:tcBorders>
-            <w:tcMar>
-              <w:top w:type="dxa" w:w="40"/>
-              <w:left w:type="dxa" w:w="80"/>
-              <w:bottom w:type="dxa" w:w="40"/>
-              <w:right w:type="dxa" w:w="80"/>
-            </w:tcMar>
-          </w:tcPr>
-          <w:p>
-            <w:pPr>
-              <w:spacing w:after="0" w:line="240"/>
-            </w:pPr>
-            <w:r>
-              <w:rPr>
-                <w:b w:val="false"/>
-                <w:bCs w:val="false"/>
-                <w:sz w:val="16"/>
-                <w:szCs w:val="16"/>
-              </w:rPr>
-              <w:t xml:space="preserve">Feed ADR.040, the quarterly Migrant Workers Scan. It is the only feed identified that carries both patterns in a single business flow: NPS to ADR internal, and ADR to ONS external.</w:t>
+            <w:tcW w:type="dxa" w:w="5977"/>
+            <w:tcBorders>
+              <w:top w:val="single" w:color="B1B4B6" w:sz="4"/>
+              <w:left w:val="single" w:color="B1B4B6" w:sz="4"/>
+              <w:bottom w:val="single" w:color="B1B4B6" w:sz="4"/>
+              <w:right w:val="single" w:color="B1B4B6" w:sz="4"/>
+            </w:tcBorders>
+            <w:tcMar>
+              <w:top w:type="dxa" w:w="40"/>
+              <w:left w:type="dxa" w:w="80"/>
+              <w:bottom w:type="dxa" w:w="40"/>
+              <w:right w:type="dxa" w:w="80"/>
+            </w:tcMar>
+          </w:tcPr>
+          <w:p>
+            <w:pPr>
+              <w:spacing w:after="0" w:line="240"/>
+            </w:pPr>
+            <w:r>
+              <w:rPr>
+                <w:b w:val="false"/>
+                <w:bCs w:val="false"/>
+                <w:sz w:val="16"/>
+                <w:szCs w:val="16"/>
+              </w:rPr>
+              <w:t xml:space="preserve">Agree option 1 on the Data Lake migration: build now against the current ADR endpoints, re-point as a configuration change when the warehouse migrates</w:t>
+            </w:r>
+          </w:p>
+        </w:tc>
+        <w:tc>
+          <w:tcPr>
+            <w:tcW w:type="dxa" w:w="2680"/>
+            <w:tcBorders>
+              <w:top w:val="single" w:color="B1B4B6" w:sz="4"/>
+              <w:left w:val="single" w:color="B1B4B6" w:sz="4"/>
+              <w:bottom w:val="single" w:color="B1B4B6" w:sz="4"/>
+              <w:right w:val="single" w:color="B1B4B6" w:sz="4"/>
+            </w:tcBorders>
+            <w:tcMar>
+              <w:top w:type="dxa" w:w="40"/>
+              <w:left w:type="dxa" w:w="80"/>
+              <w:bottom w:type="dxa" w:w="40"/>
+              <w:right w:type="dxa" w:w="80"/>
+            </w:tcMar>
+          </w:tcPr>
+          <w:p>
+            <w:pPr>
+              <w:spacing w:after="0" w:line="240"/>
+            </w:pPr>
+            <w:r>
+              <w:rPr>
+                <w:b w:val="false"/>
+                <w:bCs w:val="false"/>
+                <w:sz w:val="16"/>
+                <w:szCs w:val="16"/>
+              </w:rPr>
+              <w:t xml:space="preserve">Design Authority with the Data Lake programme</w:t>
+            </w:r>
+          </w:p>
+        </w:tc>
+        <w:tc>
+          <w:tcPr>
+            <w:tcW w:type="dxa" w:w="1649"/>
+            <w:tcBorders>
+              <w:top w:val="single" w:color="B1B4B6" w:sz="4"/>
+              <w:left w:val="single" w:color="B1B4B6" w:sz="4"/>
+              <w:bottom w:val="single" w:color="B1B4B6" w:sz="4"/>
+              <w:right w:val="single" w:color="B1B4B6" w:sz="4"/>
+            </w:tcBorders>
+            <w:tcMar>
+              <w:top w:type="dxa" w:w="40"/>
+              <w:left w:type="dxa" w:w="80"/>
+              <w:bottom w:type="dxa" w:w="40"/>
+              <w:right w:type="dxa" w:w="80"/>
+            </w:tcMar>
+          </w:tcPr>
+          <w:p>
+            <w:pPr>
+              <w:spacing w:after="0" w:line="240"/>
+            </w:pPr>
+            <w:r>
+              <w:rPr>
+                <w:b w:val="false"/>
+                <w:bCs w:val="false"/>
+                <w:sz w:val="16"/>
+                <w:szCs w:val="16"/>
+              </w:rPr>
+              <w:t xml:space="preserve">Fri 25 Sep 2026</w:t>
             </w:r>
           </w:p>
         </w:tc>
@@ -312,511 +1013,94 @@
       <w:tr>
         <w:tc>
           <w:tcPr>
-            <w:tcW w:type="dxa" w:w="2473"/>
-            <w:tcBorders>
-              <w:top w:val="single" w:color="B1B4B6" w:sz="4"/>
-              <w:left w:val="single" w:color="B1B4B6" w:sz="4"/>
-              <w:bottom w:val="single" w:color="B1B4B6" w:sz="4"/>
-              <w:right w:val="single" w:color="B1B4B6" w:sz="4"/>
-            </w:tcBorders>
-            <w:tcMar>
-              <w:top w:type="dxa" w:w="40"/>
-              <w:left w:type="dxa" w:w="80"/>
-              <w:bottom w:type="dxa" w:w="40"/>
-              <w:right w:type="dxa" w:w="80"/>
-            </w:tcMar>
-          </w:tcPr>
-          <w:p>
-            <w:pPr>
-              <w:spacing w:after="0" w:line="240"/>
-            </w:pPr>
-            <w:r>
-              <w:rPr>
-                <w:b w:val="false"/>
-                <w:bCs w:val="false"/>
-                <w:sz w:val="16"/>
-                <w:szCs w:val="16"/>
-              </w:rPr>
-              <w:t xml:space="preserve">When</w:t>
-            </w:r>
-          </w:p>
-        </w:tc>
-        <w:tc>
-          <w:tcPr>
-            <w:tcW w:type="dxa" w:w="7833"/>
-            <w:tcBorders>
-              <w:top w:val="single" w:color="B1B4B6" w:sz="4"/>
-              <w:left w:val="single" w:color="B1B4B6" w:sz="4"/>
-              <w:bottom w:val="single" w:color="B1B4B6" w:sz="4"/>
-              <w:right w:val="single" w:color="B1B4B6" w:sz="4"/>
-            </w:tcBorders>
-            <w:tcMar>
-              <w:top w:type="dxa" w:w="40"/>
-              <w:left w:type="dxa" w:w="80"/>
-              <w:bottom w:type="dxa" w:w="40"/>
-              <w:right w:type="dxa" w:w="80"/>
-            </w:tcMar>
-          </w:tcPr>
-          <w:p>
-            <w:pPr>
-              <w:spacing w:after="0" w:line="240"/>
-            </w:pPr>
-            <w:r>
-              <w:rPr>
-                <w:b w:val="false"/>
-                <w:bCs w:val="false"/>
-                <w:sz w:val="16"/>
-                <w:szCs w:val="16"/>
-              </w:rPr>
-              <w:t xml:space="preserve">Monday 28 September to Friday 9 October 2026. Configuration is two days of that.</w:t>
-            </w:r>
-          </w:p>
-        </w:tc>
-      </w:tr>
-      <w:tr>
-        <w:tc>
-          <w:tcPr>
-            <w:tcW w:type="dxa" w:w="2473"/>
-            <w:tcBorders>
-              <w:top w:val="single" w:color="B1B4B6" w:sz="4"/>
-              <w:left w:val="single" w:color="B1B4B6" w:sz="4"/>
-              <w:bottom w:val="single" w:color="B1B4B6" w:sz="4"/>
-              <w:right w:val="single" w:color="B1B4B6" w:sz="4"/>
-            </w:tcBorders>
-            <w:tcMar>
-              <w:top w:type="dxa" w:w="40"/>
-              <w:left w:type="dxa" w:w="80"/>
-              <w:bottom w:type="dxa" w:w="40"/>
-              <w:right w:type="dxa" w:w="80"/>
-            </w:tcMar>
-          </w:tcPr>
-          <w:p>
-            <w:pPr>
-              <w:spacing w:after="0" w:line="240"/>
-            </w:pPr>
-            <w:r>
-              <w:rPr>
-                <w:b w:val="false"/>
-                <w:bCs w:val="false"/>
-                <w:sz w:val="16"/>
-                <w:szCs w:val="16"/>
-              </w:rPr>
-              <w:t xml:space="preserve">What it costs</w:t>
-            </w:r>
-          </w:p>
-        </w:tc>
-        <w:tc>
-          <w:tcPr>
-            <w:tcW w:type="dxa" w:w="7833"/>
-            <w:tcBorders>
-              <w:top w:val="single" w:color="B1B4B6" w:sz="4"/>
-              <w:left w:val="single" w:color="B1B4B6" w:sz="4"/>
-              <w:bottom w:val="single" w:color="B1B4B6" w:sz="4"/>
-              <w:right w:val="single" w:color="B1B4B6" w:sz="4"/>
-            </w:tcBorders>
-            <w:tcMar>
-              <w:top w:type="dxa" w:w="40"/>
-              <w:left w:type="dxa" w:w="80"/>
-              <w:bottom w:type="dxa" w:w="40"/>
-              <w:right w:type="dxa" w:w="80"/>
-            </w:tcMar>
-          </w:tcPr>
-          <w:p>
-            <w:pPr>
-              <w:spacing w:after="0" w:line="240"/>
-            </w:pPr>
-            <w:r>
-              <w:rPr>
-                <w:b w:val="false"/>
-                <w:bCs w:val="false"/>
-                <w:sz w:val="16"/>
-                <w:szCs w:val="16"/>
-              </w:rPr>
-              <w:t xml:space="preserve">Two days of build effort plus about a week of discovery, testing and handover around it. No new components, no new interfaces to maintain.</w:t>
-            </w:r>
-          </w:p>
-        </w:tc>
-      </w:tr>
-      <w:tr>
-        <w:tc>
-          <w:tcPr>
-            <w:tcW w:type="dxa" w:w="2473"/>
-            <w:tcBorders>
-              <w:top w:val="single" w:color="B1B4B6" w:sz="4"/>
-              <w:left w:val="single" w:color="B1B4B6" w:sz="4"/>
-              <w:bottom w:val="single" w:color="B1B4B6" w:sz="4"/>
-              <w:right w:val="single" w:color="B1B4B6" w:sz="4"/>
-            </w:tcBorders>
-            <w:tcMar>
-              <w:top w:type="dxa" w:w="40"/>
-              <w:left w:type="dxa" w:w="80"/>
-              <w:bottom w:type="dxa" w:w="40"/>
-              <w:right w:type="dxa" w:w="80"/>
-            </w:tcMar>
-          </w:tcPr>
-          <w:p>
-            <w:pPr>
-              <w:spacing w:after="0" w:line="240"/>
-            </w:pPr>
-            <w:r>
-              <w:rPr>
-                <w:b w:val="false"/>
-                <w:bCs w:val="false"/>
-                <w:sz w:val="16"/>
-                <w:szCs w:val="16"/>
-              </w:rPr>
-              <w:t xml:space="preserve">What we need before it starts</w:t>
-            </w:r>
-          </w:p>
-        </w:tc>
-        <w:tc>
-          <w:tcPr>
-            <w:tcW w:type="dxa" w:w="7833"/>
-            <w:tcBorders>
-              <w:top w:val="single" w:color="B1B4B6" w:sz="4"/>
-              <w:left w:val="single" w:color="B1B4B6" w:sz="4"/>
-              <w:bottom w:val="single" w:color="B1B4B6" w:sz="4"/>
-              <w:right w:val="single" w:color="B1B4B6" w:sz="4"/>
-            </w:tcBorders>
-            <w:tcMar>
-              <w:top w:type="dxa" w:w="40"/>
-              <w:left w:type="dxa" w:w="80"/>
-              <w:bottom w:type="dxa" w:w="40"/>
-              <w:right w:type="dxa" w:w="80"/>
-            </w:tcMar>
-          </w:tcPr>
-          <w:p>
-            <w:pPr>
-              <w:spacing w:after="0" w:line="240"/>
-            </w:pPr>
-            <w:r>
-              <w:rPr>
-                <w:b w:val="false"/>
-                <w:bCs w:val="false"/>
-                <w:sz w:val="16"/>
-                <w:szCs w:val="16"/>
-              </w:rPr>
-              <w:t xml:space="preserve">Three things, all before 28 September: the endpoint details in section 3, the firewall and allow-list changes raised, and agreement from ONS to receive from a new sending endpoint.</w:t>
-            </w:r>
-          </w:p>
-        </w:tc>
-      </w:tr>
-      <w:tr>
-        <w:tc>
-          <w:tcPr>
-            <w:tcW w:type="dxa" w:w="2473"/>
-            <w:tcBorders>
-              <w:top w:val="single" w:color="B1B4B6" w:sz="4"/>
-              <w:left w:val="single" w:color="B1B4B6" w:sz="4"/>
-              <w:bottom w:val="single" w:color="B1B4B6" w:sz="4"/>
-              <w:right w:val="single" w:color="B1B4B6" w:sz="4"/>
-            </w:tcBorders>
-            <w:tcMar>
-              <w:top w:type="dxa" w:w="40"/>
-              <w:left w:type="dxa" w:w="80"/>
-              <w:bottom w:type="dxa" w:w="40"/>
-              <w:right w:type="dxa" w:w="80"/>
-            </w:tcMar>
-          </w:tcPr>
-          <w:p>
-            <w:pPr>
-              <w:spacing w:after="0" w:line="240"/>
-            </w:pPr>
-            <w:r>
-              <w:rPr>
-                <w:b w:val="false"/>
-                <w:bCs w:val="false"/>
-                <w:sz w:val="16"/>
-                <w:szCs w:val="16"/>
-              </w:rPr>
-              <w:t xml:space="preserve">What good looks like</w:t>
-            </w:r>
-          </w:p>
-        </w:tc>
-        <w:tc>
-          <w:tcPr>
-            <w:tcW w:type="dxa" w:w="7833"/>
-            <w:tcBorders>
-              <w:top w:val="single" w:color="B1B4B6" w:sz="4"/>
-              <w:left w:val="single" w:color="B1B4B6" w:sz="4"/>
-              <w:bottom w:val="single" w:color="B1B4B6" w:sz="4"/>
-              <w:right w:val="single" w:color="B1B4B6" w:sz="4"/>
-            </w:tcBorders>
-            <w:tcMar>
-              <w:top w:type="dxa" w:w="40"/>
-              <w:left w:type="dxa" w:w="80"/>
-              <w:bottom w:type="dxa" w:w="40"/>
-              <w:right w:type="dxa" w:w="80"/>
-            </w:tcMar>
-          </w:tcPr>
-          <w:p>
-            <w:pPr>
-              <w:spacing w:after="0" w:line="240"/>
-            </w:pPr>
-            <w:r>
-              <w:rPr>
-                <w:b w:val="false"/>
-                <w:bCs w:val="false"/>
-                <w:sz w:val="16"/>
-                <w:szCs w:val="16"/>
-              </w:rPr>
-              <w:t xml:space="preserve">Both legs running as configuration rows on one generic engine, zero bespoke components, and Service Operations signing the handover.</w:t>
-            </w:r>
-          </w:p>
-        </w:tc>
-      </w:tr>
-      <w:tr>
-        <w:tc>
-          <w:tcPr>
-            <w:tcW w:type="dxa" w:w="2473"/>
-            <w:tcBorders>
-              <w:top w:val="single" w:color="B1B4B6" w:sz="4"/>
-              <w:left w:val="single" w:color="B1B4B6" w:sz="4"/>
-              <w:bottom w:val="single" w:color="B1B4B6" w:sz="4"/>
-              <w:right w:val="single" w:color="B1B4B6" w:sz="4"/>
-            </w:tcBorders>
-            <w:tcMar>
-              <w:top w:type="dxa" w:w="40"/>
-              <w:left w:type="dxa" w:w="80"/>
-              <w:bottom w:type="dxa" w:w="40"/>
-              <w:right w:type="dxa" w:w="80"/>
-            </w:tcMar>
-          </w:tcPr>
-          <w:p>
-            <w:pPr>
-              <w:spacing w:after="0" w:line="240"/>
-            </w:pPr>
-            <w:r>
-              <w:rPr>
-                <w:b w:val="false"/>
-                <w:bCs w:val="false"/>
-                <w:sz w:val="16"/>
-                <w:szCs w:val="16"/>
-              </w:rPr>
-              <w:t xml:space="preserve">Why it matters beyond this feed</w:t>
-            </w:r>
-          </w:p>
-        </w:tc>
-        <w:tc>
-          <w:tcPr>
-            <w:tcW w:type="dxa" w:w="7833"/>
-            <w:tcBorders>
-              <w:top w:val="single" w:color="B1B4B6" w:sz="4"/>
-              <w:left w:val="single" w:color="B1B4B6" w:sz="4"/>
-              <w:bottom w:val="single" w:color="B1B4B6" w:sz="4"/>
-              <w:right w:val="single" w:color="B1B4B6" w:sz="4"/>
-            </w:tcBorders>
-            <w:tcMar>
-              <w:top w:type="dxa" w:w="40"/>
-              <w:left w:type="dxa" w:w="80"/>
-              <w:bottom w:type="dxa" w:w="40"/>
-              <w:right w:type="dxa" w:w="80"/>
-            </w:tcMar>
-          </w:tcPr>
-          <w:p>
-            <w:pPr>
-              <w:spacing w:after="0" w:line="240"/>
-            </w:pPr>
-            <w:r>
-              <w:rPr>
-                <w:b w:val="false"/>
-                <w:bCs w:val="false"/>
-                <w:sz w:val="16"/>
-                <w:szCs w:val="16"/>
-              </w:rPr>
-              <w:t xml:space="preserve">If two similar transfers can both be delivered as configuration, onboarding the rest of the estate is configuration work rather than development work. That is the assumption the wider business case rests on, and it has not been tested.</w:t>
-            </w:r>
-          </w:p>
-        </w:tc>
-      </w:tr>
-      <w:tr>
-        <w:tc>
-          <w:tcPr>
-            <w:tcW w:type="dxa" w:w="2473"/>
-            <w:tcBorders>
-              <w:top w:val="single" w:color="B1B4B6" w:sz="4"/>
-              <w:left w:val="single" w:color="B1B4B6" w:sz="4"/>
-              <w:bottom w:val="single" w:color="B1B4B6" w:sz="4"/>
-              <w:right w:val="single" w:color="B1B4B6" w:sz="4"/>
-            </w:tcBorders>
-            <w:tcMar>
-              <w:top w:type="dxa" w:w="40"/>
-              <w:left w:type="dxa" w:w="80"/>
-              <w:bottom w:type="dxa" w:w="40"/>
-              <w:right w:type="dxa" w:w="80"/>
-            </w:tcMar>
-          </w:tcPr>
-          <w:p>
-            <w:pPr>
-              <w:spacing w:after="0" w:line="240"/>
-            </w:pPr>
-            <w:r>
-              <w:rPr>
-                <w:b w:val="false"/>
-                <w:bCs w:val="false"/>
-                <w:sz w:val="16"/>
-                <w:szCs w:val="16"/>
-              </w:rPr>
-              <w:t xml:space="preserve">What could stop it</w:t>
-            </w:r>
-          </w:p>
-        </w:tc>
-        <w:tc>
-          <w:tcPr>
-            <w:tcW w:type="dxa" w:w="7833"/>
-            <w:tcBorders>
-              <w:top w:val="single" w:color="B1B4B6" w:sz="4"/>
-              <w:left w:val="single" w:color="B1B4B6" w:sz="4"/>
-              <w:bottom w:val="single" w:color="B1B4B6" w:sz="4"/>
-              <w:right w:val="single" w:color="B1B4B6" w:sz="4"/>
-            </w:tcBorders>
-            <w:tcMar>
-              <w:top w:type="dxa" w:w="40"/>
-              <w:left w:type="dxa" w:w="80"/>
-              <w:bottom w:type="dxa" w:w="40"/>
-              <w:right w:type="dxa" w:w="80"/>
-            </w:tcMar>
-          </w:tcPr>
-          <w:p>
-            <w:pPr>
-              <w:spacing w:after="0" w:line="240"/>
-            </w:pPr>
-            <w:r>
-              <w:rPr>
-                <w:b w:val="false"/>
-                <w:bCs w:val="false"/>
-                <w:sz w:val="16"/>
-                <w:szCs w:val="16"/>
-              </w:rPr>
-              <w:t xml:space="preserve">Firewall lead time and the ONS agreement. Neither compresses by working harder. If ONS is not ready in time, leg A still delivers inside the window and leg B follows within days of the external path opening.</w:t>
-            </w:r>
-          </w:p>
-        </w:tc>
-      </w:tr>
-      <w:tr>
-        <w:tc>
-          <w:tcPr>
-            <w:tcW w:type="dxa" w:w="2473"/>
-            <w:tcBorders>
-              <w:top w:val="single" w:color="B1B4B6" w:sz="4"/>
-              <w:left w:val="single" w:color="B1B4B6" w:sz="4"/>
-              <w:bottom w:val="single" w:color="B1B4B6" w:sz="4"/>
-              <w:right w:val="single" w:color="B1B4B6" w:sz="4"/>
-            </w:tcBorders>
-            <w:tcMar>
-              <w:top w:type="dxa" w:w="40"/>
-              <w:left w:type="dxa" w:w="80"/>
-              <w:bottom w:type="dxa" w:w="40"/>
-              <w:right w:type="dxa" w:w="80"/>
-            </w:tcMar>
-          </w:tcPr>
-          <w:p>
-            <w:pPr>
-              <w:spacing w:after="0" w:line="240"/>
-            </w:pPr>
-            <w:r>
-              <w:rPr>
-                <w:b w:val="false"/>
-                <w:bCs w:val="false"/>
-                <w:sz w:val="16"/>
-                <w:szCs w:val="16"/>
-              </w:rPr>
-              <w:t xml:space="preserve">On the Data Lake migration</w:t>
-            </w:r>
-          </w:p>
-        </w:tc>
-        <w:tc>
-          <w:tcPr>
-            <w:tcW w:type="dxa" w:w="7833"/>
-            <w:tcBorders>
-              <w:top w:val="single" w:color="B1B4B6" w:sz="4"/>
-              <w:left w:val="single" w:color="B1B4B6" w:sz="4"/>
-              <w:bottom w:val="single" w:color="B1B4B6" w:sz="4"/>
-              <w:right w:val="single" w:color="B1B4B6" w:sz="4"/>
-            </w:tcBorders>
-            <w:tcMar>
-              <w:top w:type="dxa" w:w="40"/>
-              <w:left w:type="dxa" w:w="80"/>
-              <w:bottom w:type="dxa" w:w="40"/>
-              <w:right w:type="dxa" w:w="80"/>
-            </w:tcMar>
-          </w:tcPr>
-          <w:p>
-            <w:pPr>
-              <w:spacing w:after="0" w:line="240"/>
-            </w:pPr>
-            <w:r>
-              <w:rPr>
-                <w:b w:val="false"/>
-                <w:bCs w:val="false"/>
-                <w:sz w:val="16"/>
-                <w:szCs w:val="16"/>
-              </w:rPr>
-              <w:t xml:space="preserve">Build now against the current ADR endpoints and re-point to the Data Lake as a configuration change when the warehouse migrates. Option 1 in section 5. Waiting hands our start date to another programme.</w:t>
-            </w:r>
-          </w:p>
-        </w:tc>
-      </w:tr>
-      <w:tr>
-        <w:tc>
-          <w:tcPr>
-            <w:tcW w:type="dxa" w:w="2473"/>
-            <w:tcBorders>
-              <w:top w:val="single" w:color="B1B4B6" w:sz="4"/>
-              <w:left w:val="single" w:color="B1B4B6" w:sz="4"/>
-              <w:bottom w:val="single" w:color="B1B4B6" w:sz="4"/>
-              <w:right w:val="single" w:color="B1B4B6" w:sz="4"/>
-            </w:tcBorders>
-            <w:tcMar>
-              <w:top w:type="dxa" w:w="40"/>
-              <w:left w:type="dxa" w:w="80"/>
-              <w:bottom w:type="dxa" w:w="40"/>
-              <w:right w:type="dxa" w:w="80"/>
-            </w:tcMar>
-          </w:tcPr>
-          <w:p>
-            <w:pPr>
-              <w:spacing w:after="0" w:line="240"/>
-            </w:pPr>
-            <w:r>
-              <w:rPr>
-                <w:b w:val="false"/>
-                <w:bCs w:val="false"/>
-                <w:sz w:val="16"/>
-                <w:szCs w:val="16"/>
-              </w:rPr>
-              <w:t xml:space="preserve">Decision requested</w:t>
-            </w:r>
-          </w:p>
-        </w:tc>
-        <w:tc>
-          <w:tcPr>
-            <w:tcW w:type="dxa" w:w="7833"/>
-            <w:tcBorders>
-              <w:top w:val="single" w:color="B1B4B6" w:sz="4"/>
-              <w:left w:val="single" w:color="B1B4B6" w:sz="4"/>
-              <w:bottom w:val="single" w:color="B1B4B6" w:sz="4"/>
-              <w:right w:val="single" w:color="B1B4B6" w:sz="4"/>
-            </w:tcBorders>
-            <w:tcMar>
-              <w:top w:type="dxa" w:w="40"/>
-              <w:left w:type="dxa" w:w="80"/>
-              <w:bottom w:type="dxa" w:w="40"/>
-              <w:right w:type="dxa" w:w="80"/>
-            </w:tcMar>
-          </w:tcPr>
-          <w:p>
-            <w:pPr>
-              <w:spacing w:after="0" w:line="240"/>
-            </w:pPr>
-            <w:r>
-              <w:rPr>
-                <w:b w:val="false"/>
-                <w:bCs w:val="false"/>
-                <w:sz w:val="16"/>
-                <w:szCs w:val="16"/>
-              </w:rPr>
-              <w:t xml:space="preserve">Approve the window, name owners on the three critical dependencies, and agree option 1.</w:t>
+            <w:tcW w:type="dxa" w:w="5977"/>
+            <w:tcBorders>
+              <w:top w:val="single" w:color="B1B4B6" w:sz="4"/>
+              <w:left w:val="single" w:color="B1B4B6" w:sz="4"/>
+              <w:bottom w:val="single" w:color="B1B4B6" w:sz="4"/>
+              <w:right w:val="single" w:color="B1B4B6" w:sz="4"/>
+            </w:tcBorders>
+            <w:tcMar>
+              <w:top w:type="dxa" w:w="40"/>
+              <w:left w:type="dxa" w:w="80"/>
+              <w:bottom w:type="dxa" w:w="40"/>
+              <w:right w:type="dxa" w:w="80"/>
+            </w:tcMar>
+          </w:tcPr>
+          <w:p>
+            <w:pPr>
+              <w:spacing w:after="0" w:line="240"/>
+            </w:pPr>
+            <w:r>
+              <w:rPr>
+                <w:b w:val="false"/>
+                <w:bCs w:val="false"/>
+                <w:sz w:val="16"/>
+                <w:szCs w:val="16"/>
+              </w:rPr>
+              <w:t xml:space="preserve">Approve the two-week window opening 28 September</w:t>
+            </w:r>
+          </w:p>
+        </w:tc>
+        <w:tc>
+          <w:tcPr>
+            <w:tcW w:type="dxa" w:w="2680"/>
+            <w:tcBorders>
+              <w:top w:val="single" w:color="B1B4B6" w:sz="4"/>
+              <w:left w:val="single" w:color="B1B4B6" w:sz="4"/>
+              <w:bottom w:val="single" w:color="B1B4B6" w:sz="4"/>
+              <w:right w:val="single" w:color="B1B4B6" w:sz="4"/>
+            </w:tcBorders>
+            <w:tcMar>
+              <w:top w:type="dxa" w:w="40"/>
+              <w:left w:type="dxa" w:w="80"/>
+              <w:bottom w:type="dxa" w:w="40"/>
+              <w:right w:type="dxa" w:w="80"/>
+            </w:tcMar>
+          </w:tcPr>
+          <w:p>
+            <w:pPr>
+              <w:spacing w:after="0" w:line="240"/>
+            </w:pPr>
+            <w:r>
+              <w:rPr>
+                <w:b w:val="false"/>
+                <w:bCs w:val="false"/>
+                <w:sz w:val="16"/>
+                <w:szCs w:val="16"/>
+              </w:rPr>
+              <w:t xml:space="preserve">Design Authority</w:t>
+            </w:r>
+          </w:p>
+        </w:tc>
+        <w:tc>
+          <w:tcPr>
+            <w:tcW w:type="dxa" w:w="1649"/>
+            <w:tcBorders>
+              <w:top w:val="single" w:color="B1B4B6" w:sz="4"/>
+              <w:left w:val="single" w:color="B1B4B6" w:sz="4"/>
+              <w:bottom w:val="single" w:color="B1B4B6" w:sz="4"/>
+              <w:right w:val="single" w:color="B1B4B6" w:sz="4"/>
+            </w:tcBorders>
+            <w:tcMar>
+              <w:top w:type="dxa" w:w="40"/>
+              <w:left w:type="dxa" w:w="80"/>
+              <w:bottom w:type="dxa" w:w="40"/>
+              <w:right w:type="dxa" w:w="80"/>
+            </w:tcMar>
+          </w:tcPr>
+          <w:p>
+            <w:pPr>
+              <w:spacing w:after="0" w:line="240"/>
+            </w:pPr>
+            <w:r>
+              <w:rPr>
+                <w:b w:val="false"/>
+                <w:bCs w:val="false"/>
+                <w:sz w:val="16"/>
+                <w:szCs w:val="16"/>
+              </w:rPr>
+              <w:t xml:space="preserve">Fri 25 Sep 2026</w:t>
             </w:r>
           </w:p>
         </w:tc>
@@ -843,7 +1127,7 @@
           <w:sz w:val="19"/>
           <w:szCs w:val="19"/>
         </w:rPr>
-        <w:t xml:space="preserve">The short version: two days of build, eight days of everything else, and the only real risk is connectivity lead time that has not been started yet. Start it this week and the window holds.</w:t>
+        <w:t xml:space="preserve">If only one thing happens this week, make it the firewall and ONS requests. They are the only part of this plan that cannot be recovered by working harder later.</w:t>
       </w:r>
     </w:p>
     <w:p>
@@ -6254,7 +6538,7 @@
         <w:pStyle w:val="ListParagraph"/>
         <w:numPr>
           <w:ilvl w:val="0"/>
-          <w:numId w:val="2"/>
+          <w:numId w:val="3"/>
         </w:numPr>
         <w:spacing w:after="50"/>
       </w:pPr>
@@ -6271,7 +6555,7 @@
         <w:pStyle w:val="ListParagraph"/>
         <w:numPr>
           <w:ilvl w:val="0"/>
-          <w:numId w:val="2"/>
+          <w:numId w:val="3"/>
         </w:numPr>
         <w:spacing w:after="50"/>
       </w:pPr>
@@ -6288,7 +6572,7 @@
         <w:pStyle w:val="ListParagraph"/>
         <w:numPr>
           <w:ilvl w:val="0"/>
-          <w:numId w:val="2"/>
+          <w:numId w:val="3"/>
         </w:numPr>
         <w:spacing w:after="50"/>
       </w:pPr>
@@ -6305,7 +6589,7 @@
         <w:pStyle w:val="ListParagraph"/>
         <w:numPr>
           <w:ilvl w:val="0"/>
-          <w:numId w:val="2"/>
+          <w:numId w:val="3"/>
         </w:numPr>
         <w:spacing w:after="50"/>
       </w:pPr>
@@ -8301,6 +8585,12 @@
       <w:startOverride w:val="1"/>
     </w:lvlOverride>
   </w:num>
+  <w:num w:numId="3">
+    <w:abstractNumId w:val="2"/>
+    <w:lvlOverride w:ilvl="0">
+      <w:startOverride w:val="1"/>
+    </w:lvlOverride>
+  </w:num>
 </w:numbering>
 </file>
 

</xml_diff>

<commit_message>
Executive summary as three tables: summary, outcomes, decisions
</commit_message>
<xml_diff>
--- a/assets/mft-mvp-plan.docx
+++ b/assets/mft-mvp-plan.docx
@@ -84,41 +84,795 @@
         <w:t xml:space="preserve">0. Executive summary</w:t>
       </w:r>
     </w:p>
+    <w:tbl>
+      <w:tblPr>
+        <w:tblW w:type="dxa" w:w="10306"/>
+        <w:tblBorders>
+          <w:top w:val="single" w:color="auto" w:sz="4"/>
+          <w:left w:val="single" w:color="auto" w:sz="4"/>
+          <w:bottom w:val="single" w:color="auto" w:sz="4"/>
+          <w:right w:val="single" w:color="auto" w:sz="4"/>
+          <w:insideH w:val="single" w:color="auto" w:sz="4"/>
+          <w:insideV w:val="single" w:color="auto" w:sz="4"/>
+        </w:tblBorders>
+      </w:tblPr>
+      <w:tblGrid>
+        <w:gridCol w:w="2473"/>
+        <w:gridCol w:w="7833"/>
+      </w:tblGrid>
+      <w:tr>
+        <w:tc>
+          <w:tcPr>
+            <w:tcW w:type="dxa" w:w="2473"/>
+            <w:tcBorders>
+              <w:top w:val="single" w:color="B1B4B6" w:sz="4"/>
+              <w:left w:val="single" w:color="B1B4B6" w:sz="4"/>
+              <w:bottom w:val="single" w:color="B1B4B6" w:sz="4"/>
+              <w:right w:val="single" w:color="B1B4B6" w:sz="4"/>
+            </w:tcBorders>
+            <w:tcMar>
+              <w:top w:type="dxa" w:w="40"/>
+              <w:left w:type="dxa" w:w="80"/>
+              <w:bottom w:type="dxa" w:w="40"/>
+              <w:right w:type="dxa" w:w="80"/>
+            </w:tcMar>
+          </w:tcPr>
+          <w:p>
+            <w:pPr>
+              <w:spacing w:after="0" w:line="240"/>
+            </w:pPr>
+            <w:r>
+              <w:rPr>
+                <w:b w:val="false"/>
+                <w:bCs w:val="false"/>
+                <w:sz w:val="16"/>
+                <w:szCs w:val="16"/>
+              </w:rPr>
+              <w:t xml:space="preserve">What we are doing</w:t>
+            </w:r>
+          </w:p>
+        </w:tc>
+        <w:tc>
+          <w:tcPr>
+            <w:tcW w:type="dxa" w:w="7833"/>
+            <w:tcBorders>
+              <w:top w:val="single" w:color="B1B4B6" w:sz="4"/>
+              <w:left w:val="single" w:color="B1B4B6" w:sz="4"/>
+              <w:bottom w:val="single" w:color="B1B4B6" w:sz="4"/>
+              <w:right w:val="single" w:color="B1B4B6" w:sz="4"/>
+            </w:tcBorders>
+            <w:tcMar>
+              <w:top w:type="dxa" w:w="40"/>
+              <w:left w:type="dxa" w:w="80"/>
+              <w:bottom w:type="dxa" w:w="40"/>
+              <w:right w:type="dxa" w:w="80"/>
+            </w:tcMar>
+          </w:tcPr>
+          <w:p>
+            <w:pPr>
+              <w:spacing w:after="0" w:line="240"/>
+            </w:pPr>
+            <w:r>
+              <w:rPr>
+                <w:b w:val="false"/>
+                <w:bCs w:val="false"/>
+                <w:sz w:val="16"/>
+                <w:szCs w:val="16"/>
+              </w:rPr>
+              <w:t xml:space="preserve">Move feed ADR.040 off its legacy transfer mechanisms onto Boomi MFT, and evidence the result well enough for a go or no-go decision.</w:t>
+            </w:r>
+          </w:p>
+        </w:tc>
+      </w:tr>
+      <w:tr>
+        <w:tc>
+          <w:tcPr>
+            <w:tcW w:type="dxa" w:w="2473"/>
+            <w:tcBorders>
+              <w:top w:val="single" w:color="B1B4B6" w:sz="4"/>
+              <w:left w:val="single" w:color="B1B4B6" w:sz="4"/>
+              <w:bottom w:val="single" w:color="B1B4B6" w:sz="4"/>
+              <w:right w:val="single" w:color="B1B4B6" w:sz="4"/>
+            </w:tcBorders>
+            <w:tcMar>
+              <w:top w:type="dxa" w:w="40"/>
+              <w:left w:type="dxa" w:w="80"/>
+              <w:bottom w:type="dxa" w:w="40"/>
+              <w:right w:type="dxa" w:w="80"/>
+            </w:tcMar>
+          </w:tcPr>
+          <w:p>
+            <w:pPr>
+              <w:spacing w:after="0" w:line="240"/>
+            </w:pPr>
+            <w:r>
+              <w:rPr>
+                <w:b w:val="false"/>
+                <w:bCs w:val="false"/>
+                <w:sz w:val="16"/>
+                <w:szCs w:val="16"/>
+              </w:rPr>
+              <w:t xml:space="preserve">Candidate</w:t>
+            </w:r>
+          </w:p>
+        </w:tc>
+        <w:tc>
+          <w:tcPr>
+            <w:tcW w:type="dxa" w:w="7833"/>
+            <w:tcBorders>
+              <w:top w:val="single" w:color="B1B4B6" w:sz="4"/>
+              <w:left w:val="single" w:color="B1B4B6" w:sz="4"/>
+              <w:bottom w:val="single" w:color="B1B4B6" w:sz="4"/>
+              <w:right w:val="single" w:color="B1B4B6" w:sz="4"/>
+            </w:tcBorders>
+            <w:tcMar>
+              <w:top w:type="dxa" w:w="40"/>
+              <w:left w:type="dxa" w:w="80"/>
+              <w:bottom w:type="dxa" w:w="40"/>
+              <w:right w:type="dxa" w:w="80"/>
+            </w:tcMar>
+          </w:tcPr>
+          <w:p>
+            <w:pPr>
+              <w:spacing w:after="0" w:line="240"/>
+            </w:pPr>
+            <w:r>
+              <w:rPr>
+                <w:b w:val="false"/>
+                <w:bCs w:val="false"/>
+                <w:sz w:val="16"/>
+                <w:szCs w:val="16"/>
+              </w:rPr>
+              <w:t xml:space="preserve">ADR.040 Migrant Workers Scan. Quarterly, one file per cycle, live in production. The only feed identified that carries both transfer patterns in a single business flow.</w:t>
+            </w:r>
+          </w:p>
+        </w:tc>
+      </w:tr>
+      <w:tr>
+        <w:tc>
+          <w:tcPr>
+            <w:tcW w:type="dxa" w:w="2473"/>
+            <w:tcBorders>
+              <w:top w:val="single" w:color="B1B4B6" w:sz="4"/>
+              <w:left w:val="single" w:color="B1B4B6" w:sz="4"/>
+              <w:bottom w:val="single" w:color="B1B4B6" w:sz="4"/>
+              <w:right w:val="single" w:color="B1B4B6" w:sz="4"/>
+            </w:tcBorders>
+            <w:tcMar>
+              <w:top w:type="dxa" w:w="40"/>
+              <w:left w:type="dxa" w:w="80"/>
+              <w:bottom w:type="dxa" w:w="40"/>
+              <w:right w:type="dxa" w:w="80"/>
+            </w:tcMar>
+          </w:tcPr>
+          <w:p>
+            <w:pPr>
+              <w:spacing w:after="0" w:line="240"/>
+            </w:pPr>
+            <w:r>
+              <w:rPr>
+                <w:b w:val="false"/>
+                <w:bCs w:val="false"/>
+                <w:sz w:val="16"/>
+                <w:szCs w:val="16"/>
+              </w:rPr>
+              <w:t xml:space="preserve">Scope</w:t>
+            </w:r>
+          </w:p>
+        </w:tc>
+        <w:tc>
+          <w:tcPr>
+            <w:tcW w:type="dxa" w:w="7833"/>
+            <w:tcBorders>
+              <w:top w:val="single" w:color="B1B4B6" w:sz="4"/>
+              <w:left w:val="single" w:color="B1B4B6" w:sz="4"/>
+              <w:bottom w:val="single" w:color="B1B4B6" w:sz="4"/>
+              <w:right w:val="single" w:color="B1B4B6" w:sz="4"/>
+            </w:tcBorders>
+            <w:tcMar>
+              <w:top w:type="dxa" w:w="40"/>
+              <w:left w:type="dxa" w:w="80"/>
+              <w:bottom w:type="dxa" w:w="40"/>
+              <w:right w:type="dxa" w:w="80"/>
+            </w:tcMar>
+          </w:tcPr>
+          <w:p>
+            <w:pPr>
+              <w:spacing w:after="0" w:line="240"/>
+            </w:pPr>
+            <w:r>
+              <w:rPr>
+                <w:b w:val="false"/>
+                <w:bCs w:val="false"/>
+                <w:sz w:val="16"/>
+                <w:szCs w:val="16"/>
+              </w:rPr>
+              <w:t xml:space="preserve">Leg A, NPS into the ADR landing area, internal, replacing UTM. Leg B, ADR output area direct to ONS, external, removing an insecure server hop.</w:t>
+            </w:r>
+          </w:p>
+        </w:tc>
+      </w:tr>
+      <w:tr>
+        <w:tc>
+          <w:tcPr>
+            <w:tcW w:type="dxa" w:w="2473"/>
+            <w:tcBorders>
+              <w:top w:val="single" w:color="B1B4B6" w:sz="4"/>
+              <w:left w:val="single" w:color="B1B4B6" w:sz="4"/>
+              <w:bottom w:val="single" w:color="B1B4B6" w:sz="4"/>
+              <w:right w:val="single" w:color="B1B4B6" w:sz="4"/>
+            </w:tcBorders>
+            <w:tcMar>
+              <w:top w:type="dxa" w:w="40"/>
+              <w:left w:type="dxa" w:w="80"/>
+              <w:bottom w:type="dxa" w:w="40"/>
+              <w:right w:type="dxa" w:w="80"/>
+            </w:tcMar>
+          </w:tcPr>
+          <w:p>
+            <w:pPr>
+              <w:spacing w:after="0" w:line="240"/>
+            </w:pPr>
+            <w:r>
+              <w:rPr>
+                <w:b w:val="false"/>
+                <w:bCs w:val="false"/>
+                <w:sz w:val="16"/>
+                <w:szCs w:val="16"/>
+              </w:rPr>
+              <w:t xml:space="preserve">Why now</w:t>
+            </w:r>
+          </w:p>
+        </w:tc>
+        <w:tc>
+          <w:tcPr>
+            <w:tcW w:type="dxa" w:w="7833"/>
+            <w:tcBorders>
+              <w:top w:val="single" w:color="B1B4B6" w:sz="4"/>
+              <w:left w:val="single" w:color="B1B4B6" w:sz="4"/>
+              <w:bottom w:val="single" w:color="B1B4B6" w:sz="4"/>
+              <w:right w:val="single" w:color="B1B4B6" w:sz="4"/>
+            </w:tcBorders>
+            <w:tcMar>
+              <w:top w:type="dxa" w:w="40"/>
+              <w:left w:type="dxa" w:w="80"/>
+              <w:bottom w:type="dxa" w:w="40"/>
+              <w:right w:type="dxa" w:w="80"/>
+            </w:tcMar>
+          </w:tcPr>
+          <w:p>
+            <w:pPr>
+              <w:spacing w:after="0" w:line="240"/>
+            </w:pPr>
+            <w:r>
+              <w:rPr>
+                <w:b w:val="false"/>
+                <w:bCs w:val="false"/>
+                <w:sz w:val="16"/>
+                <w:szCs w:val="16"/>
+              </w:rPr>
+              <w:t xml:space="preserve">The wider onboarding plan assumes that adding an interface to Boomi MFT is configuration work rather than development work. Nothing has tested that. This tests it twice, inside the estate and across a departmental boundary, for two days of build effort.</w:t>
+            </w:r>
+          </w:p>
+        </w:tc>
+      </w:tr>
+      <w:tr>
+        <w:tc>
+          <w:tcPr>
+            <w:tcW w:type="dxa" w:w="2473"/>
+            <w:tcBorders>
+              <w:top w:val="single" w:color="B1B4B6" w:sz="4"/>
+              <w:left w:val="single" w:color="B1B4B6" w:sz="4"/>
+              <w:bottom w:val="single" w:color="B1B4B6" w:sz="4"/>
+              <w:right w:val="single" w:color="B1B4B6" w:sz="4"/>
+            </w:tcBorders>
+            <w:tcMar>
+              <w:top w:type="dxa" w:w="40"/>
+              <w:left w:type="dxa" w:w="80"/>
+              <w:bottom w:type="dxa" w:w="40"/>
+              <w:right w:type="dxa" w:w="80"/>
+            </w:tcMar>
+          </w:tcPr>
+          <w:p>
+            <w:pPr>
+              <w:spacing w:after="0" w:line="240"/>
+            </w:pPr>
+            <w:r>
+              <w:rPr>
+                <w:b w:val="false"/>
+                <w:bCs w:val="false"/>
+                <w:sz w:val="16"/>
+                <w:szCs w:val="16"/>
+              </w:rPr>
+              <w:t xml:space="preserve">Window</w:t>
+            </w:r>
+          </w:p>
+        </w:tc>
+        <w:tc>
+          <w:tcPr>
+            <w:tcW w:type="dxa" w:w="7833"/>
+            <w:tcBorders>
+              <w:top w:val="single" w:color="B1B4B6" w:sz="4"/>
+              <w:left w:val="single" w:color="B1B4B6" w:sz="4"/>
+              <w:bottom w:val="single" w:color="B1B4B6" w:sz="4"/>
+              <w:right w:val="single" w:color="B1B4B6" w:sz="4"/>
+            </w:tcBorders>
+            <w:tcMar>
+              <w:top w:type="dxa" w:w="40"/>
+              <w:left w:type="dxa" w:w="80"/>
+              <w:bottom w:type="dxa" w:w="40"/>
+              <w:right w:type="dxa" w:w="80"/>
+            </w:tcMar>
+          </w:tcPr>
+          <w:p>
+            <w:pPr>
+              <w:spacing w:after="0" w:line="240"/>
+            </w:pPr>
+            <w:r>
+              <w:rPr>
+                <w:b w:val="false"/>
+                <w:bCs w:val="false"/>
+                <w:sz w:val="16"/>
+                <w:szCs w:val="16"/>
+              </w:rPr>
+              <w:t xml:space="preserve">Monday 28 September to Friday 9 October 2026. Ten working days.</w:t>
+            </w:r>
+          </w:p>
+        </w:tc>
+      </w:tr>
+      <w:tr>
+        <w:tc>
+          <w:tcPr>
+            <w:tcW w:type="dxa" w:w="2473"/>
+            <w:tcBorders>
+              <w:top w:val="single" w:color="B1B4B6" w:sz="4"/>
+              <w:left w:val="single" w:color="B1B4B6" w:sz="4"/>
+              <w:bottom w:val="single" w:color="B1B4B6" w:sz="4"/>
+              <w:right w:val="single" w:color="B1B4B6" w:sz="4"/>
+            </w:tcBorders>
+            <w:tcMar>
+              <w:top w:type="dxa" w:w="40"/>
+              <w:left w:type="dxa" w:w="80"/>
+              <w:bottom w:type="dxa" w:w="40"/>
+              <w:right w:type="dxa" w:w="80"/>
+            </w:tcMar>
+          </w:tcPr>
+          <w:p>
+            <w:pPr>
+              <w:spacing w:after="0" w:line="240"/>
+            </w:pPr>
+            <w:r>
+              <w:rPr>
+                <w:b w:val="false"/>
+                <w:bCs w:val="false"/>
+                <w:sz w:val="16"/>
+                <w:szCs w:val="16"/>
+              </w:rPr>
+              <w:t xml:space="preserve">Build effort</w:t>
+            </w:r>
+          </w:p>
+        </w:tc>
+        <w:tc>
+          <w:tcPr>
+            <w:tcW w:type="dxa" w:w="7833"/>
+            <w:tcBorders>
+              <w:top w:val="single" w:color="B1B4B6" w:sz="4"/>
+              <w:left w:val="single" w:color="B1B4B6" w:sz="4"/>
+              <w:bottom w:val="single" w:color="B1B4B6" w:sz="4"/>
+              <w:right w:val="single" w:color="B1B4B6" w:sz="4"/>
+            </w:tcBorders>
+            <w:tcMar>
+              <w:top w:type="dxa" w:w="40"/>
+              <w:left w:type="dxa" w:w="80"/>
+              <w:bottom w:type="dxa" w:w="40"/>
+              <w:right w:type="dxa" w:w="80"/>
+            </w:tcMar>
+          </w:tcPr>
+          <w:p>
+            <w:pPr>
+              <w:spacing w:after="0" w:line="240"/>
+            </w:pPr>
+            <w:r>
+              <w:rPr>
+                <w:b w:val="false"/>
+                <w:bCs w:val="false"/>
+                <w:sz w:val="16"/>
+                <w:szCs w:val="16"/>
+              </w:rPr>
+              <w:t xml:space="preserve">Two days. The other eight are discovery, connectivity, testing and handover.</w:t>
+            </w:r>
+          </w:p>
+        </w:tc>
+      </w:tr>
+      <w:tr>
+        <w:tc>
+          <w:tcPr>
+            <w:tcW w:type="dxa" w:w="2473"/>
+            <w:tcBorders>
+              <w:top w:val="single" w:color="B1B4B6" w:sz="4"/>
+              <w:left w:val="single" w:color="B1B4B6" w:sz="4"/>
+              <w:bottom w:val="single" w:color="B1B4B6" w:sz="4"/>
+              <w:right w:val="single" w:color="B1B4B6" w:sz="4"/>
+            </w:tcBorders>
+            <w:tcMar>
+              <w:top w:type="dxa" w:w="40"/>
+              <w:left w:type="dxa" w:w="80"/>
+              <w:bottom w:type="dxa" w:w="40"/>
+              <w:right w:type="dxa" w:w="80"/>
+            </w:tcMar>
+          </w:tcPr>
+          <w:p>
+            <w:pPr>
+              <w:spacing w:after="0" w:line="240"/>
+            </w:pPr>
+            <w:r>
+              <w:rPr>
+                <w:b w:val="false"/>
+                <w:bCs w:val="false"/>
+                <w:sz w:val="16"/>
+                <w:szCs w:val="16"/>
+              </w:rPr>
+              <w:t xml:space="preserve">New components</w:t>
+            </w:r>
+          </w:p>
+        </w:tc>
+        <w:tc>
+          <w:tcPr>
+            <w:tcW w:type="dxa" w:w="7833"/>
+            <w:tcBorders>
+              <w:top w:val="single" w:color="B1B4B6" w:sz="4"/>
+              <w:left w:val="single" w:color="B1B4B6" w:sz="4"/>
+              <w:bottom w:val="single" w:color="B1B4B6" w:sz="4"/>
+              <w:right w:val="single" w:color="B1B4B6" w:sz="4"/>
+            </w:tcBorders>
+            <w:tcMar>
+              <w:top w:type="dxa" w:w="40"/>
+              <w:left w:type="dxa" w:w="80"/>
+              <w:bottom w:type="dxa" w:w="40"/>
+              <w:right w:type="dxa" w:w="80"/>
+            </w:tcMar>
+          </w:tcPr>
+          <w:p>
+            <w:pPr>
+              <w:spacing w:after="0" w:line="240"/>
+            </w:pPr>
+            <w:r>
+              <w:rPr>
+                <w:b w:val="false"/>
+                <w:bCs w:val="false"/>
+                <w:sz w:val="16"/>
+                <w:szCs w:val="16"/>
+              </w:rPr>
+              <w:t xml:space="preserve">None. Two configuration rows on the existing generic engine.</w:t>
+            </w:r>
+          </w:p>
+        </w:tc>
+      </w:tr>
+      <w:tr>
+        <w:tc>
+          <w:tcPr>
+            <w:tcW w:type="dxa" w:w="2473"/>
+            <w:tcBorders>
+              <w:top w:val="single" w:color="B1B4B6" w:sz="4"/>
+              <w:left w:val="single" w:color="B1B4B6" w:sz="4"/>
+              <w:bottom w:val="single" w:color="B1B4B6" w:sz="4"/>
+              <w:right w:val="single" w:color="B1B4B6" w:sz="4"/>
+            </w:tcBorders>
+            <w:tcMar>
+              <w:top w:type="dxa" w:w="40"/>
+              <w:left w:type="dxa" w:w="80"/>
+              <w:bottom w:type="dxa" w:w="40"/>
+              <w:right w:type="dxa" w:w="80"/>
+            </w:tcMar>
+          </w:tcPr>
+          <w:p>
+            <w:pPr>
+              <w:spacing w:after="0" w:line="240"/>
+            </w:pPr>
+            <w:r>
+              <w:rPr>
+                <w:b w:val="false"/>
+                <w:bCs w:val="false"/>
+                <w:sz w:val="16"/>
+                <w:szCs w:val="16"/>
+              </w:rPr>
+              <w:t xml:space="preserve">Side benefit</w:t>
+            </w:r>
+          </w:p>
+        </w:tc>
+        <w:tc>
+          <w:tcPr>
+            <w:tcW w:type="dxa" w:w="7833"/>
+            <w:tcBorders>
+              <w:top w:val="single" w:color="B1B4B6" w:sz="4"/>
+              <w:left w:val="single" w:color="B1B4B6" w:sz="4"/>
+              <w:bottom w:val="single" w:color="B1B4B6" w:sz="4"/>
+              <w:right w:val="single" w:color="B1B4B6" w:sz="4"/>
+            </w:tcBorders>
+            <w:tcMar>
+              <w:top w:type="dxa" w:w="40"/>
+              <w:left w:type="dxa" w:w="80"/>
+              <w:bottom w:type="dxa" w:w="40"/>
+              <w:right w:type="dxa" w:w="80"/>
+            </w:tcMar>
+          </w:tcPr>
+          <w:p>
+            <w:pPr>
+              <w:spacing w:after="0" w:line="240"/>
+            </w:pPr>
+            <w:r>
+              <w:rPr>
+                <w:b w:val="false"/>
+                <w:bCs w:val="false"/>
+                <w:sz w:val="16"/>
+                <w:szCs w:val="16"/>
+              </w:rPr>
+              <w:t xml:space="preserve">Removes the Insecure IF server hop from the outbound path, whatever the platform decision turns out to be.</w:t>
+            </w:r>
+          </w:p>
+        </w:tc>
+      </w:tr>
+      <w:tr>
+        <w:tc>
+          <w:tcPr>
+            <w:tcW w:type="dxa" w:w="2473"/>
+            <w:tcBorders>
+              <w:top w:val="single" w:color="B1B4B6" w:sz="4"/>
+              <w:left w:val="single" w:color="B1B4B6" w:sz="4"/>
+              <w:bottom w:val="single" w:color="B1B4B6" w:sz="4"/>
+              <w:right w:val="single" w:color="B1B4B6" w:sz="4"/>
+            </w:tcBorders>
+            <w:tcMar>
+              <w:top w:type="dxa" w:w="40"/>
+              <w:left w:type="dxa" w:w="80"/>
+              <w:bottom w:type="dxa" w:w="40"/>
+              <w:right w:type="dxa" w:w="80"/>
+            </w:tcMar>
+          </w:tcPr>
+          <w:p>
+            <w:pPr>
+              <w:spacing w:after="0" w:line="240"/>
+            </w:pPr>
+            <w:r>
+              <w:rPr>
+                <w:b w:val="false"/>
+                <w:bCs w:val="false"/>
+                <w:sz w:val="16"/>
+                <w:szCs w:val="16"/>
+              </w:rPr>
+              <w:t xml:space="preserve">Known dependency</w:t>
+            </w:r>
+          </w:p>
+        </w:tc>
+        <w:tc>
+          <w:tcPr>
+            <w:tcW w:type="dxa" w:w="7833"/>
+            <w:tcBorders>
+              <w:top w:val="single" w:color="B1B4B6" w:sz="4"/>
+              <w:left w:val="single" w:color="B1B4B6" w:sz="4"/>
+              <w:bottom w:val="single" w:color="B1B4B6" w:sz="4"/>
+              <w:right w:val="single" w:color="B1B4B6" w:sz="4"/>
+            </w:tcBorders>
+            <w:tcMar>
+              <w:top w:type="dxa" w:w="40"/>
+              <w:left w:type="dxa" w:w="80"/>
+              <w:bottom w:type="dxa" w:w="40"/>
+              <w:right w:type="dxa" w:w="80"/>
+            </w:tcMar>
+          </w:tcPr>
+          <w:p>
+            <w:pPr>
+              <w:spacing w:after="0" w:line="240"/>
+            </w:pPr>
+            <w:r>
+              <w:rPr>
+                <w:b w:val="false"/>
+                <w:bCs w:val="false"/>
+                <w:sz w:val="16"/>
+                <w:szCs w:val="16"/>
+              </w:rPr>
+              <w:t xml:space="preserve">ADR to Data Lake migration. Build now against the current endpoints and re-point as a configuration change when the warehouse migrates. Option 1 in section 5.</w:t>
+            </w:r>
+          </w:p>
+        </w:tc>
+      </w:tr>
+      <w:tr>
+        <w:tc>
+          <w:tcPr>
+            <w:tcW w:type="dxa" w:w="2473"/>
+            <w:tcBorders>
+              <w:top w:val="single" w:color="B1B4B6" w:sz="4"/>
+              <w:left w:val="single" w:color="B1B4B6" w:sz="4"/>
+              <w:bottom w:val="single" w:color="B1B4B6" w:sz="4"/>
+              <w:right w:val="single" w:color="B1B4B6" w:sz="4"/>
+            </w:tcBorders>
+            <w:tcMar>
+              <w:top w:type="dxa" w:w="40"/>
+              <w:left w:type="dxa" w:w="80"/>
+              <w:bottom w:type="dxa" w:w="40"/>
+              <w:right w:type="dxa" w:w="80"/>
+            </w:tcMar>
+          </w:tcPr>
+          <w:p>
+            <w:pPr>
+              <w:spacing w:after="0" w:line="240"/>
+            </w:pPr>
+            <w:r>
+              <w:rPr>
+                <w:b w:val="false"/>
+                <w:bCs w:val="false"/>
+                <w:sz w:val="16"/>
+                <w:szCs w:val="16"/>
+              </w:rPr>
+              <w:t xml:space="preserve">Main risk</w:t>
+            </w:r>
+          </w:p>
+        </w:tc>
+        <w:tc>
+          <w:tcPr>
+            <w:tcW w:type="dxa" w:w="7833"/>
+            <w:tcBorders>
+              <w:top w:val="single" w:color="B1B4B6" w:sz="4"/>
+              <w:left w:val="single" w:color="B1B4B6" w:sz="4"/>
+              <w:bottom w:val="single" w:color="B1B4B6" w:sz="4"/>
+              <w:right w:val="single" w:color="B1B4B6" w:sz="4"/>
+            </w:tcBorders>
+            <w:tcMar>
+              <w:top w:type="dxa" w:w="40"/>
+              <w:left w:type="dxa" w:w="80"/>
+              <w:bottom w:type="dxa" w:w="40"/>
+              <w:right w:type="dxa" w:w="80"/>
+            </w:tcMar>
+          </w:tcPr>
+          <w:p>
+            <w:pPr>
+              <w:spacing w:after="0" w:line="240"/>
+            </w:pPr>
+            <w:r>
+              <w:rPr>
+                <w:b w:val="false"/>
+                <w:bCs w:val="false"/>
+                <w:sz w:val="16"/>
+                <w:szCs w:val="16"/>
+              </w:rPr>
+              <w:t xml:space="preserve">Firewall changes and the ONS agreement to receive from a new sending endpoint. Lead times that do not compress by working harder, and neither has been started.</w:t>
+            </w:r>
+          </w:p>
+        </w:tc>
+      </w:tr>
+      <w:tr>
+        <w:tc>
+          <w:tcPr>
+            <w:tcW w:type="dxa" w:w="2473"/>
+            <w:tcBorders>
+              <w:top w:val="single" w:color="B1B4B6" w:sz="4"/>
+              <w:left w:val="single" w:color="B1B4B6" w:sz="4"/>
+              <w:bottom w:val="single" w:color="B1B4B6" w:sz="4"/>
+              <w:right w:val="single" w:color="B1B4B6" w:sz="4"/>
+            </w:tcBorders>
+            <w:tcMar>
+              <w:top w:type="dxa" w:w="40"/>
+              <w:left w:type="dxa" w:w="80"/>
+              <w:bottom w:type="dxa" w:w="40"/>
+              <w:right w:type="dxa" w:w="80"/>
+            </w:tcMar>
+          </w:tcPr>
+          <w:p>
+            <w:pPr>
+              <w:spacing w:after="0" w:line="240"/>
+            </w:pPr>
+            <w:r>
+              <w:rPr>
+                <w:b w:val="false"/>
+                <w:bCs w:val="false"/>
+                <w:sz w:val="16"/>
+                <w:szCs w:val="16"/>
+              </w:rPr>
+              <w:t xml:space="preserve">Fallback</w:t>
+            </w:r>
+          </w:p>
+        </w:tc>
+        <w:tc>
+          <w:tcPr>
+            <w:tcW w:type="dxa" w:w="7833"/>
+            <w:tcBorders>
+              <w:top w:val="single" w:color="B1B4B6" w:sz="4"/>
+              <w:left w:val="single" w:color="B1B4B6" w:sz="4"/>
+              <w:bottom w:val="single" w:color="B1B4B6" w:sz="4"/>
+              <w:right w:val="single" w:color="B1B4B6" w:sz="4"/>
+            </w:tcBorders>
+            <w:tcMar>
+              <w:top w:type="dxa" w:w="40"/>
+              <w:left w:type="dxa" w:w="80"/>
+              <w:bottom w:type="dxa" w:w="40"/>
+              <w:right w:type="dxa" w:w="80"/>
+            </w:tcMar>
+          </w:tcPr>
+          <w:p>
+            <w:pPr>
+              <w:spacing w:after="0" w:line="240"/>
+            </w:pPr>
+            <w:r>
+              <w:rPr>
+                <w:b w:val="false"/>
+                <w:bCs w:val="false"/>
+                <w:sz w:val="16"/>
+                <w:szCs w:val="16"/>
+              </w:rPr>
+              <w:t xml:space="preserve">If ONS is not ready in time, leg A still delivers inside the window and leg B follows within days of the external path opening.</w:t>
+            </w:r>
+          </w:p>
+        </w:tc>
+      </w:tr>
+      <w:tr>
+        <w:tc>
+          <w:tcPr>
+            <w:tcW w:type="dxa" w:w="2473"/>
+            <w:tcBorders>
+              <w:top w:val="single" w:color="B1B4B6" w:sz="4"/>
+              <w:left w:val="single" w:color="B1B4B6" w:sz="4"/>
+              <w:bottom w:val="single" w:color="B1B4B6" w:sz="4"/>
+              <w:right w:val="single" w:color="B1B4B6" w:sz="4"/>
+            </w:tcBorders>
+            <w:tcMar>
+              <w:top w:type="dxa" w:w="40"/>
+              <w:left w:type="dxa" w:w="80"/>
+              <w:bottom w:type="dxa" w:w="40"/>
+              <w:right w:type="dxa" w:w="80"/>
+            </w:tcMar>
+          </w:tcPr>
+          <w:p>
+            <w:pPr>
+              <w:spacing w:after="0" w:line="240"/>
+            </w:pPr>
+            <w:r>
+              <w:rPr>
+                <w:b w:val="false"/>
+                <w:bCs w:val="false"/>
+                <w:sz w:val="16"/>
+                <w:szCs w:val="16"/>
+              </w:rPr>
+              <w:t xml:space="preserve">Cost of not doing it</w:t>
+            </w:r>
+          </w:p>
+        </w:tc>
+        <w:tc>
+          <w:tcPr>
+            <w:tcW w:type="dxa" w:w="7833"/>
+            <w:tcBorders>
+              <w:top w:val="single" w:color="B1B4B6" w:sz="4"/>
+              <w:left w:val="single" w:color="B1B4B6" w:sz="4"/>
+              <w:bottom w:val="single" w:color="B1B4B6" w:sz="4"/>
+              <w:right w:val="single" w:color="B1B4B6" w:sz="4"/>
+            </w:tcBorders>
+            <w:tcMar>
+              <w:top w:type="dxa" w:w="40"/>
+              <w:left w:type="dxa" w:w="80"/>
+              <w:bottom w:type="dxa" w:w="40"/>
+              <w:right w:type="dxa" w:w="80"/>
+            </w:tcMar>
+          </w:tcPr>
+          <w:p>
+            <w:pPr>
+              <w:spacing w:after="0" w:line="240"/>
+            </w:pPr>
+            <w:r>
+              <w:rPr>
+                <w:b w:val="false"/>
+                <w:bCs w:val="false"/>
+                <w:sz w:val="16"/>
+                <w:szCs w:val="16"/>
+              </w:rPr>
+              <w:t xml:space="preserve">The onboarding estimate behind the wider programme stays an assumption, and the insecure hop stays in the outbound path.</w:t>
+            </w:r>
+          </w:p>
+        </w:tc>
+      </w:tr>
+    </w:tbl>
     <w:p>
       <w:pPr>
-        <w:spacing w:after="100"/>
+        <w:spacing w:after="40"/>
       </w:pPr>
-      <w:r>
-        <w:rPr>
-          <w:sz w:val="19"/>
-          <w:szCs w:val="19"/>
-        </w:rPr>
-        <w:t xml:space="preserve">One feed, two boundaries, ten working days. We move feed ADR.040, the quarterly Migrant Workers Scan, off its legacy transfer mechanisms and onto Boomi MFT. Leg A replaces UTM inside the estate. Leg B goes direct to ONS and removes a server the current path itself labels insecure. Configuration is two days; the other eight are discovery, proving and handover.</w:t>
-      </w:r>
-    </w:p>
-    <w:p>
-      <w:pPr>
-        <w:spacing w:after="100"/>
-      </w:pPr>
-      <w:r>
-        <w:rPr>
-          <w:sz w:val="19"/>
-          <w:szCs w:val="19"/>
-        </w:rPr>
-        <w:t xml:space="preserve">The reason to do this now is not the feed. The wider onboarding plan assumes that adding an interface to Boomi MFT is configuration work rather than development work, and nothing has tested that assumption. ADR.040 tests it twice, once inside the estate and once across a departmental boundary, on one dataset and one owner community, for two days of build effort. If it holds we can price the rest of the estate with confidence. If it does not, we find out now rather than after committing a programme to it.</w:t>
-      </w:r>
-    </w:p>
-    <w:p>
-      <w:pPr>
-        <w:spacing w:after="100"/>
-      </w:pPr>
-      <w:r>
-        <w:rPr>
-          <w:sz w:val="19"/>
-          <w:szCs w:val="19"/>
-        </w:rPr>
-        <w:t xml:space="preserve">The risk is not technical. Firewall changes and the agreement from ONS to receive from a new sending endpoint have lead times that do not compress, and neither has been started. Raise both this week and the window holds. If ONS is not ready in time, leg A still delivers inside the window and leg B follows within days of the external path opening.</w:t>
-      </w:r>
     </w:p>
     <w:p>
       <w:pPr>
@@ -126,7 +880,7 @@
         <w:spacing w:after="60" w:before="140"/>
       </w:pPr>
       <w:r>
-        <w:t xml:space="preserve">At a glance</w:t>
+        <w:t xml:space="preserve">What we will know on 9 October</w:t>
       </w:r>
     </w:p>
     <w:tbl>
@@ -142,69 +896,69 @@
         </w:tblBorders>
       </w:tblPr>
       <w:tblGrid>
-        <w:gridCol w:w="2680"/>
-        <w:gridCol w:w="7626"/>
+        <w:gridCol w:w="2473"/>
+        <w:gridCol w:w="7833"/>
       </w:tblGrid>
       <w:tr>
         <w:tc>
           <w:tcPr>
-            <w:tcW w:type="dxa" w:w="2680"/>
-            <w:tcBorders>
-              <w:top w:val="single" w:color="B1B4B6" w:sz="4"/>
-              <w:left w:val="single" w:color="B1B4B6" w:sz="4"/>
-              <w:bottom w:val="single" w:color="B1B4B6" w:sz="4"/>
-              <w:right w:val="single" w:color="B1B4B6" w:sz="4"/>
-            </w:tcBorders>
-            <w:tcMar>
-              <w:top w:type="dxa" w:w="40"/>
-              <w:left w:type="dxa" w:w="80"/>
-              <w:bottom w:type="dxa" w:w="40"/>
-              <w:right w:type="dxa" w:w="80"/>
-            </w:tcMar>
-          </w:tcPr>
-          <w:p>
-            <w:pPr>
-              <w:spacing w:after="0" w:line="240"/>
-            </w:pPr>
-            <w:r>
-              <w:rPr>
-                <w:b w:val="false"/>
-                <w:bCs w:val="false"/>
-                <w:sz w:val="16"/>
-                <w:szCs w:val="16"/>
-              </w:rPr>
-              <w:t xml:space="preserve">Candidate</w:t>
-            </w:r>
-          </w:p>
-        </w:tc>
-        <w:tc>
-          <w:tcPr>
-            <w:tcW w:type="dxa" w:w="7626"/>
-            <w:tcBorders>
-              <w:top w:val="single" w:color="B1B4B6" w:sz="4"/>
-              <w:left w:val="single" w:color="B1B4B6" w:sz="4"/>
-              <w:bottom w:val="single" w:color="B1B4B6" w:sz="4"/>
-              <w:right w:val="single" w:color="B1B4B6" w:sz="4"/>
-            </w:tcBorders>
-            <w:tcMar>
-              <w:top w:type="dxa" w:w="40"/>
-              <w:left w:type="dxa" w:w="80"/>
-              <w:bottom w:type="dxa" w:w="40"/>
-              <w:right w:type="dxa" w:w="80"/>
-            </w:tcMar>
-          </w:tcPr>
-          <w:p>
-            <w:pPr>
-              <w:spacing w:after="0" w:line="240"/>
-            </w:pPr>
-            <w:r>
-              <w:rPr>
-                <w:b w:val="false"/>
-                <w:bCs w:val="false"/>
-                <w:sz w:val="16"/>
-                <w:szCs w:val="16"/>
-              </w:rPr>
-              <w:t xml:space="preserve">ADR.040 Migrant Workers Scan. Quarterly, one file per cycle, live in production today</w:t>
+            <w:tcW w:type="dxa" w:w="2473"/>
+            <w:tcBorders>
+              <w:top w:val="single" w:color="B1B4B6" w:sz="4"/>
+              <w:left w:val="single" w:color="B1B4B6" w:sz="4"/>
+              <w:bottom w:val="single" w:color="B1B4B6" w:sz="4"/>
+              <w:right w:val="single" w:color="B1B4B6" w:sz="4"/>
+            </w:tcBorders>
+            <w:tcMar>
+              <w:top w:type="dxa" w:w="40"/>
+              <w:left w:type="dxa" w:w="80"/>
+              <w:bottom w:type="dxa" w:w="40"/>
+              <w:right w:type="dxa" w:w="80"/>
+            </w:tcMar>
+          </w:tcPr>
+          <w:p>
+            <w:pPr>
+              <w:spacing w:after="0" w:line="240"/>
+            </w:pPr>
+            <w:r>
+              <w:rPr>
+                <w:b w:val="false"/>
+                <w:bCs w:val="false"/>
+                <w:sz w:val="16"/>
+                <w:szCs w:val="16"/>
+              </w:rPr>
+              <w:t xml:space="preserve">Configuration or code</w:t>
+            </w:r>
+          </w:p>
+        </w:tc>
+        <w:tc>
+          <w:tcPr>
+            <w:tcW w:type="dxa" w:w="7833"/>
+            <w:tcBorders>
+              <w:top w:val="single" w:color="B1B4B6" w:sz="4"/>
+              <w:left w:val="single" w:color="B1B4B6" w:sz="4"/>
+              <w:bottom w:val="single" w:color="B1B4B6" w:sz="4"/>
+              <w:right w:val="single" w:color="B1B4B6" w:sz="4"/>
+            </w:tcBorders>
+            <w:tcMar>
+              <w:top w:type="dxa" w:w="40"/>
+              <w:left w:type="dxa" w:w="80"/>
+              <w:bottom w:type="dxa" w:w="40"/>
+              <w:right w:type="dxa" w:w="80"/>
+            </w:tcMar>
+          </w:tcPr>
+          <w:p>
+            <w:pPr>
+              <w:spacing w:after="0" w:line="240"/>
+            </w:pPr>
+            <w:r>
+              <w:rPr>
+                <w:b w:val="false"/>
+                <w:bCs w:val="false"/>
+                <w:sz w:val="16"/>
+                <w:szCs w:val="16"/>
+              </w:rPr>
+              <w:t xml:space="preserve">Whether a file transfer can be onboarded to Boomi MFT without writing code, evidenced twice rather than argued once.</w:t>
             </w:r>
           </w:p>
         </w:tc>
@@ -212,63 +966,63 @@
       <w:tr>
         <w:tc>
           <w:tcPr>
-            <w:tcW w:type="dxa" w:w="2680"/>
-            <w:tcBorders>
-              <w:top w:val="single" w:color="B1B4B6" w:sz="4"/>
-              <w:left w:val="single" w:color="B1B4B6" w:sz="4"/>
-              <w:bottom w:val="single" w:color="B1B4B6" w:sz="4"/>
-              <w:right w:val="single" w:color="B1B4B6" w:sz="4"/>
-            </w:tcBorders>
-            <w:tcMar>
-              <w:top w:type="dxa" w:w="40"/>
-              <w:left w:type="dxa" w:w="80"/>
-              <w:bottom w:type="dxa" w:w="40"/>
-              <w:right w:type="dxa" w:w="80"/>
-            </w:tcMar>
-          </w:tcPr>
-          <w:p>
-            <w:pPr>
-              <w:spacing w:after="0" w:line="240"/>
-            </w:pPr>
-            <w:r>
-              <w:rPr>
-                <w:b w:val="false"/>
-                <w:bCs w:val="false"/>
-                <w:sz w:val="16"/>
-                <w:szCs w:val="16"/>
-              </w:rPr>
-              <w:t xml:space="preserve">Scope</w:t>
-            </w:r>
-          </w:p>
-        </w:tc>
-        <w:tc>
-          <w:tcPr>
-            <w:tcW w:type="dxa" w:w="7626"/>
-            <w:tcBorders>
-              <w:top w:val="single" w:color="B1B4B6" w:sz="4"/>
-              <w:left w:val="single" w:color="B1B4B6" w:sz="4"/>
-              <w:bottom w:val="single" w:color="B1B4B6" w:sz="4"/>
-              <w:right w:val="single" w:color="B1B4B6" w:sz="4"/>
-            </w:tcBorders>
-            <w:tcMar>
-              <w:top w:type="dxa" w:w="40"/>
-              <w:left w:type="dxa" w:w="80"/>
-              <w:bottom w:type="dxa" w:w="40"/>
-              <w:right w:type="dxa" w:w="80"/>
-            </w:tcMar>
-          </w:tcPr>
-          <w:p>
-            <w:pPr>
-              <w:spacing w:after="0" w:line="240"/>
-            </w:pPr>
-            <w:r>
-              <w:rPr>
-                <w:b w:val="false"/>
-                <w:bCs w:val="false"/>
-                <w:sz w:val="16"/>
-                <w:szCs w:val="16"/>
-              </w:rPr>
-              <w:t xml:space="preserve">Two legs. NPS to the ADR landing area, internal. ADR output area to ONS, external</w:t>
+            <w:tcW w:type="dxa" w:w="2473"/>
+            <w:tcBorders>
+              <w:top w:val="single" w:color="B1B4B6" w:sz="4"/>
+              <w:left w:val="single" w:color="B1B4B6" w:sz="4"/>
+              <w:bottom w:val="single" w:color="B1B4B6" w:sz="4"/>
+              <w:right w:val="single" w:color="B1B4B6" w:sz="4"/>
+            </w:tcBorders>
+            <w:tcMar>
+              <w:top w:type="dxa" w:w="40"/>
+              <w:left w:type="dxa" w:w="80"/>
+              <w:bottom w:type="dxa" w:w="40"/>
+              <w:right w:type="dxa" w:w="80"/>
+            </w:tcMar>
+          </w:tcPr>
+          <w:p>
+            <w:pPr>
+              <w:spacing w:after="0" w:line="240"/>
+            </w:pPr>
+            <w:r>
+              <w:rPr>
+                <w:b w:val="false"/>
+                <w:bCs w:val="false"/>
+                <w:sz w:val="16"/>
+                <w:szCs w:val="16"/>
+              </w:rPr>
+              <w:t xml:space="preserve">The real cost</w:t>
+            </w:r>
+          </w:p>
+        </w:tc>
+        <w:tc>
+          <w:tcPr>
+            <w:tcW w:type="dxa" w:w="7833"/>
+            <w:tcBorders>
+              <w:top w:val="single" w:color="B1B4B6" w:sz="4"/>
+              <w:left w:val="single" w:color="B1B4B6" w:sz="4"/>
+              <w:bottom w:val="single" w:color="B1B4B6" w:sz="4"/>
+              <w:right w:val="single" w:color="B1B4B6" w:sz="4"/>
+            </w:tcBorders>
+            <w:tcMar>
+              <w:top w:type="dxa" w:w="40"/>
+              <w:left w:type="dxa" w:w="80"/>
+              <w:bottom w:type="dxa" w:w="40"/>
+              <w:right w:type="dxa" w:w="80"/>
+            </w:tcMar>
+          </w:tcPr>
+          <w:p>
+            <w:pPr>
+              <w:spacing w:after="0" w:line="240"/>
+            </w:pPr>
+            <w:r>
+              <w:rPr>
+                <w:b w:val="false"/>
+                <w:bCs w:val="false"/>
+                <w:sz w:val="16"/>
+                <w:szCs w:val="16"/>
+              </w:rPr>
+              <w:t xml:space="preserve">Onboarding effort in hours, separated from time spent waiting on other teams. That split is the number the wider plan needs and does not have.</w:t>
             </w:r>
           </w:p>
         </w:tc>
@@ -276,63 +1030,63 @@
       <w:tr>
         <w:tc>
           <w:tcPr>
-            <w:tcW w:type="dxa" w:w="2680"/>
-            <w:tcBorders>
-              <w:top w:val="single" w:color="B1B4B6" w:sz="4"/>
-              <w:left w:val="single" w:color="B1B4B6" w:sz="4"/>
-              <w:bottom w:val="single" w:color="B1B4B6" w:sz="4"/>
-              <w:right w:val="single" w:color="B1B4B6" w:sz="4"/>
-            </w:tcBorders>
-            <w:tcMar>
-              <w:top w:type="dxa" w:w="40"/>
-              <w:left w:type="dxa" w:w="80"/>
-              <w:bottom w:type="dxa" w:w="40"/>
-              <w:right w:type="dxa" w:w="80"/>
-            </w:tcMar>
-          </w:tcPr>
-          <w:p>
-            <w:pPr>
-              <w:spacing w:after="0" w:line="240"/>
-            </w:pPr>
-            <w:r>
-              <w:rPr>
-                <w:b w:val="false"/>
-                <w:bCs w:val="false"/>
-                <w:sz w:val="16"/>
-                <w:szCs w:val="16"/>
-              </w:rPr>
-              <w:t xml:space="preserve">Window</w:t>
-            </w:r>
-          </w:p>
-        </w:tc>
-        <w:tc>
-          <w:tcPr>
-            <w:tcW w:type="dxa" w:w="7626"/>
-            <w:tcBorders>
-              <w:top w:val="single" w:color="B1B4B6" w:sz="4"/>
-              <w:left w:val="single" w:color="B1B4B6" w:sz="4"/>
-              <w:bottom w:val="single" w:color="B1B4B6" w:sz="4"/>
-              <w:right w:val="single" w:color="B1B4B6" w:sz="4"/>
-            </w:tcBorders>
-            <w:tcMar>
-              <w:top w:type="dxa" w:w="40"/>
-              <w:left w:type="dxa" w:w="80"/>
-              <w:bottom w:type="dxa" w:w="40"/>
-              <w:right w:type="dxa" w:w="80"/>
-            </w:tcMar>
-          </w:tcPr>
-          <w:p>
-            <w:pPr>
-              <w:spacing w:after="0" w:line="240"/>
-            </w:pPr>
-            <w:r>
-              <w:rPr>
-                <w:b w:val="false"/>
-                <w:bCs w:val="false"/>
-                <w:sz w:val="16"/>
-                <w:szCs w:val="16"/>
-              </w:rPr>
-              <w:t xml:space="preserve">Monday 28 September to Friday 9 October 2026, ten working days</w:t>
+            <w:tcW w:type="dxa" w:w="2473"/>
+            <w:tcBorders>
+              <w:top w:val="single" w:color="B1B4B6" w:sz="4"/>
+              <w:left w:val="single" w:color="B1B4B6" w:sz="4"/>
+              <w:bottom w:val="single" w:color="B1B4B6" w:sz="4"/>
+              <w:right w:val="single" w:color="B1B4B6" w:sz="4"/>
+            </w:tcBorders>
+            <w:tcMar>
+              <w:top w:type="dxa" w:w="40"/>
+              <w:left w:type="dxa" w:w="80"/>
+              <w:bottom w:type="dxa" w:w="40"/>
+              <w:right w:type="dxa" w:w="80"/>
+            </w:tcMar>
+          </w:tcPr>
+          <w:p>
+            <w:pPr>
+              <w:spacing w:after="0" w:line="240"/>
+            </w:pPr>
+            <w:r>
+              <w:rPr>
+                <w:b w:val="false"/>
+                <w:bCs w:val="false"/>
+                <w:sz w:val="16"/>
+                <w:szCs w:val="16"/>
+              </w:rPr>
+              <w:t xml:space="preserve">Controls</w:t>
+            </w:r>
+          </w:p>
+        </w:tc>
+        <w:tc>
+          <w:tcPr>
+            <w:tcW w:type="dxa" w:w="7833"/>
+            <w:tcBorders>
+              <w:top w:val="single" w:color="B1B4B6" w:sz="4"/>
+              <w:left w:val="single" w:color="B1B4B6" w:sz="4"/>
+              <w:bottom w:val="single" w:color="B1B4B6" w:sz="4"/>
+              <w:right w:val="single" w:color="B1B4B6" w:sz="4"/>
+            </w:tcBorders>
+            <w:tcMar>
+              <w:top w:type="dxa" w:w="40"/>
+              <w:left w:type="dxa" w:w="80"/>
+              <w:bottom w:type="dxa" w:w="40"/>
+              <w:right w:type="dxa" w:w="80"/>
+            </w:tcMar>
+          </w:tcPr>
+          <w:p>
+            <w:pPr>
+              <w:spacing w:after="0" w:line="240"/>
+            </w:pPr>
+            <w:r>
+              <w:rPr>
+                <w:b w:val="false"/>
+                <w:bCs w:val="false"/>
+                <w:sz w:val="16"/>
+                <w:szCs w:val="16"/>
+              </w:rPr>
+              <w:t xml:space="preserve">Whether alerting, audit, quarantine, scanning and rollback hold for an OFFICIAL feed crossing a departmental boundary.</w:t>
             </w:r>
           </w:p>
         </w:tc>
@@ -340,63 +1094,63 @@
       <w:tr>
         <w:tc>
           <w:tcPr>
-            <w:tcW w:type="dxa" w:w="2680"/>
-            <w:tcBorders>
-              <w:top w:val="single" w:color="B1B4B6" w:sz="4"/>
-              <w:left w:val="single" w:color="B1B4B6" w:sz="4"/>
-              <w:bottom w:val="single" w:color="B1B4B6" w:sz="4"/>
-              <w:right w:val="single" w:color="B1B4B6" w:sz="4"/>
-            </w:tcBorders>
-            <w:tcMar>
-              <w:top w:type="dxa" w:w="40"/>
-              <w:left w:type="dxa" w:w="80"/>
-              <w:bottom w:type="dxa" w:w="40"/>
-              <w:right w:type="dxa" w:w="80"/>
-            </w:tcMar>
-          </w:tcPr>
-          <w:p>
-            <w:pPr>
-              <w:spacing w:after="0" w:line="240"/>
-            </w:pPr>
-            <w:r>
-              <w:rPr>
-                <w:b w:val="false"/>
-                <w:bCs w:val="false"/>
-                <w:sz w:val="16"/>
-                <w:szCs w:val="16"/>
-              </w:rPr>
-              <w:t xml:space="preserve">Build effort</w:t>
-            </w:r>
-          </w:p>
-        </w:tc>
-        <w:tc>
-          <w:tcPr>
-            <w:tcW w:type="dxa" w:w="7626"/>
-            <w:tcBorders>
-              <w:top w:val="single" w:color="B1B4B6" w:sz="4"/>
-              <w:left w:val="single" w:color="B1B4B6" w:sz="4"/>
-              <w:bottom w:val="single" w:color="B1B4B6" w:sz="4"/>
-              <w:right w:val="single" w:color="B1B4B6" w:sz="4"/>
-            </w:tcBorders>
-            <w:tcMar>
-              <w:top w:type="dxa" w:w="40"/>
-              <w:left w:type="dxa" w:w="80"/>
-              <w:bottom w:type="dxa" w:w="40"/>
-              <w:right w:type="dxa" w:w="80"/>
-            </w:tcMar>
-          </w:tcPr>
-          <w:p>
-            <w:pPr>
-              <w:spacing w:after="0" w:line="240"/>
-            </w:pPr>
-            <w:r>
-              <w:rPr>
-                <w:b w:val="false"/>
-                <w:bCs w:val="false"/>
-                <w:sz w:val="16"/>
-                <w:szCs w:val="16"/>
-              </w:rPr>
-              <w:t xml:space="preserve">Two days. Everything else is discovery, testing and handover</w:t>
+            <w:tcW w:type="dxa" w:w="2473"/>
+            <w:tcBorders>
+              <w:top w:val="single" w:color="B1B4B6" w:sz="4"/>
+              <w:left w:val="single" w:color="B1B4B6" w:sz="4"/>
+              <w:bottom w:val="single" w:color="B1B4B6" w:sz="4"/>
+              <w:right w:val="single" w:color="B1B4B6" w:sz="4"/>
+            </w:tcBorders>
+            <w:tcMar>
+              <w:top w:type="dxa" w:w="40"/>
+              <w:left w:type="dxa" w:w="80"/>
+              <w:bottom w:type="dxa" w:w="40"/>
+              <w:right w:type="dxa" w:w="80"/>
+            </w:tcMar>
+          </w:tcPr>
+          <w:p>
+            <w:pPr>
+              <w:spacing w:after="0" w:line="240"/>
+            </w:pPr>
+            <w:r>
+              <w:rPr>
+                <w:b w:val="false"/>
+                <w:bCs w:val="false"/>
+                <w:sz w:val="16"/>
+                <w:szCs w:val="16"/>
+              </w:rPr>
+              <w:t xml:space="preserve">Supportability</w:t>
+            </w:r>
+          </w:p>
+        </w:tc>
+        <w:tc>
+          <w:tcPr>
+            <w:tcW w:type="dxa" w:w="7833"/>
+            <w:tcBorders>
+              <w:top w:val="single" w:color="B1B4B6" w:sz="4"/>
+              <w:left w:val="single" w:color="B1B4B6" w:sz="4"/>
+              <w:bottom w:val="single" w:color="B1B4B6" w:sz="4"/>
+              <w:right w:val="single" w:color="B1B4B6" w:sz="4"/>
+            </w:tcBorders>
+            <w:tcMar>
+              <w:top w:type="dxa" w:w="40"/>
+              <w:left w:type="dxa" w:w="80"/>
+              <w:bottom w:type="dxa" w:w="40"/>
+              <w:right w:type="dxa" w:w="80"/>
+            </w:tcMar>
+          </w:tcPr>
+          <w:p>
+            <w:pPr>
+              <w:spacing w:after="0" w:line="240"/>
+            </w:pPr>
+            <w:r>
+              <w:rPr>
+                <w:b w:val="false"/>
+                <w:bCs w:val="false"/>
+                <w:sz w:val="16"/>
+                <w:szCs w:val="16"/>
+              </w:rPr>
+              <w:t xml:space="preserve">Whether Service Operations will accept flows of this kind into support.</w:t>
             </w:r>
           </w:p>
         </w:tc>
@@ -404,191 +1158,63 @@
       <w:tr>
         <w:tc>
           <w:tcPr>
-            <w:tcW w:type="dxa" w:w="2680"/>
-            <w:tcBorders>
-              <w:top w:val="single" w:color="B1B4B6" w:sz="4"/>
-              <w:left w:val="single" w:color="B1B4B6" w:sz="4"/>
-              <w:bottom w:val="single" w:color="B1B4B6" w:sz="4"/>
-              <w:right w:val="single" w:color="B1B4B6" w:sz="4"/>
-            </w:tcBorders>
-            <w:tcMar>
-              <w:top w:type="dxa" w:w="40"/>
-              <w:left w:type="dxa" w:w="80"/>
-              <w:bottom w:type="dxa" w:w="40"/>
-              <w:right w:type="dxa" w:w="80"/>
-            </w:tcMar>
-          </w:tcPr>
-          <w:p>
-            <w:pPr>
-              <w:spacing w:after="0" w:line="240"/>
-            </w:pPr>
-            <w:r>
-              <w:rPr>
-                <w:b w:val="false"/>
-                <w:bCs w:val="false"/>
-                <w:sz w:val="16"/>
-                <w:szCs w:val="16"/>
-              </w:rPr>
-              <w:t xml:space="preserve">New components</w:t>
-            </w:r>
-          </w:p>
-        </w:tc>
-        <w:tc>
-          <w:tcPr>
-            <w:tcW w:type="dxa" w:w="7626"/>
-            <w:tcBorders>
-              <w:top w:val="single" w:color="B1B4B6" w:sz="4"/>
-              <w:left w:val="single" w:color="B1B4B6" w:sz="4"/>
-              <w:bottom w:val="single" w:color="B1B4B6" w:sz="4"/>
-              <w:right w:val="single" w:color="B1B4B6" w:sz="4"/>
-            </w:tcBorders>
-            <w:tcMar>
-              <w:top w:type="dxa" w:w="40"/>
-              <w:left w:type="dxa" w:w="80"/>
-              <w:bottom w:type="dxa" w:w="40"/>
-              <w:right w:type="dxa" w:w="80"/>
-            </w:tcMar>
-          </w:tcPr>
-          <w:p>
-            <w:pPr>
-              <w:spacing w:after="0" w:line="240"/>
-            </w:pPr>
-            <w:r>
-              <w:rPr>
-                <w:b w:val="false"/>
-                <w:bCs w:val="false"/>
-                <w:sz w:val="16"/>
-                <w:szCs w:val="16"/>
-              </w:rPr>
-              <w:t xml:space="preserve">None. Two configuration rows on the existing generic engine</w:t>
-            </w:r>
-          </w:p>
-        </w:tc>
-      </w:tr>
-      <w:tr>
-        <w:tc>
-          <w:tcPr>
-            <w:tcW w:type="dxa" w:w="2680"/>
-            <w:tcBorders>
-              <w:top w:val="single" w:color="B1B4B6" w:sz="4"/>
-              <w:left w:val="single" w:color="B1B4B6" w:sz="4"/>
-              <w:bottom w:val="single" w:color="B1B4B6" w:sz="4"/>
-              <w:right w:val="single" w:color="B1B4B6" w:sz="4"/>
-            </w:tcBorders>
-            <w:tcMar>
-              <w:top w:type="dxa" w:w="40"/>
-              <w:left w:type="dxa" w:w="80"/>
-              <w:bottom w:type="dxa" w:w="40"/>
-              <w:right w:type="dxa" w:w="80"/>
-            </w:tcMar>
-          </w:tcPr>
-          <w:p>
-            <w:pPr>
-              <w:spacing w:after="0" w:line="240"/>
-            </w:pPr>
-            <w:r>
-              <w:rPr>
-                <w:b w:val="false"/>
-                <w:bCs w:val="false"/>
-                <w:sz w:val="16"/>
-                <w:szCs w:val="16"/>
-              </w:rPr>
-              <w:t xml:space="preserve">Side benefit</w:t>
-            </w:r>
-          </w:p>
-        </w:tc>
-        <w:tc>
-          <w:tcPr>
-            <w:tcW w:type="dxa" w:w="7626"/>
-            <w:tcBorders>
-              <w:top w:val="single" w:color="B1B4B6" w:sz="4"/>
-              <w:left w:val="single" w:color="B1B4B6" w:sz="4"/>
-              <w:bottom w:val="single" w:color="B1B4B6" w:sz="4"/>
-              <w:right w:val="single" w:color="B1B4B6" w:sz="4"/>
-            </w:tcBorders>
-            <w:tcMar>
-              <w:top w:type="dxa" w:w="40"/>
-              <w:left w:type="dxa" w:w="80"/>
-              <w:bottom w:type="dxa" w:w="40"/>
-              <w:right w:type="dxa" w:w="80"/>
-            </w:tcMar>
-          </w:tcPr>
-          <w:p>
-            <w:pPr>
-              <w:spacing w:after="0" w:line="240"/>
-            </w:pPr>
-            <w:r>
-              <w:rPr>
-                <w:b w:val="false"/>
-                <w:bCs w:val="false"/>
-                <w:sz w:val="16"/>
-                <w:szCs w:val="16"/>
-              </w:rPr>
-              <w:t xml:space="preserve">Removes the Insecure IF server hop from the outbound path, regardless of the platform decision</w:t>
-            </w:r>
-          </w:p>
-        </w:tc>
-      </w:tr>
-      <w:tr>
-        <w:tc>
-          <w:tcPr>
-            <w:tcW w:type="dxa" w:w="2680"/>
-            <w:tcBorders>
-              <w:top w:val="single" w:color="B1B4B6" w:sz="4"/>
-              <w:left w:val="single" w:color="B1B4B6" w:sz="4"/>
-              <w:bottom w:val="single" w:color="B1B4B6" w:sz="4"/>
-              <w:right w:val="single" w:color="B1B4B6" w:sz="4"/>
-            </w:tcBorders>
-            <w:tcMar>
-              <w:top w:type="dxa" w:w="40"/>
-              <w:left w:type="dxa" w:w="80"/>
-              <w:bottom w:type="dxa" w:w="40"/>
-              <w:right w:type="dxa" w:w="80"/>
-            </w:tcMar>
-          </w:tcPr>
-          <w:p>
-            <w:pPr>
-              <w:spacing w:after="0" w:line="240"/>
-            </w:pPr>
-            <w:r>
-              <w:rPr>
-                <w:b w:val="false"/>
-                <w:bCs w:val="false"/>
-                <w:sz w:val="16"/>
-                <w:szCs w:val="16"/>
-              </w:rPr>
-              <w:t xml:space="preserve">Known dependency</w:t>
-            </w:r>
-          </w:p>
-        </w:tc>
-        <w:tc>
-          <w:tcPr>
-            <w:tcW w:type="dxa" w:w="7626"/>
-            <w:tcBorders>
-              <w:top w:val="single" w:color="B1B4B6" w:sz="4"/>
-              <w:left w:val="single" w:color="B1B4B6" w:sz="4"/>
-              <w:bottom w:val="single" w:color="B1B4B6" w:sz="4"/>
-              <w:right w:val="single" w:color="B1B4B6" w:sz="4"/>
-            </w:tcBorders>
-            <w:tcMar>
-              <w:top w:type="dxa" w:w="40"/>
-              <w:left w:type="dxa" w:w="80"/>
-              <w:bottom w:type="dxa" w:w="40"/>
-              <w:right w:type="dxa" w:w="80"/>
-            </w:tcMar>
-          </w:tcPr>
-          <w:p>
-            <w:pPr>
-              <w:spacing w:after="0" w:line="240"/>
-            </w:pPr>
-            <w:r>
-              <w:rPr>
-                <w:b w:val="false"/>
-                <w:bCs w:val="false"/>
-                <w:sz w:val="16"/>
-                <w:szCs w:val="16"/>
-              </w:rPr>
-              <w:t xml:space="preserve">ADR to Data Lake migration. Build now, re-point later. Option 1 in section 5</w:t>
+            <w:tcW w:type="dxa" w:w="2473"/>
+            <w:tcBorders>
+              <w:top w:val="single" w:color="B1B4B6" w:sz="4"/>
+              <w:left w:val="single" w:color="B1B4B6" w:sz="4"/>
+              <w:bottom w:val="single" w:color="B1B4B6" w:sz="4"/>
+              <w:right w:val="single" w:color="B1B4B6" w:sz="4"/>
+            </w:tcBorders>
+            <w:tcMar>
+              <w:top w:type="dxa" w:w="40"/>
+              <w:left w:type="dxa" w:w="80"/>
+              <w:bottom w:type="dxa" w:w="40"/>
+              <w:right w:type="dxa" w:w="80"/>
+            </w:tcMar>
+          </w:tcPr>
+          <w:p>
+            <w:pPr>
+              <w:spacing w:after="0" w:line="240"/>
+            </w:pPr>
+            <w:r>
+              <w:rPr>
+                <w:b w:val="false"/>
+                <w:bCs w:val="false"/>
+                <w:sz w:val="16"/>
+                <w:szCs w:val="16"/>
+              </w:rPr>
+              <w:t xml:space="preserve">Migration readiness</w:t>
+            </w:r>
+          </w:p>
+        </w:tc>
+        <w:tc>
+          <w:tcPr>
+            <w:tcW w:type="dxa" w:w="7833"/>
+            <w:tcBorders>
+              <w:top w:val="single" w:color="B1B4B6" w:sz="4"/>
+              <w:left w:val="single" w:color="B1B4B6" w:sz="4"/>
+              <w:bottom w:val="single" w:color="B1B4B6" w:sz="4"/>
+              <w:right w:val="single" w:color="B1B4B6" w:sz="4"/>
+            </w:tcBorders>
+            <w:tcMar>
+              <w:top w:type="dxa" w:w="40"/>
+              <w:left w:type="dxa" w:w="80"/>
+              <w:bottom w:type="dxa" w:w="40"/>
+              <w:right w:type="dxa" w:w="80"/>
+            </w:tcMar>
+          </w:tcPr>
+          <w:p>
+            <w:pPr>
+              <w:spacing w:after="0" w:line="240"/>
+            </w:pPr>
+            <w:r>
+              <w:rPr>
+                <w:b w:val="false"/>
+                <w:bCs w:val="false"/>
+                <w:sz w:val="16"/>
+                <w:szCs w:val="16"/>
+              </w:rPr>
+              <w:t xml:space="preserve">Whether re-pointing an interface at a migrated endpoint is a one-row change, which is what the Data Lake migration will ask of every interface it touches.</w:t>
             </w:r>
           </w:p>
         </w:tc>
@@ -605,101 +1231,7 @@
         <w:spacing w:after="60" w:before="140"/>
       </w:pPr>
       <w:r>
-        <w:t xml:space="preserve">What we will be able to say on 9 October</w:t>
-      </w:r>
-    </w:p>
-    <w:p>
-      <w:pPr>
-        <w:pStyle w:val="ListParagraph"/>
-        <w:numPr>
-          <w:ilvl w:val="0"/>
-          <w:numId w:val="2"/>
-        </w:numPr>
-        <w:spacing w:after="50"/>
-      </w:pPr>
-      <w:r>
-        <w:rPr>
-          <w:sz w:val="19"/>
-          <w:szCs w:val="19"/>
-        </w:rPr>
-        <w:t xml:space="preserve">Whether a file transfer can be onboarded to Boomi MFT without writing code, evidenced twice rather than argued once.</w:t>
-      </w:r>
-    </w:p>
-    <w:p>
-      <w:pPr>
-        <w:pStyle w:val="ListParagraph"/>
-        <w:numPr>
-          <w:ilvl w:val="0"/>
-          <w:numId w:val="2"/>
-        </w:numPr>
-        <w:spacing w:after="50"/>
-      </w:pPr>
-      <w:r>
-        <w:rPr>
-          <w:sz w:val="19"/>
-          <w:szCs w:val="19"/>
-        </w:rPr>
-        <w:t xml:space="preserve">What onboarding actually costs, in hours, separated from time spent waiting on other teams. That split is the number the wider plan needs and does not have.</w:t>
-      </w:r>
-    </w:p>
-    <w:p>
-      <w:pPr>
-        <w:pStyle w:val="ListParagraph"/>
-        <w:numPr>
-          <w:ilvl w:val="0"/>
-          <w:numId w:val="2"/>
-        </w:numPr>
-        <w:spacing w:after="50"/>
-      </w:pPr>
-      <w:r>
-        <w:rPr>
-          <w:sz w:val="19"/>
-          <w:szCs w:val="19"/>
-        </w:rPr>
-        <w:t xml:space="preserve">Whether the platform's controls hold for an OFFICIAL feed crossing a departmental boundary: alerting, audit, quarantine, scanning and rollback.</w:t>
-      </w:r>
-    </w:p>
-    <w:p>
-      <w:pPr>
-        <w:pStyle w:val="ListParagraph"/>
-        <w:numPr>
-          <w:ilvl w:val="0"/>
-          <w:numId w:val="2"/>
-        </w:numPr>
-        <w:spacing w:after="50"/>
-      </w:pPr>
-      <w:r>
-        <w:rPr>
-          <w:sz w:val="19"/>
-          <w:szCs w:val="19"/>
-        </w:rPr>
-        <w:t xml:space="preserve">Whether Service Operations will accept flows of this kind into support.</w:t>
-      </w:r>
-    </w:p>
-    <w:p>
-      <w:pPr>
-        <w:pStyle w:val="ListParagraph"/>
-        <w:numPr>
-          <w:ilvl w:val="0"/>
-          <w:numId w:val="2"/>
-        </w:numPr>
-        <w:spacing w:after="50"/>
-      </w:pPr>
-      <w:r>
-        <w:rPr>
-          <w:sz w:val="19"/>
-          <w:szCs w:val="19"/>
-        </w:rPr>
-        <w:t xml:space="preserve">Whether re-pointing an interface at a migrated endpoint is a one-row change, which is what the Data Lake migration will ask of every interface it touches.</w:t>
-      </w:r>
-    </w:p>
-    <w:p>
-      <w:pPr>
-        <w:pStyle w:val="Heading2"/>
-        <w:spacing w:after="60" w:before="140"/>
-      </w:pPr>
-      <w:r>
-        <w:t xml:space="preserve">The decision we are asking for</w:t>
+        <w:t xml:space="preserve">The decisions we are asking for</w:t>
       </w:r>
     </w:p>
     <w:tbl>
@@ -6538,7 +7070,7 @@
         <w:pStyle w:val="ListParagraph"/>
         <w:numPr>
           <w:ilvl w:val="0"/>
-          <w:numId w:val="3"/>
+          <w:numId w:val="2"/>
         </w:numPr>
         <w:spacing w:after="50"/>
       </w:pPr>
@@ -6555,7 +7087,7 @@
         <w:pStyle w:val="ListParagraph"/>
         <w:numPr>
           <w:ilvl w:val="0"/>
-          <w:numId w:val="3"/>
+          <w:numId w:val="2"/>
         </w:numPr>
         <w:spacing w:after="50"/>
       </w:pPr>
@@ -6572,7 +7104,7 @@
         <w:pStyle w:val="ListParagraph"/>
         <w:numPr>
           <w:ilvl w:val="0"/>
-          <w:numId w:val="3"/>
+          <w:numId w:val="2"/>
         </w:numPr>
         <w:spacing w:after="50"/>
       </w:pPr>
@@ -6589,7 +7121,7 @@
         <w:pStyle w:val="ListParagraph"/>
         <w:numPr>
           <w:ilvl w:val="0"/>
-          <w:numId w:val="3"/>
+          <w:numId w:val="2"/>
         </w:numPr>
         <w:spacing w:after="50"/>
       </w:pPr>
@@ -8585,12 +9117,6 @@
       <w:startOverride w:val="1"/>
     </w:lvlOverride>
   </w:num>
-  <w:num w:numId="3">
-    <w:abstractNumId w:val="2"/>
-    <w:lvlOverride w:ilvl="0">
-      <w:startOverride w:val="1"/>
-    </w:lvlOverride>
-  </w:num>
 </w:numbering>
 </file>
 

</xml_diff>